<commit_message>
Support in Development and Docker environment connecting to Postgres database
</commit_message>
<xml_diff>
--- a/Documentations/A2C_SDD.docx
+++ b/Documentations/A2C_SDD.docx
@@ -2211,8 +2211,14 @@
     <w:p>
       <w:pPr>
         <w:pStyle w:val="Heading1"/>
+        <w:numPr>
+          <w:ilvl w:val="0"/>
+          <w:numId w:val="0"/>
+        </w:numPr>
         <w:rPr>
           <w:rFonts w:cstheme="majorHAnsi"/>
+          <w:b w:val="0"/>
+          <w:bCs w:val="0"/>
         </w:rPr>
       </w:pPr>
       <w:r>
@@ -2221,21 +2227,9 @@
         </w:rPr>
         <w:fldChar w:fldCharType="end"/>
       </w:r>
-    </w:p>
-    <w:p>
-      <w:pPr>
-        <w:rPr>
-          <w:rFonts w:asciiTheme="majorHAnsi" w:eastAsiaTheme="majorEastAsia" w:hAnsiTheme="majorHAnsi" w:cstheme="majorHAnsi"/>
-          <w:b/>
-          <w:bCs/>
-          <w:color w:val="365F91" w:themeColor="accent1" w:themeShade="BF"/>
-          <w:sz w:val="28"/>
-          <w:szCs w:val="28"/>
-        </w:rPr>
-      </w:pPr>
       <w:r>
         <w:rPr>
-          <w:rFonts w:asciiTheme="majorHAnsi" w:hAnsiTheme="majorHAnsi" w:cstheme="majorHAnsi"/>
+          <w:rFonts w:cstheme="majorHAnsi"/>
         </w:rPr>
         <w:br w:type="page"/>
       </w:r>
@@ -2510,19 +2504,116 @@
     </w:p>
     <w:p>
       <w:pPr>
-        <w:rPr>
-          <w:rFonts w:asciiTheme="majorHAnsi" w:hAnsiTheme="majorHAnsi" w:cstheme="majorHAnsi"/>
-          <w:rtl/>
-          <w:lang w:bidi="he-IL"/>
-        </w:rPr>
-      </w:pPr>
+        <w:pStyle w:val="ListParagraph"/>
+        <w:keepNext/>
+        <w:keepLines/>
+        <w:numPr>
+          <w:ilvl w:val="0"/>
+          <w:numId w:val="20"/>
+        </w:numPr>
+        <w:spacing w:before="200" w:after="0"/>
+        <w:contextualSpacing w:val="0"/>
+        <w:outlineLvl w:val="1"/>
+        <w:rPr>
+          <w:rFonts w:asciiTheme="majorHAnsi" w:eastAsiaTheme="majorEastAsia" w:hAnsiTheme="majorHAnsi" w:cstheme="majorBidi"/>
+          <w:b/>
+          <w:bCs/>
+          <w:vanish/>
+          <w:color w:val="4F81BD" w:themeColor="accent1"/>
+          <w:sz w:val="26"/>
+          <w:szCs w:val="26"/>
+        </w:rPr>
+      </w:pPr>
+    </w:p>
+    <w:p>
+      <w:pPr>
+        <w:pStyle w:val="ListParagraph"/>
+        <w:keepNext/>
+        <w:keepLines/>
+        <w:numPr>
+          <w:ilvl w:val="0"/>
+          <w:numId w:val="20"/>
+        </w:numPr>
+        <w:spacing w:before="200" w:after="0"/>
+        <w:contextualSpacing w:val="0"/>
+        <w:outlineLvl w:val="1"/>
+        <w:rPr>
+          <w:rFonts w:asciiTheme="majorHAnsi" w:eastAsiaTheme="majorEastAsia" w:hAnsiTheme="majorHAnsi" w:cstheme="majorBidi"/>
+          <w:b/>
+          <w:bCs/>
+          <w:vanish/>
+          <w:color w:val="4F81BD" w:themeColor="accent1"/>
+          <w:sz w:val="26"/>
+          <w:szCs w:val="26"/>
+        </w:rPr>
+      </w:pPr>
+    </w:p>
+    <w:p>
+      <w:pPr>
+        <w:pStyle w:val="ListParagraph"/>
+        <w:keepNext/>
+        <w:keepLines/>
+        <w:numPr>
+          <w:ilvl w:val="0"/>
+          <w:numId w:val="20"/>
+        </w:numPr>
+        <w:spacing w:before="200" w:after="0"/>
+        <w:contextualSpacing w:val="0"/>
+        <w:outlineLvl w:val="1"/>
+        <w:rPr>
+          <w:rFonts w:asciiTheme="majorHAnsi" w:eastAsiaTheme="majorEastAsia" w:hAnsiTheme="majorHAnsi" w:cstheme="majorBidi"/>
+          <w:b/>
+          <w:bCs/>
+          <w:vanish/>
+          <w:color w:val="4F81BD" w:themeColor="accent1"/>
+          <w:sz w:val="26"/>
+          <w:szCs w:val="26"/>
+        </w:rPr>
+      </w:pPr>
+    </w:p>
+    <w:p>
+      <w:pPr>
+        <w:pStyle w:val="ListParagraph"/>
+        <w:keepNext/>
+        <w:keepLines/>
+        <w:numPr>
+          <w:ilvl w:val="0"/>
+          <w:numId w:val="20"/>
+        </w:numPr>
+        <w:spacing w:before="200" w:after="0"/>
+        <w:contextualSpacing w:val="0"/>
+        <w:outlineLvl w:val="1"/>
+        <w:rPr>
+          <w:rFonts w:asciiTheme="majorHAnsi" w:eastAsiaTheme="majorEastAsia" w:hAnsiTheme="majorHAnsi" w:cstheme="majorBidi"/>
+          <w:b/>
+          <w:bCs/>
+          <w:vanish/>
+          <w:color w:val="4F81BD" w:themeColor="accent1"/>
+          <w:sz w:val="26"/>
+          <w:szCs w:val="26"/>
+        </w:rPr>
+      </w:pPr>
+    </w:p>
+    <w:p>
+      <w:pPr>
+        <w:pStyle w:val="Heading2"/>
+        <w:numPr>
+          <w:ilvl w:val="1"/>
+          <w:numId w:val="20"/>
+        </w:numPr>
+      </w:pPr>
+      <w:r>
+        <w:t>Entity Relations Diagrams</w:t>
+      </w:r>
+    </w:p>
+    <w:p>
       <w:r>
         <w:rPr>
           <w:rFonts w:asciiTheme="majorHAnsi" w:hAnsiTheme="majorHAnsi" w:cstheme="majorHAnsi"/>
           <w:noProof/>
         </w:rPr>
         <w:drawing>
-          <wp:inline distT="0" distB="0" distL="0" distR="0" wp14:anchorId="3000D88F" wp14:editId="2B80B633">
+          <wp:inline distT="0" distB="0" distL="0" distR="0" wp14:anchorId="2F16F8A9" wp14:editId="44CB11B8">
             <wp:extent cx="5486400" cy="3054350"/>
             <wp:effectExtent l="19050" t="19050" r="19050" b="12700"/>
             <wp:docPr id="2046675146" name="Picture 1" descr="A diagram of a customer data model&#10;&#10;AI-generated content may be incorrect."/>
@@ -2564,32 +2655,15 @@
       </w:r>
     </w:p>
     <w:p>
-      <w:pPr>
-        <w:rPr>
-          <w:rFonts w:asciiTheme="majorHAnsi" w:hAnsiTheme="majorHAnsi" w:cstheme="majorHAnsi"/>
-          <w:rtl/>
-          <w:lang w:bidi="he-IL"/>
-        </w:rPr>
-      </w:pPr>
-    </w:p>
-    <w:p>
-      <w:pPr>
-        <w:rPr>
-          <w:rFonts w:asciiTheme="majorHAnsi" w:hAnsiTheme="majorHAnsi" w:cstheme="majorHAnsi"/>
-          <w:rtl/>
-          <w:lang w:bidi="he-IL"/>
-        </w:rPr>
-      </w:pPr>
       <w:r>
         <w:rPr>
-          <w:rFonts w:asciiTheme="majorHAnsi" w:hAnsiTheme="majorHAnsi" w:cstheme="majorHAnsi"/>
           <w:noProof/>
         </w:rPr>
         <w:drawing>
-          <wp:inline distT="0" distB="0" distL="0" distR="0" wp14:anchorId="03DA8A9D" wp14:editId="72045278">
-            <wp:extent cx="5486400" cy="2981325"/>
-            <wp:effectExtent l="19050" t="19050" r="19050" b="28575"/>
-            <wp:docPr id="1180738528" name="Picture 1" descr="A computer screen shot of a data flow&#10;&#10;AI-generated content may be incorrect."/>
+          <wp:inline distT="0" distB="0" distL="0" distR="0" wp14:anchorId="71417454" wp14:editId="4E5FF493">
+            <wp:extent cx="5486400" cy="2241550"/>
+            <wp:effectExtent l="19050" t="19050" r="19050" b="25400"/>
+            <wp:docPr id="506194048" name="Picture 1" descr="A screenshot of a computer&#10;&#10;AI-generated content may be incorrect."/>
             <wp:cNvGraphicFramePr>
               <a:graphicFrameLocks xmlns:a="http://schemas.openxmlformats.org/drawingml/2006/main" noChangeAspect="1"/>
             </wp:cNvGraphicFramePr>
@@ -2597,7 +2671,7 @@
               <a:graphicData uri="http://schemas.openxmlformats.org/drawingml/2006/picture">
                 <pic:pic xmlns:pic="http://schemas.openxmlformats.org/drawingml/2006/picture">
                   <pic:nvPicPr>
-                    <pic:cNvPr id="1180738528" name="Picture 1" descr="A computer screen shot of a data flow&#10;&#10;AI-generated content may be incorrect."/>
+                    <pic:cNvPr id="506194048" name="Picture 1" descr="A screenshot of a computer&#10;&#10;AI-generated content may be incorrect."/>
                     <pic:cNvPicPr/>
                   </pic:nvPicPr>
                   <pic:blipFill>
@@ -2609,7 +2683,7 @@
                   <pic:spPr>
                     <a:xfrm>
                       <a:off x="0" y="0"/>
-                      <a:ext cx="5486400" cy="2981325"/>
+                      <a:ext cx="5486400" cy="2241550"/>
                     </a:xfrm>
                     <a:prstGeom prst="rect">
                       <a:avLst/>
@@ -2629,6 +2703,27 @@
     </w:p>
     <w:p>
       <w:pPr>
+        <w:pStyle w:val="Heading2"/>
+        <w:numPr>
+          <w:ilvl w:val="1"/>
+          <w:numId w:val="20"/>
+        </w:numPr>
+        <w:rPr>
+          <w:rFonts w:cstheme="majorHAnsi"/>
+        </w:rPr>
+      </w:pPr>
+      <w:r>
+        <w:rPr>
+          <w:rFonts w:cstheme="majorHAnsi"/>
+        </w:rPr>
+        <w:t>Entity Relations</w:t>
+      </w:r>
+    </w:p>
+    <w:p/>
+    <w:p/>
+    <w:p/>
+    <w:p>
+      <w:pPr>
         <w:rPr>
           <w:rFonts w:asciiTheme="majorHAnsi" w:hAnsiTheme="majorHAnsi" w:cstheme="majorHAnsi"/>
           <w:rtl/>
@@ -2641,6 +2736,14 @@
         <w:rPr>
           <w:rFonts w:asciiTheme="majorHAnsi" w:hAnsiTheme="majorHAnsi" w:cstheme="majorHAnsi"/>
           <w:rtl/>
+          <w:lang w:bidi="he-IL"/>
+        </w:rPr>
+      </w:pPr>
+    </w:p>
+    <w:p>
+      <w:pPr>
+        <w:rPr>
+          <w:rFonts w:asciiTheme="majorHAnsi" w:hAnsiTheme="majorHAnsi" w:cstheme="majorHAnsi"/>
           <w:lang w:bidi="he-IL"/>
         </w:rPr>
       </w:pPr>
@@ -2670,7 +2773,6 @@
         <w:rPr>
           <w:rFonts w:cstheme="majorHAnsi"/>
         </w:rPr>
-        <w:lastRenderedPageBreak/>
         <w:t>API Design</w:t>
       </w:r>
       <w:bookmarkEnd w:id="5"/>
@@ -2843,7 +2945,21 @@
               <w:rPr>
                 <w:rFonts w:asciiTheme="majorHAnsi" w:hAnsiTheme="majorHAnsi" w:cstheme="majorHAnsi"/>
               </w:rPr>
-              <w:t>/api/auth/login</w:t>
+              <w:t>/</w:t>
+            </w:r>
+            <w:proofErr w:type="spellStart"/>
+            <w:r>
+              <w:rPr>
+                <w:rFonts w:asciiTheme="majorHAnsi" w:hAnsiTheme="majorHAnsi" w:cstheme="majorHAnsi"/>
+              </w:rPr>
+              <w:t>api</w:t>
+            </w:r>
+            <w:proofErr w:type="spellEnd"/>
+            <w:r>
+              <w:rPr>
+                <w:rFonts w:asciiTheme="majorHAnsi" w:hAnsiTheme="majorHAnsi" w:cstheme="majorHAnsi"/>
+              </w:rPr>
+              <w:t>/auth/login</w:t>
             </w:r>
           </w:p>
         </w:tc>
@@ -2893,11 +3009,19 @@
                 <w:rFonts w:asciiTheme="majorHAnsi" w:hAnsiTheme="majorHAnsi" w:cstheme="majorHAnsi"/>
               </w:rPr>
             </w:pPr>
+            <w:proofErr w:type="gramStart"/>
             <w:r>
               <w:rPr>
                 <w:rFonts w:asciiTheme="majorHAnsi" w:hAnsiTheme="majorHAnsi" w:cstheme="majorHAnsi"/>
               </w:rPr>
-              <w:t>JSON: {email, password}</w:t>
+              <w:t>JSON: {</w:t>
+            </w:r>
+            <w:proofErr w:type="gramEnd"/>
+            <w:r>
+              <w:rPr>
+                <w:rFonts w:asciiTheme="majorHAnsi" w:hAnsiTheme="majorHAnsi" w:cstheme="majorHAnsi"/>
+              </w:rPr>
+              <w:t>email, password}</w:t>
             </w:r>
           </w:p>
         </w:tc>
@@ -2915,7 +3039,21 @@
               <w:rPr>
                 <w:rFonts w:asciiTheme="majorHAnsi" w:hAnsiTheme="majorHAnsi" w:cstheme="majorHAnsi"/>
               </w:rPr>
-              <w:t>200 OK: {token}</w:t>
+              <w:t xml:space="preserve">200 </w:t>
+            </w:r>
+            <w:proofErr w:type="gramStart"/>
+            <w:r>
+              <w:rPr>
+                <w:rFonts w:asciiTheme="majorHAnsi" w:hAnsiTheme="majorHAnsi" w:cstheme="majorHAnsi"/>
+              </w:rPr>
+              <w:t>OK: {</w:t>
+            </w:r>
+            <w:proofErr w:type="gramEnd"/>
+            <w:r>
+              <w:rPr>
+                <w:rFonts w:asciiTheme="majorHAnsi" w:hAnsiTheme="majorHAnsi" w:cstheme="majorHAnsi"/>
+              </w:rPr>
+              <w:t>token}</w:t>
             </w:r>
           </w:p>
         </w:tc>
@@ -2953,7 +3091,21 @@
               <w:rPr>
                 <w:rFonts w:asciiTheme="majorHAnsi" w:hAnsiTheme="majorHAnsi" w:cstheme="majorHAnsi"/>
               </w:rPr>
-              <w:t>/api/auth/register</w:t>
+              <w:t>/</w:t>
+            </w:r>
+            <w:proofErr w:type="spellStart"/>
+            <w:r>
+              <w:rPr>
+                <w:rFonts w:asciiTheme="majorHAnsi" w:hAnsiTheme="majorHAnsi" w:cstheme="majorHAnsi"/>
+              </w:rPr>
+              <w:t>api</w:t>
+            </w:r>
+            <w:proofErr w:type="spellEnd"/>
+            <w:r>
+              <w:rPr>
+                <w:rFonts w:asciiTheme="majorHAnsi" w:hAnsiTheme="majorHAnsi" w:cstheme="majorHAnsi"/>
+              </w:rPr>
+              <w:t>/auth/register</w:t>
             </w:r>
           </w:p>
         </w:tc>
@@ -3003,11 +3155,19 @@
                 <w:rFonts w:asciiTheme="majorHAnsi" w:hAnsiTheme="majorHAnsi" w:cstheme="majorHAnsi"/>
               </w:rPr>
             </w:pPr>
+            <w:proofErr w:type="gramStart"/>
             <w:r>
               <w:rPr>
                 <w:rFonts w:asciiTheme="majorHAnsi" w:hAnsiTheme="majorHAnsi" w:cstheme="majorHAnsi"/>
               </w:rPr>
-              <w:t>JSON: {name, email, password}</w:t>
+              <w:t>JSON: {</w:t>
+            </w:r>
+            <w:proofErr w:type="gramEnd"/>
+            <w:r>
+              <w:rPr>
+                <w:rFonts w:asciiTheme="majorHAnsi" w:hAnsiTheme="majorHAnsi" w:cstheme="majorHAnsi"/>
+              </w:rPr>
+              <w:t>name, email, password}</w:t>
             </w:r>
           </w:p>
         </w:tc>
@@ -3063,7 +3223,21 @@
               <w:rPr>
                 <w:rFonts w:asciiTheme="majorHAnsi" w:hAnsiTheme="majorHAnsi" w:cstheme="majorHAnsi"/>
               </w:rPr>
-              <w:t>/api/auth/refresh</w:t>
+              <w:t>/</w:t>
+            </w:r>
+            <w:proofErr w:type="spellStart"/>
+            <w:r>
+              <w:rPr>
+                <w:rFonts w:asciiTheme="majorHAnsi" w:hAnsiTheme="majorHAnsi" w:cstheme="majorHAnsi"/>
+              </w:rPr>
+              <w:t>api</w:t>
+            </w:r>
+            <w:proofErr w:type="spellEnd"/>
+            <w:r>
+              <w:rPr>
+                <w:rFonts w:asciiTheme="majorHAnsi" w:hAnsiTheme="majorHAnsi" w:cstheme="majorHAnsi"/>
+              </w:rPr>
+              <w:t>/auth/refresh</w:t>
             </w:r>
           </w:p>
         </w:tc>
@@ -3113,11 +3287,27 @@
                 <w:rFonts w:asciiTheme="majorHAnsi" w:hAnsiTheme="majorHAnsi" w:cstheme="majorHAnsi"/>
               </w:rPr>
             </w:pPr>
+            <w:proofErr w:type="gramStart"/>
             <w:r>
               <w:rPr>
                 <w:rFonts w:asciiTheme="majorHAnsi" w:hAnsiTheme="majorHAnsi" w:cstheme="majorHAnsi"/>
               </w:rPr>
-              <w:t>JSON: {refreshToken}</w:t>
+              <w:t>JSON: {</w:t>
+            </w:r>
+            <w:proofErr w:type="spellStart"/>
+            <w:proofErr w:type="gramEnd"/>
+            <w:r>
+              <w:rPr>
+                <w:rFonts w:asciiTheme="majorHAnsi" w:hAnsiTheme="majorHAnsi" w:cstheme="majorHAnsi"/>
+              </w:rPr>
+              <w:t>refreshToken</w:t>
+            </w:r>
+            <w:proofErr w:type="spellEnd"/>
+            <w:r>
+              <w:rPr>
+                <w:rFonts w:asciiTheme="majorHAnsi" w:hAnsiTheme="majorHAnsi" w:cstheme="majorHAnsi"/>
+              </w:rPr>
+              <w:t>}</w:t>
             </w:r>
           </w:p>
         </w:tc>
@@ -3135,7 +3325,21 @@
               <w:rPr>
                 <w:rFonts w:asciiTheme="majorHAnsi" w:hAnsiTheme="majorHAnsi" w:cstheme="majorHAnsi"/>
               </w:rPr>
-              <w:t>200 OK: {token}</w:t>
+              <w:t xml:space="preserve">200 </w:t>
+            </w:r>
+            <w:proofErr w:type="gramStart"/>
+            <w:r>
+              <w:rPr>
+                <w:rFonts w:asciiTheme="majorHAnsi" w:hAnsiTheme="majorHAnsi" w:cstheme="majorHAnsi"/>
+              </w:rPr>
+              <w:t>OK: {</w:t>
+            </w:r>
+            <w:proofErr w:type="gramEnd"/>
+            <w:r>
+              <w:rPr>
+                <w:rFonts w:asciiTheme="majorHAnsi" w:hAnsiTheme="majorHAnsi" w:cstheme="majorHAnsi"/>
+              </w:rPr>
+              <w:t>token}</w:t>
             </w:r>
           </w:p>
         </w:tc>
@@ -3314,7 +3518,21 @@
               <w:rPr>
                 <w:rFonts w:asciiTheme="majorHAnsi" w:hAnsiTheme="majorHAnsi" w:cstheme="majorHAnsi"/>
               </w:rPr>
-              <w:t>/api/customers</w:t>
+              <w:t>/</w:t>
+            </w:r>
+            <w:proofErr w:type="spellStart"/>
+            <w:r>
+              <w:rPr>
+                <w:rFonts w:asciiTheme="majorHAnsi" w:hAnsiTheme="majorHAnsi" w:cstheme="majorHAnsi"/>
+              </w:rPr>
+              <w:t>api</w:t>
+            </w:r>
+            <w:proofErr w:type="spellEnd"/>
+            <w:r>
+              <w:rPr>
+                <w:rFonts w:asciiTheme="majorHAnsi" w:hAnsiTheme="majorHAnsi" w:cstheme="majorHAnsi"/>
+              </w:rPr>
+              <w:t>/customers</w:t>
             </w:r>
           </w:p>
         </w:tc>
@@ -3424,7 +3642,37 @@
               <w:rPr>
                 <w:rFonts w:asciiTheme="majorHAnsi" w:hAnsiTheme="majorHAnsi" w:cstheme="majorHAnsi"/>
               </w:rPr>
-              <w:t>/api/customers/{id}</w:t>
+              <w:t>/</w:t>
+            </w:r>
+            <w:proofErr w:type="spellStart"/>
+            <w:proofErr w:type="gramStart"/>
+            <w:r>
+              <w:rPr>
+                <w:rFonts w:asciiTheme="majorHAnsi" w:hAnsiTheme="majorHAnsi" w:cstheme="majorHAnsi"/>
+              </w:rPr>
+              <w:t>api</w:t>
+            </w:r>
+            <w:proofErr w:type="spellEnd"/>
+            <w:proofErr w:type="gramEnd"/>
+            <w:r>
+              <w:rPr>
+                <w:rFonts w:asciiTheme="majorHAnsi" w:hAnsiTheme="majorHAnsi" w:cstheme="majorHAnsi"/>
+              </w:rPr>
+              <w:t>/</w:t>
+            </w:r>
+            <w:proofErr w:type="gramStart"/>
+            <w:r>
+              <w:rPr>
+                <w:rFonts w:asciiTheme="majorHAnsi" w:hAnsiTheme="majorHAnsi" w:cstheme="majorHAnsi"/>
+              </w:rPr>
+              <w:t>customers/{</w:t>
+            </w:r>
+            <w:proofErr w:type="gramEnd"/>
+            <w:r>
+              <w:rPr>
+                <w:rFonts w:asciiTheme="majorHAnsi" w:hAnsiTheme="majorHAnsi" w:cstheme="majorHAnsi"/>
+              </w:rPr>
+              <w:t>id}</w:t>
             </w:r>
           </w:p>
         </w:tc>
@@ -3534,7 +3782,21 @@
               <w:rPr>
                 <w:rFonts w:asciiTheme="majorHAnsi" w:hAnsiTheme="majorHAnsi" w:cstheme="majorHAnsi"/>
               </w:rPr>
-              <w:t>/api/customers</w:t>
+              <w:t>/</w:t>
+            </w:r>
+            <w:proofErr w:type="spellStart"/>
+            <w:r>
+              <w:rPr>
+                <w:rFonts w:asciiTheme="majorHAnsi" w:hAnsiTheme="majorHAnsi" w:cstheme="majorHAnsi"/>
+              </w:rPr>
+              <w:t>api</w:t>
+            </w:r>
+            <w:proofErr w:type="spellEnd"/>
+            <w:r>
+              <w:rPr>
+                <w:rFonts w:asciiTheme="majorHAnsi" w:hAnsiTheme="majorHAnsi" w:cstheme="majorHAnsi"/>
+              </w:rPr>
+              <w:t>/customers</w:t>
             </w:r>
           </w:p>
         </w:tc>
@@ -3566,11 +3828,19 @@
                 <w:rFonts w:asciiTheme="majorHAnsi" w:hAnsiTheme="majorHAnsi" w:cstheme="majorHAnsi"/>
               </w:rPr>
             </w:pPr>
+            <w:proofErr w:type="gramStart"/>
             <w:r>
               <w:rPr>
                 <w:rFonts w:asciiTheme="majorHAnsi" w:hAnsiTheme="majorHAnsi" w:cstheme="majorHAnsi"/>
               </w:rPr>
-              <w:t>Create a new customer</w:t>
+              <w:t>Create</w:t>
+            </w:r>
+            <w:proofErr w:type="gramEnd"/>
+            <w:r>
+              <w:rPr>
+                <w:rFonts w:asciiTheme="majorHAnsi" w:hAnsiTheme="majorHAnsi" w:cstheme="majorHAnsi"/>
+              </w:rPr>
+              <w:t xml:space="preserve"> a new customer</w:t>
             </w:r>
           </w:p>
         </w:tc>
@@ -3584,11 +3854,19 @@
                 <w:rFonts w:asciiTheme="majorHAnsi" w:hAnsiTheme="majorHAnsi" w:cstheme="majorHAnsi"/>
               </w:rPr>
             </w:pPr>
+            <w:proofErr w:type="gramStart"/>
             <w:r>
               <w:rPr>
                 <w:rFonts w:asciiTheme="majorHAnsi" w:hAnsiTheme="majorHAnsi" w:cstheme="majorHAnsi"/>
               </w:rPr>
-              <w:t>JSON: {name, email, ...}</w:t>
+              <w:t>JSON: {</w:t>
+            </w:r>
+            <w:proofErr w:type="gramEnd"/>
+            <w:r>
+              <w:rPr>
+                <w:rFonts w:asciiTheme="majorHAnsi" w:hAnsiTheme="majorHAnsi" w:cstheme="majorHAnsi"/>
+              </w:rPr>
+              <w:t>name, email, ...}</w:t>
             </w:r>
           </w:p>
         </w:tc>
@@ -3644,7 +3922,37 @@
               <w:rPr>
                 <w:rFonts w:asciiTheme="majorHAnsi" w:hAnsiTheme="majorHAnsi" w:cstheme="majorHAnsi"/>
               </w:rPr>
-              <w:t>/api/customers/{id}</w:t>
+              <w:t>/</w:t>
+            </w:r>
+            <w:proofErr w:type="spellStart"/>
+            <w:proofErr w:type="gramStart"/>
+            <w:r>
+              <w:rPr>
+                <w:rFonts w:asciiTheme="majorHAnsi" w:hAnsiTheme="majorHAnsi" w:cstheme="majorHAnsi"/>
+              </w:rPr>
+              <w:t>api</w:t>
+            </w:r>
+            <w:proofErr w:type="spellEnd"/>
+            <w:proofErr w:type="gramEnd"/>
+            <w:r>
+              <w:rPr>
+                <w:rFonts w:asciiTheme="majorHAnsi" w:hAnsiTheme="majorHAnsi" w:cstheme="majorHAnsi"/>
+              </w:rPr>
+              <w:t>/</w:t>
+            </w:r>
+            <w:proofErr w:type="gramStart"/>
+            <w:r>
+              <w:rPr>
+                <w:rFonts w:asciiTheme="majorHAnsi" w:hAnsiTheme="majorHAnsi" w:cstheme="majorHAnsi"/>
+              </w:rPr>
+              <w:t>customers/{</w:t>
+            </w:r>
+            <w:proofErr w:type="gramEnd"/>
+            <w:r>
+              <w:rPr>
+                <w:rFonts w:asciiTheme="majorHAnsi" w:hAnsiTheme="majorHAnsi" w:cstheme="majorHAnsi"/>
+              </w:rPr>
+              <w:t>id}</w:t>
             </w:r>
           </w:p>
         </w:tc>
@@ -3754,7 +4062,37 @@
               <w:rPr>
                 <w:rFonts w:asciiTheme="majorHAnsi" w:hAnsiTheme="majorHAnsi" w:cstheme="majorHAnsi"/>
               </w:rPr>
-              <w:t>/api/customers/{id}</w:t>
+              <w:t>/</w:t>
+            </w:r>
+            <w:proofErr w:type="spellStart"/>
+            <w:proofErr w:type="gramStart"/>
+            <w:r>
+              <w:rPr>
+                <w:rFonts w:asciiTheme="majorHAnsi" w:hAnsiTheme="majorHAnsi" w:cstheme="majorHAnsi"/>
+              </w:rPr>
+              <w:t>api</w:t>
+            </w:r>
+            <w:proofErr w:type="spellEnd"/>
+            <w:proofErr w:type="gramEnd"/>
+            <w:r>
+              <w:rPr>
+                <w:rFonts w:asciiTheme="majorHAnsi" w:hAnsiTheme="majorHAnsi" w:cstheme="majorHAnsi"/>
+              </w:rPr>
+              <w:t>/</w:t>
+            </w:r>
+            <w:proofErr w:type="gramStart"/>
+            <w:r>
+              <w:rPr>
+                <w:rFonts w:asciiTheme="majorHAnsi" w:hAnsiTheme="majorHAnsi" w:cstheme="majorHAnsi"/>
+              </w:rPr>
+              <w:t>customers/{</w:t>
+            </w:r>
+            <w:proofErr w:type="gramEnd"/>
+            <w:r>
+              <w:rPr>
+                <w:rFonts w:asciiTheme="majorHAnsi" w:hAnsiTheme="majorHAnsi" w:cstheme="majorHAnsi"/>
+              </w:rPr>
+              <w:t>id}</w:t>
             </w:r>
           </w:p>
         </w:tc>
@@ -3957,7 +4295,14 @@
               <w:rPr>
                 <w:rFonts w:asciiTheme="majorHAnsi" w:hAnsiTheme="majorHAnsi" w:cstheme="majorHAnsi"/>
               </w:rPr>
-              <w:t>Request Parameters / Body</w:t>
+              <w:t xml:space="preserve">Request Parameters / </w:t>
+            </w:r>
+            <w:r>
+              <w:rPr>
+                <w:rFonts w:asciiTheme="majorHAnsi" w:hAnsiTheme="majorHAnsi" w:cstheme="majorHAnsi"/>
+              </w:rPr>
+              <w:lastRenderedPageBreak/>
+              <w:t>Body</w:t>
             </w:r>
           </w:p>
         </w:tc>
@@ -3975,6 +4320,7 @@
               <w:rPr>
                 <w:rFonts w:asciiTheme="majorHAnsi" w:hAnsiTheme="majorHAnsi" w:cstheme="majorHAnsi"/>
               </w:rPr>
+              <w:lastRenderedPageBreak/>
               <w:t>Response</w:t>
             </w:r>
           </w:p>
@@ -3993,7 +4339,14 @@
               <w:rPr>
                 <w:rFonts w:asciiTheme="majorHAnsi" w:hAnsiTheme="majorHAnsi" w:cstheme="majorHAnsi"/>
               </w:rPr>
-              <w:t>Auth Required</w:t>
+              <w:t>Auth Require</w:t>
+            </w:r>
+            <w:r>
+              <w:rPr>
+                <w:rFonts w:asciiTheme="majorHAnsi" w:hAnsiTheme="majorHAnsi" w:cstheme="majorHAnsi"/>
+              </w:rPr>
+              <w:lastRenderedPageBreak/>
+              <w:t>d</w:t>
             </w:r>
           </w:p>
         </w:tc>
@@ -4013,7 +4366,22 @@
               <w:rPr>
                 <w:rFonts w:asciiTheme="majorHAnsi" w:hAnsiTheme="majorHAnsi" w:cstheme="majorHAnsi"/>
               </w:rPr>
-              <w:t>/api/orders</w:t>
+              <w:lastRenderedPageBreak/>
+              <w:t>/</w:t>
+            </w:r>
+            <w:proofErr w:type="spellStart"/>
+            <w:r>
+              <w:rPr>
+                <w:rFonts w:asciiTheme="majorHAnsi" w:hAnsiTheme="majorHAnsi" w:cstheme="majorHAnsi"/>
+              </w:rPr>
+              <w:t>api</w:t>
+            </w:r>
+            <w:proofErr w:type="spellEnd"/>
+            <w:r>
+              <w:rPr>
+                <w:rFonts w:asciiTheme="majorHAnsi" w:hAnsiTheme="majorHAnsi" w:cstheme="majorHAnsi"/>
+              </w:rPr>
+              <w:t>/orders</w:t>
             </w:r>
           </w:p>
         </w:tc>
@@ -4123,7 +4491,37 @@
               <w:rPr>
                 <w:rFonts w:asciiTheme="majorHAnsi" w:hAnsiTheme="majorHAnsi" w:cstheme="majorHAnsi"/>
               </w:rPr>
-              <w:t>/api/orders/{id}</w:t>
+              <w:t>/</w:t>
+            </w:r>
+            <w:proofErr w:type="spellStart"/>
+            <w:proofErr w:type="gramStart"/>
+            <w:r>
+              <w:rPr>
+                <w:rFonts w:asciiTheme="majorHAnsi" w:hAnsiTheme="majorHAnsi" w:cstheme="majorHAnsi"/>
+              </w:rPr>
+              <w:t>api</w:t>
+            </w:r>
+            <w:proofErr w:type="spellEnd"/>
+            <w:proofErr w:type="gramEnd"/>
+            <w:r>
+              <w:rPr>
+                <w:rFonts w:asciiTheme="majorHAnsi" w:hAnsiTheme="majorHAnsi" w:cstheme="majorHAnsi"/>
+              </w:rPr>
+              <w:t>/</w:t>
+            </w:r>
+            <w:proofErr w:type="gramStart"/>
+            <w:r>
+              <w:rPr>
+                <w:rFonts w:asciiTheme="majorHAnsi" w:hAnsiTheme="majorHAnsi" w:cstheme="majorHAnsi"/>
+              </w:rPr>
+              <w:t>orders/{</w:t>
+            </w:r>
+            <w:proofErr w:type="gramEnd"/>
+            <w:r>
+              <w:rPr>
+                <w:rFonts w:asciiTheme="majorHAnsi" w:hAnsiTheme="majorHAnsi" w:cstheme="majorHAnsi"/>
+              </w:rPr>
+              <w:t>id}</w:t>
             </w:r>
           </w:p>
         </w:tc>
@@ -4195,14 +4593,7 @@
               <w:rPr>
                 <w:rFonts w:asciiTheme="majorHAnsi" w:hAnsiTheme="majorHAnsi" w:cstheme="majorHAnsi"/>
               </w:rPr>
-              <w:t xml:space="preserve">200 OK: Order </w:t>
-            </w:r>
-            <w:r>
-              <w:rPr>
-                <w:rFonts w:asciiTheme="majorHAnsi" w:hAnsiTheme="majorHAnsi" w:cstheme="majorHAnsi"/>
-              </w:rPr>
-              <w:lastRenderedPageBreak/>
-              <w:t>object</w:t>
+              <w:t>200 OK: Order object</w:t>
             </w:r>
           </w:p>
         </w:tc>
@@ -4220,7 +4611,6 @@
               <w:rPr>
                 <w:rFonts w:asciiTheme="majorHAnsi" w:hAnsiTheme="majorHAnsi" w:cstheme="majorHAnsi"/>
               </w:rPr>
-              <w:lastRenderedPageBreak/>
               <w:t>Yes</w:t>
             </w:r>
           </w:p>
@@ -4241,7 +4631,43 @@
               <w:rPr>
                 <w:rFonts w:asciiTheme="majorHAnsi" w:hAnsiTheme="majorHAnsi" w:cstheme="majorHAnsi"/>
               </w:rPr>
-              <w:t>/api/orders/customer/{customerId}</w:t>
+              <w:t>/</w:t>
+            </w:r>
+            <w:proofErr w:type="spellStart"/>
+            <w:r>
+              <w:rPr>
+                <w:rFonts w:asciiTheme="majorHAnsi" w:hAnsiTheme="majorHAnsi" w:cstheme="majorHAnsi"/>
+              </w:rPr>
+              <w:t>api</w:t>
+            </w:r>
+            <w:proofErr w:type="spellEnd"/>
+            <w:r>
+              <w:rPr>
+                <w:rFonts w:asciiTheme="majorHAnsi" w:hAnsiTheme="majorHAnsi" w:cstheme="majorHAnsi"/>
+              </w:rPr>
+              <w:t>/orders/</w:t>
+            </w:r>
+            <w:proofErr w:type="gramStart"/>
+            <w:r>
+              <w:rPr>
+                <w:rFonts w:asciiTheme="majorHAnsi" w:hAnsiTheme="majorHAnsi" w:cstheme="majorHAnsi"/>
+              </w:rPr>
+              <w:t>customer/{</w:t>
+            </w:r>
+            <w:proofErr w:type="spellStart"/>
+            <w:proofErr w:type="gramEnd"/>
+            <w:r>
+              <w:rPr>
+                <w:rFonts w:asciiTheme="majorHAnsi" w:hAnsiTheme="majorHAnsi" w:cstheme="majorHAnsi"/>
+              </w:rPr>
+              <w:t>customerId</w:t>
+            </w:r>
+            <w:proofErr w:type="spellEnd"/>
+            <w:r>
+              <w:rPr>
+                <w:rFonts w:asciiTheme="majorHAnsi" w:hAnsiTheme="majorHAnsi" w:cstheme="majorHAnsi"/>
+              </w:rPr>
+              <w:t>}</w:t>
             </w:r>
           </w:p>
         </w:tc>
@@ -4295,8 +4721,16 @@
               <w:rPr>
                 <w:rFonts w:asciiTheme="majorHAnsi" w:hAnsiTheme="majorHAnsi" w:cstheme="majorHAnsi"/>
               </w:rPr>
-              <w:t>Path: customerId</w:t>
+              <w:t xml:space="preserve">Path: </w:t>
             </w:r>
+            <w:proofErr w:type="spellStart"/>
+            <w:r>
+              <w:rPr>
+                <w:rFonts w:asciiTheme="majorHAnsi" w:hAnsiTheme="majorHAnsi" w:cstheme="majorHAnsi"/>
+              </w:rPr>
+              <w:t>customerId</w:t>
+            </w:r>
+            <w:proofErr w:type="spellEnd"/>
           </w:p>
         </w:tc>
         <w:tc>
@@ -4351,7 +4785,21 @@
               <w:rPr>
                 <w:rFonts w:asciiTheme="majorHAnsi" w:hAnsiTheme="majorHAnsi" w:cstheme="majorHAnsi"/>
               </w:rPr>
-              <w:t>/api/orders</w:t>
+              <w:t>/</w:t>
+            </w:r>
+            <w:proofErr w:type="spellStart"/>
+            <w:r>
+              <w:rPr>
+                <w:rFonts w:asciiTheme="majorHAnsi" w:hAnsiTheme="majorHAnsi" w:cstheme="majorHAnsi"/>
+              </w:rPr>
+              <w:t>api</w:t>
+            </w:r>
+            <w:proofErr w:type="spellEnd"/>
+            <w:r>
+              <w:rPr>
+                <w:rFonts w:asciiTheme="majorHAnsi" w:hAnsiTheme="majorHAnsi" w:cstheme="majorHAnsi"/>
+              </w:rPr>
+              <w:t>/orders</w:t>
             </w:r>
           </w:p>
         </w:tc>
@@ -4401,11 +4849,41 @@
                 <w:rFonts w:asciiTheme="majorHAnsi" w:hAnsiTheme="majorHAnsi" w:cstheme="majorHAnsi"/>
               </w:rPr>
             </w:pPr>
+            <w:proofErr w:type="gramStart"/>
             <w:r>
               <w:rPr>
                 <w:rFonts w:asciiTheme="majorHAnsi" w:hAnsiTheme="majorHAnsi" w:cstheme="majorHAnsi"/>
               </w:rPr>
-              <w:t>JSON: {customerId, productName, price, ...}</w:t>
+              <w:t>JSON: {</w:t>
+            </w:r>
+            <w:proofErr w:type="spellStart"/>
+            <w:proofErr w:type="gramEnd"/>
+            <w:r>
+              <w:rPr>
+                <w:rFonts w:asciiTheme="majorHAnsi" w:hAnsiTheme="majorHAnsi" w:cstheme="majorHAnsi"/>
+              </w:rPr>
+              <w:t>customerId</w:t>
+            </w:r>
+            <w:proofErr w:type="spellEnd"/>
+            <w:r>
+              <w:rPr>
+                <w:rFonts w:asciiTheme="majorHAnsi" w:hAnsiTheme="majorHAnsi" w:cstheme="majorHAnsi"/>
+              </w:rPr>
+              <w:t xml:space="preserve">, </w:t>
+            </w:r>
+            <w:proofErr w:type="spellStart"/>
+            <w:r>
+              <w:rPr>
+                <w:rFonts w:asciiTheme="majorHAnsi" w:hAnsiTheme="majorHAnsi" w:cstheme="majorHAnsi"/>
+              </w:rPr>
+              <w:t>productName</w:t>
+            </w:r>
+            <w:proofErr w:type="spellEnd"/>
+            <w:r>
+              <w:rPr>
+                <w:rFonts w:asciiTheme="majorHAnsi" w:hAnsiTheme="majorHAnsi" w:cstheme="majorHAnsi"/>
+              </w:rPr>
+              <w:t>, price, ...}</w:t>
             </w:r>
           </w:p>
         </w:tc>
@@ -4461,7 +4939,37 @@
               <w:rPr>
                 <w:rFonts w:asciiTheme="majorHAnsi" w:hAnsiTheme="majorHAnsi" w:cstheme="majorHAnsi"/>
               </w:rPr>
-              <w:t>/api/orders/{id}</w:t>
+              <w:t>/</w:t>
+            </w:r>
+            <w:proofErr w:type="spellStart"/>
+            <w:proofErr w:type="gramStart"/>
+            <w:r>
+              <w:rPr>
+                <w:rFonts w:asciiTheme="majorHAnsi" w:hAnsiTheme="majorHAnsi" w:cstheme="majorHAnsi"/>
+              </w:rPr>
+              <w:t>api</w:t>
+            </w:r>
+            <w:proofErr w:type="spellEnd"/>
+            <w:proofErr w:type="gramEnd"/>
+            <w:r>
+              <w:rPr>
+                <w:rFonts w:asciiTheme="majorHAnsi" w:hAnsiTheme="majorHAnsi" w:cstheme="majorHAnsi"/>
+              </w:rPr>
+              <w:t>/</w:t>
+            </w:r>
+            <w:proofErr w:type="gramStart"/>
+            <w:r>
+              <w:rPr>
+                <w:rFonts w:asciiTheme="majorHAnsi" w:hAnsiTheme="majorHAnsi" w:cstheme="majorHAnsi"/>
+              </w:rPr>
+              <w:t>orders/{</w:t>
+            </w:r>
+            <w:proofErr w:type="gramEnd"/>
+            <w:r>
+              <w:rPr>
+                <w:rFonts w:asciiTheme="majorHAnsi" w:hAnsiTheme="majorHAnsi" w:cstheme="majorHAnsi"/>
+              </w:rPr>
+              <w:t>id}</w:t>
             </w:r>
           </w:p>
         </w:tc>
@@ -4712,7 +5220,21 @@
               <w:rPr>
                 <w:rFonts w:asciiTheme="majorHAnsi" w:hAnsiTheme="majorHAnsi" w:cstheme="majorHAnsi"/>
               </w:rPr>
-              <w:t>/api/logs</w:t>
+              <w:t>/</w:t>
+            </w:r>
+            <w:proofErr w:type="spellStart"/>
+            <w:r>
+              <w:rPr>
+                <w:rFonts w:asciiTheme="majorHAnsi" w:hAnsiTheme="majorHAnsi" w:cstheme="majorHAnsi"/>
+              </w:rPr>
+              <w:t>api</w:t>
+            </w:r>
+            <w:proofErr w:type="spellEnd"/>
+            <w:r>
+              <w:rPr>
+                <w:rFonts w:asciiTheme="majorHAnsi" w:hAnsiTheme="majorHAnsi" w:cstheme="majorHAnsi"/>
+              </w:rPr>
+              <w:t>/logs</w:t>
             </w:r>
           </w:p>
         </w:tc>
@@ -4766,8 +5288,16 @@
               <w:rPr>
                 <w:rFonts w:asciiTheme="majorHAnsi" w:hAnsiTheme="majorHAnsi" w:cstheme="majorHAnsi"/>
               </w:rPr>
-              <w:t>Query: level, dateRange</w:t>
+              <w:t xml:space="preserve">Query: level, </w:t>
             </w:r>
+            <w:proofErr w:type="spellStart"/>
+            <w:r>
+              <w:rPr>
+                <w:rFonts w:asciiTheme="majorHAnsi" w:hAnsiTheme="majorHAnsi" w:cstheme="majorHAnsi"/>
+              </w:rPr>
+              <w:t>dateRange</w:t>
+            </w:r>
+            <w:proofErr w:type="spellEnd"/>
           </w:p>
         </w:tc>
         <w:tc>
@@ -4784,7 +5314,21 @@
               <w:rPr>
                 <w:rFonts w:asciiTheme="majorHAnsi" w:hAnsiTheme="majorHAnsi" w:cstheme="majorHAnsi"/>
               </w:rPr>
-              <w:t>200 OK: [LogEntry]</w:t>
+              <w:t>200 OK: [</w:t>
+            </w:r>
+            <w:proofErr w:type="spellStart"/>
+            <w:r>
+              <w:rPr>
+                <w:rFonts w:asciiTheme="majorHAnsi" w:hAnsiTheme="majorHAnsi" w:cstheme="majorHAnsi"/>
+              </w:rPr>
+              <w:t>LogEntry</w:t>
+            </w:r>
+            <w:proofErr w:type="spellEnd"/>
+            <w:r>
+              <w:rPr>
+                <w:rFonts w:asciiTheme="majorHAnsi" w:hAnsiTheme="majorHAnsi" w:cstheme="majorHAnsi"/>
+              </w:rPr>
+              <w:t>]</w:t>
             </w:r>
           </w:p>
         </w:tc>
@@ -4822,7 +5366,37 @@
               <w:rPr>
                 <w:rFonts w:asciiTheme="majorHAnsi" w:hAnsiTheme="majorHAnsi" w:cstheme="majorHAnsi"/>
               </w:rPr>
-              <w:t>/api/logs/{id}</w:t>
+              <w:t>/</w:t>
+            </w:r>
+            <w:proofErr w:type="spellStart"/>
+            <w:proofErr w:type="gramStart"/>
+            <w:r>
+              <w:rPr>
+                <w:rFonts w:asciiTheme="majorHAnsi" w:hAnsiTheme="majorHAnsi" w:cstheme="majorHAnsi"/>
+              </w:rPr>
+              <w:t>api</w:t>
+            </w:r>
+            <w:proofErr w:type="spellEnd"/>
+            <w:proofErr w:type="gramEnd"/>
+            <w:r>
+              <w:rPr>
+                <w:rFonts w:asciiTheme="majorHAnsi" w:hAnsiTheme="majorHAnsi" w:cstheme="majorHAnsi"/>
+              </w:rPr>
+              <w:t>/</w:t>
+            </w:r>
+            <w:proofErr w:type="gramStart"/>
+            <w:r>
+              <w:rPr>
+                <w:rFonts w:asciiTheme="majorHAnsi" w:hAnsiTheme="majorHAnsi" w:cstheme="majorHAnsi"/>
+              </w:rPr>
+              <w:t>logs/{</w:t>
+            </w:r>
+            <w:proofErr w:type="gramEnd"/>
+            <w:r>
+              <w:rPr>
+                <w:rFonts w:asciiTheme="majorHAnsi" w:hAnsiTheme="majorHAnsi" w:cstheme="majorHAnsi"/>
+              </w:rPr>
+              <w:t>id}</w:t>
             </w:r>
           </w:p>
         </w:tc>
@@ -4894,8 +5468,16 @@
               <w:rPr>
                 <w:rFonts w:asciiTheme="majorHAnsi" w:hAnsiTheme="majorHAnsi" w:cstheme="majorHAnsi"/>
               </w:rPr>
-              <w:t>200 OK: LogEntry</w:t>
+              <w:t xml:space="preserve">200 OK: </w:t>
             </w:r>
+            <w:proofErr w:type="spellStart"/>
+            <w:r>
+              <w:rPr>
+                <w:rFonts w:asciiTheme="majorHAnsi" w:hAnsiTheme="majorHAnsi" w:cstheme="majorHAnsi"/>
+              </w:rPr>
+              <w:t>LogEntry</w:t>
+            </w:r>
+            <w:proofErr w:type="spellEnd"/>
           </w:p>
         </w:tc>
         <w:tc>
@@ -5073,7 +5655,21 @@
               <w:rPr>
                 <w:rFonts w:asciiTheme="majorHAnsi" w:hAnsiTheme="majorHAnsi" w:cstheme="majorHAnsi"/>
               </w:rPr>
-              <w:t>/api/notifications</w:t>
+              <w:t>/</w:t>
+            </w:r>
+            <w:proofErr w:type="spellStart"/>
+            <w:r>
+              <w:rPr>
+                <w:rFonts w:asciiTheme="majorHAnsi" w:hAnsiTheme="majorHAnsi" w:cstheme="majorHAnsi"/>
+              </w:rPr>
+              <w:t>api</w:t>
+            </w:r>
+            <w:proofErr w:type="spellEnd"/>
+            <w:r>
+              <w:rPr>
+                <w:rFonts w:asciiTheme="majorHAnsi" w:hAnsiTheme="majorHAnsi" w:cstheme="majorHAnsi"/>
+              </w:rPr>
+              <w:t>/notifications</w:t>
             </w:r>
           </w:p>
         </w:tc>
@@ -5183,7 +5779,37 @@
               <w:rPr>
                 <w:rFonts w:asciiTheme="majorHAnsi" w:hAnsiTheme="majorHAnsi" w:cstheme="majorHAnsi"/>
               </w:rPr>
-              <w:t>/api/notifications/{id}</w:t>
+              <w:t>/</w:t>
+            </w:r>
+            <w:proofErr w:type="spellStart"/>
+            <w:proofErr w:type="gramStart"/>
+            <w:r>
+              <w:rPr>
+                <w:rFonts w:asciiTheme="majorHAnsi" w:hAnsiTheme="majorHAnsi" w:cstheme="majorHAnsi"/>
+              </w:rPr>
+              <w:t>api</w:t>
+            </w:r>
+            <w:proofErr w:type="spellEnd"/>
+            <w:proofErr w:type="gramEnd"/>
+            <w:r>
+              <w:rPr>
+                <w:rFonts w:asciiTheme="majorHAnsi" w:hAnsiTheme="majorHAnsi" w:cstheme="majorHAnsi"/>
+              </w:rPr>
+              <w:t>/</w:t>
+            </w:r>
+            <w:proofErr w:type="gramStart"/>
+            <w:r>
+              <w:rPr>
+                <w:rFonts w:asciiTheme="majorHAnsi" w:hAnsiTheme="majorHAnsi" w:cstheme="majorHAnsi"/>
+              </w:rPr>
+              <w:t>notifications/{</w:t>
+            </w:r>
+            <w:proofErr w:type="gramEnd"/>
+            <w:r>
+              <w:rPr>
+                <w:rFonts w:asciiTheme="majorHAnsi" w:hAnsiTheme="majorHAnsi" w:cstheme="majorHAnsi"/>
+              </w:rPr>
+              <w:t>id}</w:t>
             </w:r>
           </w:p>
         </w:tc>
@@ -5353,7 +5979,6 @@
           <w:rFonts w:cstheme="majorHAnsi"/>
           <w:lang w:eastAsia="ja-JP"/>
         </w:rPr>
-        <w:lastRenderedPageBreak/>
         <w:t>REST API Diagram</w:t>
       </w:r>
       <w:bookmarkEnd w:id="11"/>
@@ -5590,7 +6215,6 @@
       <w:pPr>
         <w:pStyle w:val="Heading2"/>
         <w:rPr>
-          <w:rFonts w:hint="eastAsia"/>
           <w:u w:val="single"/>
           <w:lang w:eastAsia="ja-JP"/>
         </w:rPr>
@@ -5730,9 +6354,17 @@
           <w:szCs w:val="24"/>
           <w:lang w:val="en-IL" w:eastAsia="ja-JP" w:bidi="he-IL"/>
         </w:rPr>
-        <w:t xml:space="preserve">Server </w:t>
+        <w:t>Server validates Email, Password in Database</w:t>
       </w:r>
-      <w:r>
+      <w:bookmarkEnd w:id="17"/>
+    </w:p>
+    <w:p>
+      <w:pPr>
+        <w:pStyle w:val="Heading2"/>
+        <w:numPr>
+          <w:ilvl w:val="0"/>
+          <w:numId w:val="15"/>
+        </w:numPr>
         <w:rPr>
           <w:rFonts w:cstheme="majorHAnsi"/>
           <w:b w:val="0"/>
@@ -5742,8 +6374,8 @@
           <w:szCs w:val="24"/>
           <w:lang w:val="en-IL" w:eastAsia="ja-JP" w:bidi="he-IL"/>
         </w:rPr>
-        <w:t xml:space="preserve">validates Email, Password in </w:t>
-      </w:r>
+      </w:pPr>
+      <w:bookmarkStart w:id="18" w:name="_Toc205676432"/>
       <w:r>
         <w:rPr>
           <w:rFonts w:cstheme="majorHAnsi"/>
@@ -5754,9 +6386,9 @@
           <w:szCs w:val="24"/>
           <w:lang w:val="en-IL" w:eastAsia="ja-JP" w:bidi="he-IL"/>
         </w:rPr>
-        <w:t>Database</w:t>
+        <w:t>Email &amp; Password are valid → Generate JWT</w:t>
       </w:r>
-      <w:bookmarkEnd w:id="17"/>
+      <w:bookmarkEnd w:id="18"/>
     </w:p>
     <w:p>
       <w:pPr>
@@ -5775,7 +6407,7 @@
           <w:lang w:val="en-IL" w:eastAsia="ja-JP" w:bidi="he-IL"/>
         </w:rPr>
       </w:pPr>
-      <w:bookmarkStart w:id="18" w:name="_Toc205676432"/>
+      <w:bookmarkStart w:id="19" w:name="_Toc205676433"/>
       <w:r>
         <w:rPr>
           <w:rFonts w:cstheme="majorHAnsi"/>
@@ -5786,9 +6418,17 @@
           <w:szCs w:val="24"/>
           <w:lang w:val="en-IL" w:eastAsia="ja-JP" w:bidi="he-IL"/>
         </w:rPr>
-        <w:t>Email</w:t>
+        <w:t>Server returns token to Client</w:t>
       </w:r>
-      <w:r>
+      <w:bookmarkEnd w:id="19"/>
+    </w:p>
+    <w:p>
+      <w:pPr>
+        <w:pStyle w:val="Heading2"/>
+        <w:numPr>
+          <w:ilvl w:val="0"/>
+          <w:numId w:val="15"/>
+        </w:numPr>
         <w:rPr>
           <w:rFonts w:cstheme="majorHAnsi"/>
           <w:b w:val="0"/>
@@ -5798,8 +6438,8 @@
           <w:szCs w:val="24"/>
           <w:lang w:val="en-IL" w:eastAsia="ja-JP" w:bidi="he-IL"/>
         </w:rPr>
-        <w:t xml:space="preserve"> &amp;</w:t>
-      </w:r>
+      </w:pPr>
+      <w:bookmarkStart w:id="20" w:name="_Toc205676434"/>
       <w:r>
         <w:rPr>
           <w:rFonts w:cstheme="majorHAnsi"/>
@@ -5810,143 +6450,7 @@
           <w:szCs w:val="24"/>
           <w:lang w:val="en-IL" w:eastAsia="ja-JP" w:bidi="he-IL"/>
         </w:rPr>
-        <w:t xml:space="preserve"> Password</w:t>
-      </w:r>
-      <w:r>
-        <w:rPr>
-          <w:rFonts w:cstheme="majorHAnsi"/>
-          <w:b w:val="0"/>
-          <w:bCs w:val="0"/>
-          <w:color w:val="auto"/>
-          <w:sz w:val="24"/>
-          <w:szCs w:val="24"/>
-          <w:lang w:val="en-IL" w:eastAsia="ja-JP" w:bidi="he-IL"/>
-        </w:rPr>
-        <w:t xml:space="preserve"> are </w:t>
-      </w:r>
-      <w:r>
-        <w:rPr>
-          <w:rFonts w:cstheme="majorHAnsi"/>
-          <w:b w:val="0"/>
-          <w:bCs w:val="0"/>
-          <w:color w:val="auto"/>
-          <w:sz w:val="24"/>
-          <w:szCs w:val="24"/>
-          <w:lang w:val="en-IL" w:eastAsia="ja-JP" w:bidi="he-IL"/>
-        </w:rPr>
-        <w:t>valid → Generate JWT</w:t>
-      </w:r>
-      <w:bookmarkEnd w:id="18"/>
-    </w:p>
-    <w:p>
-      <w:pPr>
-        <w:pStyle w:val="Heading2"/>
-        <w:numPr>
-          <w:ilvl w:val="0"/>
-          <w:numId w:val="15"/>
-        </w:numPr>
-        <w:rPr>
-          <w:rFonts w:cstheme="majorHAnsi"/>
-          <w:b w:val="0"/>
-          <w:bCs w:val="0"/>
-          <w:color w:val="auto"/>
-          <w:sz w:val="24"/>
-          <w:szCs w:val="24"/>
-          <w:lang w:val="en-IL" w:eastAsia="ja-JP" w:bidi="he-IL"/>
-        </w:rPr>
-      </w:pPr>
-      <w:bookmarkStart w:id="19" w:name="_Toc205676433"/>
-      <w:r>
-        <w:rPr>
-          <w:rFonts w:cstheme="majorHAnsi"/>
-          <w:b w:val="0"/>
-          <w:bCs w:val="0"/>
-          <w:color w:val="auto"/>
-          <w:sz w:val="24"/>
-          <w:szCs w:val="24"/>
-          <w:lang w:val="en-IL" w:eastAsia="ja-JP" w:bidi="he-IL"/>
-        </w:rPr>
-        <w:t>Server returns token to Client</w:t>
-      </w:r>
-      <w:bookmarkEnd w:id="19"/>
-    </w:p>
-    <w:p>
-      <w:pPr>
-        <w:pStyle w:val="Heading2"/>
-        <w:numPr>
-          <w:ilvl w:val="0"/>
-          <w:numId w:val="15"/>
-        </w:numPr>
-        <w:rPr>
-          <w:rFonts w:cstheme="majorHAnsi"/>
-          <w:b w:val="0"/>
-          <w:bCs w:val="0"/>
-          <w:color w:val="auto"/>
-          <w:sz w:val="24"/>
-          <w:szCs w:val="24"/>
-          <w:lang w:val="en-IL" w:eastAsia="ja-JP" w:bidi="he-IL"/>
-        </w:rPr>
-      </w:pPr>
-      <w:bookmarkStart w:id="20" w:name="_Toc205676434"/>
-      <w:r>
-        <w:rPr>
-          <w:rFonts w:cstheme="majorHAnsi"/>
-          <w:b w:val="0"/>
-          <w:bCs w:val="0"/>
-          <w:color w:val="auto"/>
-          <w:sz w:val="24"/>
-          <w:szCs w:val="24"/>
-          <w:lang w:val="en-IL" w:eastAsia="ja-JP" w:bidi="he-IL"/>
-        </w:rPr>
-        <w:t>Client stores token</w:t>
-      </w:r>
-      <w:r>
-        <w:rPr>
-          <w:rFonts w:cstheme="majorHAnsi"/>
-          <w:b w:val="0"/>
-          <w:bCs w:val="0"/>
-          <w:color w:val="auto"/>
-          <w:sz w:val="24"/>
-          <w:szCs w:val="24"/>
-          <w:lang w:val="en-IL" w:eastAsia="ja-JP" w:bidi="he-IL"/>
-        </w:rPr>
-        <w:t xml:space="preserve"> for f</w:t>
-      </w:r>
-      <w:r>
-        <w:rPr>
-          <w:rFonts w:cstheme="majorHAnsi"/>
-          <w:b w:val="0"/>
-          <w:bCs w:val="0"/>
-          <w:color w:val="auto"/>
-          <w:sz w:val="24"/>
-          <w:szCs w:val="24"/>
-          <w:lang w:val="en-IL" w:eastAsia="ja-JP" w:bidi="he-IL"/>
-        </w:rPr>
-        <w:t xml:space="preserve">uture requests </w:t>
-      </w:r>
-      <w:r>
-        <w:rPr>
-          <w:rFonts w:cstheme="majorHAnsi"/>
-          <w:b w:val="0"/>
-          <w:bCs w:val="0"/>
-          <w:color w:val="auto"/>
-          <w:sz w:val="24"/>
-          <w:szCs w:val="24"/>
-          <w:lang w:val="en-IL" w:eastAsia="ja-JP" w:bidi="he-IL"/>
-        </w:rPr>
-        <w:t>includes</w:t>
-      </w:r>
-      <w:r>
-        <w:rPr>
-          <w:rFonts w:cstheme="majorHAnsi"/>
-          <w:b w:val="0"/>
-          <w:bCs w:val="0"/>
-          <w:color w:val="auto"/>
-          <w:sz w:val="24"/>
-          <w:szCs w:val="24"/>
-          <w:lang w:val="en-IL" w:eastAsia="ja-JP" w:bidi="he-IL"/>
-        </w:rPr>
-        <w:t xml:space="preserve"> Authorization: Bearer &lt;token&gt;</w:t>
+        <w:t>Client stores token for future requests includes Authorization: Bearer &lt;token&gt;</w:t>
       </w:r>
       <w:bookmarkEnd w:id="20"/>
     </w:p>
@@ -6006,15 +6510,10 @@
           <w:highlight w:val="white"/>
           <w:lang w:val="en-IL" w:bidi="he-IL"/>
         </w:rPr>
-        <w:t># See https://aka.ms/customizecontainer to learn how to customize your debug container and how Visual Studio uses this Dockerfile to build your images for faster debugging.</w:t>
+        <w:t xml:space="preserve"># See https://aka.ms/customizecontainer to learn how to customize your debug container and how Visual Studio uses this </w:t>
       </w:r>
-    </w:p>
-    <w:p>
-      <w:pPr>
-        <w:autoSpaceDE w:val="0"/>
-        <w:autoSpaceDN w:val="0"/>
-        <w:adjustRightInd w:val="0"/>
-        <w:spacing w:after="0" w:line="240" w:lineRule="auto"/>
+      <w:proofErr w:type="spellStart"/>
+      <w:r>
         <w:rPr>
           <w:rFonts w:ascii="Cascadia Mono" w:hAnsi="Cascadia Mono" w:cs="Cascadia Mono"/>
           <w:color w:val="008000"/>
@@ -6023,14 +6522,10 @@
           <w:highlight w:val="white"/>
           <w:lang w:val="en-IL" w:bidi="he-IL"/>
         </w:rPr>
-      </w:pPr>
-    </w:p>
-    <w:p>
-      <w:pPr>
-        <w:autoSpaceDE w:val="0"/>
-        <w:autoSpaceDN w:val="0"/>
-        <w:adjustRightInd w:val="0"/>
-        <w:spacing w:after="0" w:line="240" w:lineRule="auto"/>
+        <w:t>Dockerfile</w:t>
+      </w:r>
+      <w:proofErr w:type="spellEnd"/>
+      <w:r>
         <w:rPr>
           <w:rFonts w:ascii="Cascadia Mono" w:hAnsi="Cascadia Mono" w:cs="Cascadia Mono"/>
           <w:color w:val="008000"/>
@@ -6039,8 +6534,15 @@
           <w:highlight w:val="white"/>
           <w:lang w:val="en-IL" w:bidi="he-IL"/>
         </w:rPr>
-      </w:pPr>
-      <w:r>
+        <w:t xml:space="preserve"> to build your images for faster debugging.</w:t>
+      </w:r>
+    </w:p>
+    <w:p>
+      <w:pPr>
+        <w:autoSpaceDE w:val="0"/>
+        <w:autoSpaceDN w:val="0"/>
+        <w:adjustRightInd w:val="0"/>
+        <w:spacing w:after="0" w:line="240" w:lineRule="auto"/>
         <w:rPr>
           <w:rFonts w:ascii="Cascadia Mono" w:hAnsi="Cascadia Mono" w:cs="Cascadia Mono"/>
           <w:color w:val="008000"/>
@@ -6049,8 +6551,7 @@
           <w:highlight w:val="white"/>
           <w:lang w:val="en-IL" w:bidi="he-IL"/>
         </w:rPr>
-        <w:t># This stage is used when running from VS in fast mode (Default for Debug configuration)</w:t>
-      </w:r>
+      </w:pPr>
     </w:p>
     <w:p>
       <w:pPr>
@@ -6076,7 +6577,7 @@
           <w:highlight w:val="white"/>
           <w:lang w:val="en-IL" w:bidi="he-IL"/>
         </w:rPr>
-        <w:t>FROM mcr.microsoft.com/dotnet/aspnet:8.0 AS base</w:t>
+        <w:t># This stage is used when running from VS in fast mode (Default for Debug configuration)</w:t>
       </w:r>
     </w:p>
     <w:p>
@@ -6103,7 +6604,7 @@
           <w:highlight w:val="white"/>
           <w:lang w:val="en-IL" w:bidi="he-IL"/>
         </w:rPr>
-        <w:t>USER root</w:t>
+        <w:t>FROM mcr.microsoft.com/dotnet/aspnet:8.0 AS base</w:t>
       </w:r>
     </w:p>
     <w:p>
@@ -6130,7 +6631,7 @@
           <w:highlight w:val="white"/>
           <w:lang w:val="en-IL" w:bidi="he-IL"/>
         </w:rPr>
-        <w:t>WORKDIR /app</w:t>
+        <w:t>USER root</w:t>
       </w:r>
     </w:p>
     <w:p>
@@ -6157,7 +6658,7 @@
           <w:highlight w:val="white"/>
           <w:lang w:val="en-IL" w:bidi="he-IL"/>
         </w:rPr>
-        <w:t>EXPOSE 8080</w:t>
+        <w:t>WORKDIR /app</w:t>
       </w:r>
     </w:p>
     <w:p>
@@ -6184,7 +6685,7 @@
           <w:highlight w:val="white"/>
           <w:lang w:val="en-IL" w:bidi="he-IL"/>
         </w:rPr>
-        <w:t>EXPOSE 8081</w:t>
+        <w:t>EXPOSE 8080</w:t>
       </w:r>
     </w:p>
     <w:p>
@@ -6202,13 +6703,7 @@
           <w:lang w:val="en-IL" w:bidi="he-IL"/>
         </w:rPr>
       </w:pPr>
-    </w:p>
-    <w:p>
-      <w:pPr>
-        <w:autoSpaceDE w:val="0"/>
-        <w:autoSpaceDN w:val="0"/>
-        <w:adjustRightInd w:val="0"/>
-        <w:spacing w:after="0" w:line="240" w:lineRule="auto"/>
+      <w:r>
         <w:rPr>
           <w:rFonts w:ascii="Cascadia Mono" w:hAnsi="Cascadia Mono" w:cs="Cascadia Mono"/>
           <w:color w:val="008000"/>
@@ -6217,7 +6712,8 @@
           <w:highlight w:val="white"/>
           <w:lang w:val="en-IL" w:bidi="he-IL"/>
         </w:rPr>
-      </w:pPr>
+        <w:t>EXPOSE 8081</w:t>
+      </w:r>
     </w:p>
     <w:p>
       <w:pPr>
@@ -6234,7 +6730,13 @@
           <w:lang w:val="en-IL" w:bidi="he-IL"/>
         </w:rPr>
       </w:pPr>
-      <w:r>
+    </w:p>
+    <w:p>
+      <w:pPr>
+        <w:autoSpaceDE w:val="0"/>
+        <w:autoSpaceDN w:val="0"/>
+        <w:adjustRightInd w:val="0"/>
+        <w:spacing w:after="0" w:line="240" w:lineRule="auto"/>
         <w:rPr>
           <w:rFonts w:ascii="Cascadia Mono" w:hAnsi="Cascadia Mono" w:cs="Cascadia Mono"/>
           <w:color w:val="008000"/>
@@ -6243,8 +6745,7 @@
           <w:highlight w:val="white"/>
           <w:lang w:val="en-IL" w:bidi="he-IL"/>
         </w:rPr>
-        <w:t># This stage is used to build the service project</w:t>
-      </w:r>
+      </w:pPr>
     </w:p>
     <w:p>
       <w:pPr>
@@ -6270,7 +6771,7 @@
           <w:highlight w:val="white"/>
           <w:lang w:val="en-IL" w:bidi="he-IL"/>
         </w:rPr>
-        <w:t>FROM mcr.microsoft.com/dotnet/sdk:8.0 AS build</w:t>
+        <w:t># This stage is used to build the service project</w:t>
       </w:r>
     </w:p>
     <w:p>
@@ -6297,7 +6798,7 @@
           <w:highlight w:val="white"/>
           <w:lang w:val="en-IL" w:bidi="he-IL"/>
         </w:rPr>
-        <w:t>ARG BUILD_CONFIGURATION=Release</w:t>
+        <w:t>FROM mcr.microsoft.com/dotnet/sdk:8.0 AS build</w:t>
       </w:r>
     </w:p>
     <w:p>
@@ -6324,7 +6825,7 @@
           <w:highlight w:val="white"/>
           <w:lang w:val="en-IL" w:bidi="he-IL"/>
         </w:rPr>
-        <w:t>WORKDIR /src</w:t>
+        <w:t>ARG BUILD_CONFIGURATION=Release</w:t>
       </w:r>
     </w:p>
     <w:p>
@@ -6351,15 +6852,10 @@
           <w:highlight w:val="white"/>
           <w:lang w:val="en-IL" w:bidi="he-IL"/>
         </w:rPr>
-        <w:t># Copy the service project file and restore dependencies</w:t>
+        <w:t>WORKDIR /</w:t>
       </w:r>
-    </w:p>
-    <w:p>
-      <w:pPr>
-        <w:autoSpaceDE w:val="0"/>
-        <w:autoSpaceDN w:val="0"/>
-        <w:adjustRightInd w:val="0"/>
-        <w:spacing w:after="0" w:line="240" w:lineRule="auto"/>
+      <w:proofErr w:type="spellStart"/>
+      <w:r>
         <w:rPr>
           <w:rFonts w:ascii="Cascadia Mono" w:hAnsi="Cascadia Mono" w:cs="Cascadia Mono"/>
           <w:color w:val="008000"/>
@@ -6368,8 +6864,16 @@
           <w:highlight w:val="white"/>
           <w:lang w:val="en-IL" w:bidi="he-IL"/>
         </w:rPr>
-      </w:pPr>
-      <w:r>
+        <w:t>src</w:t>
+      </w:r>
+      <w:proofErr w:type="spellEnd"/>
+    </w:p>
+    <w:p>
+      <w:pPr>
+        <w:autoSpaceDE w:val="0"/>
+        <w:autoSpaceDN w:val="0"/>
+        <w:adjustRightInd w:val="0"/>
+        <w:spacing w:after="0" w:line="240" w:lineRule="auto"/>
         <w:rPr>
           <w:rFonts w:ascii="Cascadia Mono" w:hAnsi="Cascadia Mono" w:cs="Cascadia Mono"/>
           <w:color w:val="008000"/>
@@ -6378,15 +6882,8 @@
           <w:highlight w:val="white"/>
           <w:lang w:val="en-IL" w:bidi="he-IL"/>
         </w:rPr>
-        <w:t># COPY ["A2C.CRM.Api/A2C.CRM.Api.csproj", "A2C.CRM.Api/"]</w:t>
-      </w:r>
-    </w:p>
-    <w:p>
-      <w:pPr>
-        <w:autoSpaceDE w:val="0"/>
-        <w:autoSpaceDN w:val="0"/>
-        <w:adjustRightInd w:val="0"/>
-        <w:spacing w:after="0" w:line="240" w:lineRule="auto"/>
+      </w:pPr>
+      <w:r>
         <w:rPr>
           <w:rFonts w:ascii="Cascadia Mono" w:hAnsi="Cascadia Mono" w:cs="Cascadia Mono"/>
           <w:color w:val="008000"/>
@@ -6395,8 +6892,15 @@
           <w:highlight w:val="white"/>
           <w:lang w:val="en-IL" w:bidi="he-IL"/>
         </w:rPr>
-      </w:pPr>
-      <w:r>
+        <w:t># Copy the service project file and restore dependencies</w:t>
+      </w:r>
+    </w:p>
+    <w:p>
+      <w:pPr>
+        <w:autoSpaceDE w:val="0"/>
+        <w:autoSpaceDN w:val="0"/>
+        <w:adjustRightInd w:val="0"/>
+        <w:spacing w:after="0" w:line="240" w:lineRule="auto"/>
         <w:rPr>
           <w:rFonts w:ascii="Cascadia Mono" w:hAnsi="Cascadia Mono" w:cs="Cascadia Mono"/>
           <w:color w:val="008000"/>
@@ -6405,15 +6909,8 @@
           <w:highlight w:val="white"/>
           <w:lang w:val="en-IL" w:bidi="he-IL"/>
         </w:rPr>
-        <w:t>COPY ["A2C.CRM.Api.csproj", "."]</w:t>
-      </w:r>
-    </w:p>
-    <w:p>
-      <w:pPr>
-        <w:autoSpaceDE w:val="0"/>
-        <w:autoSpaceDN w:val="0"/>
-        <w:adjustRightInd w:val="0"/>
-        <w:spacing w:after="0" w:line="240" w:lineRule="auto"/>
+      </w:pPr>
+      <w:r>
         <w:rPr>
           <w:rFonts w:ascii="Cascadia Mono" w:hAnsi="Cascadia Mono" w:cs="Cascadia Mono"/>
           <w:color w:val="008000"/>
@@ -6422,8 +6919,15 @@
           <w:highlight w:val="white"/>
           <w:lang w:val="en-IL" w:bidi="he-IL"/>
         </w:rPr>
-      </w:pPr>
-      <w:r>
+        <w:t># COPY ["A2C.CRM.Api/A2C.CRM.Api.csproj", "A2C.CRM.Api/"]</w:t>
+      </w:r>
+    </w:p>
+    <w:p>
+      <w:pPr>
+        <w:autoSpaceDE w:val="0"/>
+        <w:autoSpaceDN w:val="0"/>
+        <w:adjustRightInd w:val="0"/>
+        <w:spacing w:after="0" w:line="240" w:lineRule="auto"/>
         <w:rPr>
           <w:rFonts w:ascii="Cascadia Mono" w:hAnsi="Cascadia Mono" w:cs="Cascadia Mono"/>
           <w:color w:val="008000"/>
@@ -6432,15 +6936,8 @@
           <w:highlight w:val="white"/>
           <w:lang w:val="en-IL" w:bidi="he-IL"/>
         </w:rPr>
-        <w:t># Restore the dependencies</w:t>
-      </w:r>
-    </w:p>
-    <w:p>
-      <w:pPr>
-        <w:autoSpaceDE w:val="0"/>
-        <w:autoSpaceDN w:val="0"/>
-        <w:adjustRightInd w:val="0"/>
-        <w:spacing w:after="0" w:line="240" w:lineRule="auto"/>
+      </w:pPr>
+      <w:r>
         <w:rPr>
           <w:rFonts w:ascii="Cascadia Mono" w:hAnsi="Cascadia Mono" w:cs="Cascadia Mono"/>
           <w:color w:val="008000"/>
@@ -6449,8 +6946,15 @@
           <w:highlight w:val="white"/>
           <w:lang w:val="en-IL" w:bidi="he-IL"/>
         </w:rPr>
-      </w:pPr>
-      <w:r>
+        <w:t>COPY ["A2C.CRM.Api.csproj", "."]</w:t>
+      </w:r>
+    </w:p>
+    <w:p>
+      <w:pPr>
+        <w:autoSpaceDE w:val="0"/>
+        <w:autoSpaceDN w:val="0"/>
+        <w:adjustRightInd w:val="0"/>
+        <w:spacing w:after="0" w:line="240" w:lineRule="auto"/>
         <w:rPr>
           <w:rFonts w:ascii="Cascadia Mono" w:hAnsi="Cascadia Mono" w:cs="Cascadia Mono"/>
           <w:color w:val="008000"/>
@@ -6459,15 +6963,8 @@
           <w:highlight w:val="white"/>
           <w:lang w:val="en-IL" w:bidi="he-IL"/>
         </w:rPr>
-        <w:t>RUN dotnet restore "./A2C.CRM.Api.csproj"</w:t>
-      </w:r>
-    </w:p>
-    <w:p>
-      <w:pPr>
-        <w:autoSpaceDE w:val="0"/>
-        <w:autoSpaceDN w:val="0"/>
-        <w:adjustRightInd w:val="0"/>
-        <w:spacing w:after="0" w:line="240" w:lineRule="auto"/>
+      </w:pPr>
+      <w:r>
         <w:rPr>
           <w:rFonts w:ascii="Cascadia Mono" w:hAnsi="Cascadia Mono" w:cs="Cascadia Mono"/>
           <w:color w:val="008000"/>
@@ -6476,8 +6973,15 @@
           <w:highlight w:val="white"/>
           <w:lang w:val="en-IL" w:bidi="he-IL"/>
         </w:rPr>
-      </w:pPr>
-      <w:r>
+        <w:t># Restore the dependencies</w:t>
+      </w:r>
+    </w:p>
+    <w:p>
+      <w:pPr>
+        <w:autoSpaceDE w:val="0"/>
+        <w:autoSpaceDN w:val="0"/>
+        <w:adjustRightInd w:val="0"/>
+        <w:spacing w:after="0" w:line="240" w:lineRule="auto"/>
         <w:rPr>
           <w:rFonts w:ascii="Cascadia Mono" w:hAnsi="Cascadia Mono" w:cs="Cascadia Mono"/>
           <w:color w:val="008000"/>
@@ -6486,15 +6990,8 @@
           <w:highlight w:val="white"/>
           <w:lang w:val="en-IL" w:bidi="he-IL"/>
         </w:rPr>
-        <w:t># RUN dotnet restore "./A2C.CRM.Api/A2C.CRM.Api.csproj"</w:t>
-      </w:r>
-    </w:p>
-    <w:p>
-      <w:pPr>
-        <w:autoSpaceDE w:val="0"/>
-        <w:autoSpaceDN w:val="0"/>
-        <w:adjustRightInd w:val="0"/>
-        <w:spacing w:after="0" w:line="240" w:lineRule="auto"/>
+      </w:pPr>
+      <w:r>
         <w:rPr>
           <w:rFonts w:ascii="Cascadia Mono" w:hAnsi="Cascadia Mono" w:cs="Cascadia Mono"/>
           <w:color w:val="008000"/>
@@ -6503,8 +7000,15 @@
           <w:highlight w:val="white"/>
           <w:lang w:val="en-IL" w:bidi="he-IL"/>
         </w:rPr>
-      </w:pPr>
-      <w:r>
+        <w:t>RUN dotnet restore "./A2C.CRM.Api.csproj"</w:t>
+      </w:r>
+    </w:p>
+    <w:p>
+      <w:pPr>
+        <w:autoSpaceDE w:val="0"/>
+        <w:autoSpaceDN w:val="0"/>
+        <w:adjustRightInd w:val="0"/>
+        <w:spacing w:after="0" w:line="240" w:lineRule="auto"/>
         <w:rPr>
           <w:rFonts w:ascii="Cascadia Mono" w:hAnsi="Cascadia Mono" w:cs="Cascadia Mono"/>
           <w:color w:val="008000"/>
@@ -6513,15 +7017,8 @@
           <w:highlight w:val="white"/>
           <w:lang w:val="en-IL" w:bidi="he-IL"/>
         </w:rPr>
-        <w:t>COPY . .</w:t>
-      </w:r>
-    </w:p>
-    <w:p>
-      <w:pPr>
-        <w:autoSpaceDE w:val="0"/>
-        <w:autoSpaceDN w:val="0"/>
-        <w:adjustRightInd w:val="0"/>
-        <w:spacing w:after="0" w:line="240" w:lineRule="auto"/>
+      </w:pPr>
+      <w:r>
         <w:rPr>
           <w:rFonts w:ascii="Cascadia Mono" w:hAnsi="Cascadia Mono" w:cs="Cascadia Mono"/>
           <w:color w:val="008000"/>
@@ -6530,8 +7027,15 @@
           <w:highlight w:val="white"/>
           <w:lang w:val="en-IL" w:bidi="he-IL"/>
         </w:rPr>
-      </w:pPr>
-      <w:r>
+        <w:t># RUN dotnet restore "./A2C.CRM.Api/A2C.CRM.Api.csproj"</w:t>
+      </w:r>
+    </w:p>
+    <w:p>
+      <w:pPr>
+        <w:autoSpaceDE w:val="0"/>
+        <w:autoSpaceDN w:val="0"/>
+        <w:adjustRightInd w:val="0"/>
+        <w:spacing w:after="0" w:line="240" w:lineRule="auto"/>
         <w:rPr>
           <w:rFonts w:ascii="Cascadia Mono" w:hAnsi="Cascadia Mono" w:cs="Cascadia Mono"/>
           <w:color w:val="008000"/>
@@ -6540,15 +7044,9 @@
           <w:highlight w:val="white"/>
           <w:lang w:val="en-IL" w:bidi="he-IL"/>
         </w:rPr>
-        <w:t># WORKDIR "/src/A2C.CRM.Api"</w:t>
-      </w:r>
-    </w:p>
-    <w:p>
-      <w:pPr>
-        <w:autoSpaceDE w:val="0"/>
-        <w:autoSpaceDN w:val="0"/>
-        <w:adjustRightInd w:val="0"/>
-        <w:spacing w:after="0" w:line="240" w:lineRule="auto"/>
+      </w:pPr>
+      <w:proofErr w:type="gramStart"/>
+      <w:r>
         <w:rPr>
           <w:rFonts w:ascii="Cascadia Mono" w:hAnsi="Cascadia Mono" w:cs="Cascadia Mono"/>
           <w:color w:val="008000"/>
@@ -6557,7 +7055,9 @@
           <w:highlight w:val="white"/>
           <w:lang w:val="en-IL" w:bidi="he-IL"/>
         </w:rPr>
-      </w:pPr>
+        <w:t>COPY .</w:t>
+      </w:r>
+      <w:proofErr w:type="gramEnd"/>
       <w:r>
         <w:rPr>
           <w:rFonts w:ascii="Cascadia Mono" w:hAnsi="Cascadia Mono" w:cs="Cascadia Mono"/>
@@ -6567,7 +7067,7 @@
           <w:highlight w:val="white"/>
           <w:lang w:val="en-IL" w:bidi="he-IL"/>
         </w:rPr>
-        <w:t>RUN dotnet build "./A2C.CRM.Api.csproj" -c $BUILD_CONFIGURATION -o /app/build</w:t>
+        <w:t xml:space="preserve"> .</w:t>
       </w:r>
     </w:p>
     <w:p>
@@ -6585,13 +7085,7 @@
           <w:lang w:val="en-IL" w:bidi="he-IL"/>
         </w:rPr>
       </w:pPr>
-    </w:p>
-    <w:p>
-      <w:pPr>
-        <w:autoSpaceDE w:val="0"/>
-        <w:autoSpaceDN w:val="0"/>
-        <w:adjustRightInd w:val="0"/>
-        <w:spacing w:after="0" w:line="240" w:lineRule="auto"/>
+      <w:r>
         <w:rPr>
           <w:rFonts w:ascii="Cascadia Mono" w:hAnsi="Cascadia Mono" w:cs="Cascadia Mono"/>
           <w:color w:val="008000"/>
@@ -6600,7 +7094,9 @@
           <w:highlight w:val="white"/>
           <w:lang w:val="en-IL" w:bidi="he-IL"/>
         </w:rPr>
-      </w:pPr>
+        <w:t># WORKDIR "/</w:t>
+      </w:r>
+      <w:proofErr w:type="spellStart"/>
       <w:r>
         <w:rPr>
           <w:rFonts w:ascii="Cascadia Mono" w:hAnsi="Cascadia Mono" w:cs="Cascadia Mono"/>
@@ -6610,15 +7106,10 @@
           <w:highlight w:val="white"/>
           <w:lang w:val="en-IL" w:bidi="he-IL"/>
         </w:rPr>
-        <w:t># This stage is used to publish the service project to be copied to the final stage</w:t>
+        <w:t>src</w:t>
       </w:r>
-    </w:p>
-    <w:p>
-      <w:pPr>
-        <w:autoSpaceDE w:val="0"/>
-        <w:autoSpaceDN w:val="0"/>
-        <w:adjustRightInd w:val="0"/>
-        <w:spacing w:after="0" w:line="240" w:lineRule="auto"/>
+      <w:proofErr w:type="spellEnd"/>
+      <w:r>
         <w:rPr>
           <w:rFonts w:ascii="Cascadia Mono" w:hAnsi="Cascadia Mono" w:cs="Cascadia Mono"/>
           <w:color w:val="008000"/>
@@ -6627,8 +7118,15 @@
           <w:highlight w:val="white"/>
           <w:lang w:val="en-IL" w:bidi="he-IL"/>
         </w:rPr>
-      </w:pPr>
-      <w:r>
+        <w:t>/A2C.CRM.Api"</w:t>
+      </w:r>
+    </w:p>
+    <w:p>
+      <w:pPr>
+        <w:autoSpaceDE w:val="0"/>
+        <w:autoSpaceDN w:val="0"/>
+        <w:adjustRightInd w:val="0"/>
+        <w:spacing w:after="0" w:line="240" w:lineRule="auto"/>
         <w:rPr>
           <w:rFonts w:ascii="Cascadia Mono" w:hAnsi="Cascadia Mono" w:cs="Cascadia Mono"/>
           <w:color w:val="008000"/>
@@ -6637,15 +7135,8 @@
           <w:highlight w:val="white"/>
           <w:lang w:val="en-IL" w:bidi="he-IL"/>
         </w:rPr>
-        <w:t>FROM build AS publish</w:t>
-      </w:r>
-    </w:p>
-    <w:p>
-      <w:pPr>
-        <w:autoSpaceDE w:val="0"/>
-        <w:autoSpaceDN w:val="0"/>
-        <w:adjustRightInd w:val="0"/>
-        <w:spacing w:after="0" w:line="240" w:lineRule="auto"/>
+      </w:pPr>
+      <w:r>
         <w:rPr>
           <w:rFonts w:ascii="Cascadia Mono" w:hAnsi="Cascadia Mono" w:cs="Cascadia Mono"/>
           <w:color w:val="008000"/>
@@ -6654,8 +7145,15 @@
           <w:highlight w:val="white"/>
           <w:lang w:val="en-IL" w:bidi="he-IL"/>
         </w:rPr>
-      </w:pPr>
-      <w:r>
+        <w:t>RUN dotnet build "./A2C.CRM.Api.csproj" -c $BUILD_CONFIGURATION -o /app/build</w:t>
+      </w:r>
+    </w:p>
+    <w:p>
+      <w:pPr>
+        <w:autoSpaceDE w:val="0"/>
+        <w:autoSpaceDN w:val="0"/>
+        <w:adjustRightInd w:val="0"/>
+        <w:spacing w:after="0" w:line="240" w:lineRule="auto"/>
         <w:rPr>
           <w:rFonts w:ascii="Cascadia Mono" w:hAnsi="Cascadia Mono" w:cs="Cascadia Mono"/>
           <w:color w:val="008000"/>
@@ -6664,8 +7162,7 @@
           <w:highlight w:val="white"/>
           <w:lang w:val="en-IL" w:bidi="he-IL"/>
         </w:rPr>
-        <w:t>ARG BUILD_CONFIGURATION=Release</w:t>
-      </w:r>
+      </w:pPr>
     </w:p>
     <w:p>
       <w:pPr>
@@ -6691,7 +7188,7 @@
           <w:highlight w:val="white"/>
           <w:lang w:val="en-IL" w:bidi="he-IL"/>
         </w:rPr>
-        <w:t>RUN dotnet publish "./A2C.CRM.Api.csproj" -c $BUILD_CONFIGURATION -o /app/publish /p:UseAppHost=false</w:t>
+        <w:t># This stage is used to publish the service project to be copied to the final stage</w:t>
       </w:r>
     </w:p>
     <w:p>
@@ -6709,13 +7206,7 @@
           <w:lang w:val="en-IL" w:bidi="he-IL"/>
         </w:rPr>
       </w:pPr>
-    </w:p>
-    <w:p>
-      <w:pPr>
-        <w:autoSpaceDE w:val="0"/>
-        <w:autoSpaceDN w:val="0"/>
-        <w:adjustRightInd w:val="0"/>
-        <w:spacing w:after="0" w:line="240" w:lineRule="auto"/>
+      <w:r>
         <w:rPr>
           <w:rFonts w:ascii="Cascadia Mono" w:hAnsi="Cascadia Mono" w:cs="Cascadia Mono"/>
           <w:color w:val="008000"/>
@@ -6724,8 +7215,15 @@
           <w:highlight w:val="white"/>
           <w:lang w:val="en-IL" w:bidi="he-IL"/>
         </w:rPr>
-      </w:pPr>
-      <w:r>
+        <w:t>FROM build AS publish</w:t>
+      </w:r>
+    </w:p>
+    <w:p>
+      <w:pPr>
+        <w:autoSpaceDE w:val="0"/>
+        <w:autoSpaceDN w:val="0"/>
+        <w:adjustRightInd w:val="0"/>
+        <w:spacing w:after="0" w:line="240" w:lineRule="auto"/>
         <w:rPr>
           <w:rFonts w:ascii="Cascadia Mono" w:hAnsi="Cascadia Mono" w:cs="Cascadia Mono"/>
           <w:color w:val="008000"/>
@@ -6734,15 +7232,8 @@
           <w:highlight w:val="white"/>
           <w:lang w:val="en-IL" w:bidi="he-IL"/>
         </w:rPr>
-        <w:t># This stage is used in production or when running from VS in regular mode (Default when not using the Debug configuration)</w:t>
-      </w:r>
-    </w:p>
-    <w:p>
-      <w:pPr>
-        <w:autoSpaceDE w:val="0"/>
-        <w:autoSpaceDN w:val="0"/>
-        <w:adjustRightInd w:val="0"/>
-        <w:spacing w:after="0" w:line="240" w:lineRule="auto"/>
+      </w:pPr>
+      <w:r>
         <w:rPr>
           <w:rFonts w:ascii="Cascadia Mono" w:hAnsi="Cascadia Mono" w:cs="Cascadia Mono"/>
           <w:color w:val="008000"/>
@@ -6751,8 +7242,15 @@
           <w:highlight w:val="white"/>
           <w:lang w:val="en-IL" w:bidi="he-IL"/>
         </w:rPr>
-      </w:pPr>
-      <w:r>
+        <w:t>ARG BUILD_CONFIGURATION=Release</w:t>
+      </w:r>
+    </w:p>
+    <w:p>
+      <w:pPr>
+        <w:autoSpaceDE w:val="0"/>
+        <w:autoSpaceDN w:val="0"/>
+        <w:adjustRightInd w:val="0"/>
+        <w:spacing w:after="0" w:line="240" w:lineRule="auto"/>
         <w:rPr>
           <w:rFonts w:ascii="Cascadia Mono" w:hAnsi="Cascadia Mono" w:cs="Cascadia Mono"/>
           <w:color w:val="008000"/>
@@ -6761,15 +7259,8 @@
           <w:highlight w:val="white"/>
           <w:lang w:val="en-IL" w:bidi="he-IL"/>
         </w:rPr>
-        <w:t>FROM base AS final</w:t>
-      </w:r>
-    </w:p>
-    <w:p>
-      <w:pPr>
-        <w:autoSpaceDE w:val="0"/>
-        <w:autoSpaceDN w:val="0"/>
-        <w:adjustRightInd w:val="0"/>
-        <w:spacing w:after="0" w:line="240" w:lineRule="auto"/>
+      </w:pPr>
+      <w:r>
         <w:rPr>
           <w:rFonts w:ascii="Cascadia Mono" w:hAnsi="Cascadia Mono" w:cs="Cascadia Mono"/>
           <w:color w:val="008000"/>
@@ -6778,7 +7269,10 @@
           <w:highlight w:val="white"/>
           <w:lang w:val="en-IL" w:bidi="he-IL"/>
         </w:rPr>
-      </w:pPr>
+        <w:t>RUN dotnet publish "./A2C.CRM.Api.csproj" -c $BUILD_CONFIGURATION -o /app/publish /</w:t>
+      </w:r>
+      <w:proofErr w:type="spellStart"/>
+      <w:proofErr w:type="gramStart"/>
       <w:r>
         <w:rPr>
           <w:rFonts w:ascii="Cascadia Mono" w:hAnsi="Cascadia Mono" w:cs="Cascadia Mono"/>
@@ -6788,15 +7282,11 @@
           <w:highlight w:val="white"/>
           <w:lang w:val="en-IL" w:bidi="he-IL"/>
         </w:rPr>
-        <w:t>WORKDIR /app</w:t>
+        <w:t>p:UseAppHost</w:t>
       </w:r>
-    </w:p>
-    <w:p>
-      <w:pPr>
-        <w:autoSpaceDE w:val="0"/>
-        <w:autoSpaceDN w:val="0"/>
-        <w:adjustRightInd w:val="0"/>
-        <w:spacing w:after="0" w:line="240" w:lineRule="auto"/>
+      <w:proofErr w:type="spellEnd"/>
+      <w:proofErr w:type="gramEnd"/>
+      <w:r>
         <w:rPr>
           <w:rFonts w:ascii="Cascadia Mono" w:hAnsi="Cascadia Mono" w:cs="Cascadia Mono"/>
           <w:color w:val="008000"/>
@@ -6805,8 +7295,15 @@
           <w:highlight w:val="white"/>
           <w:lang w:val="en-IL" w:bidi="he-IL"/>
         </w:rPr>
-      </w:pPr>
-      <w:r>
+        <w:t>=false</w:t>
+      </w:r>
+    </w:p>
+    <w:p>
+      <w:pPr>
+        <w:autoSpaceDE w:val="0"/>
+        <w:autoSpaceDN w:val="0"/>
+        <w:adjustRightInd w:val="0"/>
+        <w:spacing w:after="0" w:line="240" w:lineRule="auto"/>
         <w:rPr>
           <w:rFonts w:ascii="Cascadia Mono" w:hAnsi="Cascadia Mono" w:cs="Cascadia Mono"/>
           <w:color w:val="008000"/>
@@ -6815,9 +7312,129 @@
           <w:highlight w:val="white"/>
           <w:lang w:val="en-IL" w:bidi="he-IL"/>
         </w:rPr>
+      </w:pPr>
+    </w:p>
+    <w:p>
+      <w:pPr>
+        <w:autoSpaceDE w:val="0"/>
+        <w:autoSpaceDN w:val="0"/>
+        <w:adjustRightInd w:val="0"/>
+        <w:spacing w:after="0" w:line="240" w:lineRule="auto"/>
+        <w:rPr>
+          <w:rFonts w:ascii="Cascadia Mono" w:hAnsi="Cascadia Mono" w:cs="Cascadia Mono"/>
+          <w:color w:val="008000"/>
+          <w:sz w:val="19"/>
+          <w:szCs w:val="19"/>
+          <w:highlight w:val="white"/>
+          <w:lang w:val="en-IL" w:bidi="he-IL"/>
+        </w:rPr>
+      </w:pPr>
+      <w:r>
+        <w:rPr>
+          <w:rFonts w:ascii="Cascadia Mono" w:hAnsi="Cascadia Mono" w:cs="Cascadia Mono"/>
+          <w:color w:val="008000"/>
+          <w:sz w:val="19"/>
+          <w:szCs w:val="19"/>
+          <w:highlight w:val="white"/>
+          <w:lang w:val="en-IL" w:bidi="he-IL"/>
+        </w:rPr>
+        <w:t># This stage is used in production or when running from VS in regular mode (Default when not using the Debug configuration)</w:t>
+      </w:r>
+    </w:p>
+    <w:p>
+      <w:pPr>
+        <w:autoSpaceDE w:val="0"/>
+        <w:autoSpaceDN w:val="0"/>
+        <w:adjustRightInd w:val="0"/>
+        <w:spacing w:after="0" w:line="240" w:lineRule="auto"/>
+        <w:rPr>
+          <w:rFonts w:ascii="Cascadia Mono" w:hAnsi="Cascadia Mono" w:cs="Cascadia Mono"/>
+          <w:color w:val="008000"/>
+          <w:sz w:val="19"/>
+          <w:szCs w:val="19"/>
+          <w:highlight w:val="white"/>
+          <w:lang w:val="en-IL" w:bidi="he-IL"/>
+        </w:rPr>
+      </w:pPr>
+      <w:r>
+        <w:rPr>
+          <w:rFonts w:ascii="Cascadia Mono" w:hAnsi="Cascadia Mono" w:cs="Cascadia Mono"/>
+          <w:color w:val="008000"/>
+          <w:sz w:val="19"/>
+          <w:szCs w:val="19"/>
+          <w:highlight w:val="white"/>
+          <w:lang w:val="en-IL" w:bidi="he-IL"/>
+        </w:rPr>
+        <w:t>FROM base AS final</w:t>
+      </w:r>
+    </w:p>
+    <w:p>
+      <w:pPr>
+        <w:autoSpaceDE w:val="0"/>
+        <w:autoSpaceDN w:val="0"/>
+        <w:adjustRightInd w:val="0"/>
+        <w:spacing w:after="0" w:line="240" w:lineRule="auto"/>
+        <w:rPr>
+          <w:rFonts w:ascii="Cascadia Mono" w:hAnsi="Cascadia Mono" w:cs="Cascadia Mono"/>
+          <w:color w:val="008000"/>
+          <w:sz w:val="19"/>
+          <w:szCs w:val="19"/>
+          <w:highlight w:val="white"/>
+          <w:lang w:val="en-IL" w:bidi="he-IL"/>
+        </w:rPr>
+      </w:pPr>
+      <w:r>
+        <w:rPr>
+          <w:rFonts w:ascii="Cascadia Mono" w:hAnsi="Cascadia Mono" w:cs="Cascadia Mono"/>
+          <w:color w:val="008000"/>
+          <w:sz w:val="19"/>
+          <w:szCs w:val="19"/>
+          <w:highlight w:val="white"/>
+          <w:lang w:val="en-IL" w:bidi="he-IL"/>
+        </w:rPr>
+        <w:t>WORKDIR /app</w:t>
+      </w:r>
+    </w:p>
+    <w:p>
+      <w:pPr>
+        <w:autoSpaceDE w:val="0"/>
+        <w:autoSpaceDN w:val="0"/>
+        <w:adjustRightInd w:val="0"/>
+        <w:spacing w:after="0" w:line="240" w:lineRule="auto"/>
+        <w:rPr>
+          <w:rFonts w:ascii="Cascadia Mono" w:hAnsi="Cascadia Mono" w:cs="Cascadia Mono"/>
+          <w:color w:val="008000"/>
+          <w:sz w:val="19"/>
+          <w:szCs w:val="19"/>
+          <w:highlight w:val="white"/>
+          <w:lang w:val="en-IL" w:bidi="he-IL"/>
+        </w:rPr>
+      </w:pPr>
+      <w:r>
+        <w:rPr>
+          <w:rFonts w:ascii="Cascadia Mono" w:hAnsi="Cascadia Mono" w:cs="Cascadia Mono"/>
+          <w:color w:val="008000"/>
+          <w:sz w:val="19"/>
+          <w:szCs w:val="19"/>
+          <w:highlight w:val="white"/>
+          <w:lang w:val="en-IL" w:bidi="he-IL"/>
+        </w:rPr>
         <w:lastRenderedPageBreak/>
-        <w:t>COPY --from=publish /app/publish .</w:t>
+        <w:t>COPY --from=publish /app/</w:t>
       </w:r>
+      <w:proofErr w:type="gramStart"/>
+      <w:r>
+        <w:rPr>
+          <w:rFonts w:ascii="Cascadia Mono" w:hAnsi="Cascadia Mono" w:cs="Cascadia Mono"/>
+          <w:color w:val="008000"/>
+          <w:sz w:val="19"/>
+          <w:szCs w:val="19"/>
+          <w:highlight w:val="white"/>
+          <w:lang w:val="en-IL" w:bidi="he-IL"/>
+        </w:rPr>
+        <w:t>publish .</w:t>
+      </w:r>
+      <w:proofErr w:type="gramEnd"/>
     </w:p>
     <w:p>
       <w:pPr>
@@ -6858,14 +7475,7 @@
           <w:rFonts w:cstheme="majorHAnsi" w:hint="eastAsia"/>
           <w:lang w:eastAsia="ja-JP"/>
         </w:rPr>
-        <w:t>Docker</w:t>
-      </w:r>
-      <w:r>
-        <w:rPr>
-          <w:rFonts w:cstheme="majorHAnsi" w:hint="eastAsia"/>
-          <w:lang w:eastAsia="ja-JP"/>
-        </w:rPr>
-        <w:t>-Compose</w:t>
+        <w:t>Docker-Compose</w:t>
       </w:r>
       <w:bookmarkEnd w:id="22"/>
     </w:p>
@@ -6894,7 +7504,21 @@
         <w:rPr>
           <w:lang w:eastAsia="ja-JP"/>
         </w:rPr>
-        <w:t xml:space="preserve">  api:</w:t>
+        <w:t xml:space="preserve">  </w:t>
+      </w:r>
+      <w:proofErr w:type="spellStart"/>
+      <w:r>
+        <w:rPr>
+          <w:lang w:eastAsia="ja-JP"/>
+        </w:rPr>
+        <w:t>api</w:t>
+      </w:r>
+      <w:proofErr w:type="spellEnd"/>
+      <w:r>
+        <w:rPr>
+          <w:lang w:eastAsia="ja-JP"/>
+        </w:rPr>
+        <w:t>:</w:t>
       </w:r>
     </w:p>
     <w:p>
@@ -6936,8 +7560,30 @@
         <w:rPr>
           <w:lang w:eastAsia="ja-JP"/>
         </w:rPr>
-        <w:t xml:space="preserve">      dockerfile: Dockerfile</w:t>
+        <w:t xml:space="preserve">      </w:t>
       </w:r>
+      <w:proofErr w:type="spellStart"/>
+      <w:r>
+        <w:rPr>
+          <w:lang w:eastAsia="ja-JP"/>
+        </w:rPr>
+        <w:t>dockerfile</w:t>
+      </w:r>
+      <w:proofErr w:type="spellEnd"/>
+      <w:r>
+        <w:rPr>
+          <w:lang w:eastAsia="ja-JP"/>
+        </w:rPr>
+        <w:t xml:space="preserve">: </w:t>
+      </w:r>
+      <w:proofErr w:type="spellStart"/>
+      <w:r>
+        <w:rPr>
+          <w:lang w:eastAsia="ja-JP"/>
+        </w:rPr>
+        <w:t>Dockerfile</w:t>
+      </w:r>
+      <w:proofErr w:type="spellEnd"/>
     </w:p>
     <w:p>
       <w:pPr>
@@ -6978,7 +7624,21 @@
         <w:rPr>
           <w:lang w:eastAsia="ja-JP"/>
         </w:rPr>
-        <w:t xml:space="preserve">    depends_on:</w:t>
+        <w:t xml:space="preserve">    </w:t>
+      </w:r>
+      <w:proofErr w:type="spellStart"/>
+      <w:r>
+        <w:rPr>
+          <w:lang w:eastAsia="ja-JP"/>
+        </w:rPr>
+        <w:t>depends_on</w:t>
+      </w:r>
+      <w:proofErr w:type="spellEnd"/>
+      <w:r>
+        <w:rPr>
+          <w:lang w:eastAsia="ja-JP"/>
+        </w:rPr>
+        <w:t>:</w:t>
       </w:r>
     </w:p>
     <w:p>
@@ -6992,8 +7652,16 @@
         <w:rPr>
           <w:lang w:eastAsia="ja-JP"/>
         </w:rPr>
-        <w:t xml:space="preserve">      - db</w:t>
+        <w:t xml:space="preserve">      - </w:t>
       </w:r>
+      <w:proofErr w:type="spellStart"/>
+      <w:r>
+        <w:rPr>
+          <w:lang w:eastAsia="ja-JP"/>
+        </w:rPr>
+        <w:t>db</w:t>
+      </w:r>
+      <w:proofErr w:type="spellEnd"/>
     </w:p>
     <w:p>
       <w:pPr>
@@ -7020,7 +7688,63 @@
         <w:rPr>
           <w:lang w:eastAsia="ja-JP"/>
         </w:rPr>
-        <w:t xml:space="preserve">      -ConnectionStrings__DefaultConnection=Host=db;Port=5432;Database=a2c_crm;Username=postgres;Password=postgres</w:t>
+        <w:t xml:space="preserve">      -ConnectionStrings__DefaultConnection=Host=</w:t>
+      </w:r>
+      <w:proofErr w:type="gramStart"/>
+      <w:r>
+        <w:rPr>
+          <w:lang w:eastAsia="ja-JP"/>
+        </w:rPr>
+        <w:t>db;Port</w:t>
+      </w:r>
+      <w:proofErr w:type="gramEnd"/>
+      <w:r>
+        <w:rPr>
+          <w:lang w:eastAsia="ja-JP"/>
+        </w:rPr>
+        <w:t>=</w:t>
+      </w:r>
+      <w:proofErr w:type="gramStart"/>
+      <w:r>
+        <w:rPr>
+          <w:lang w:eastAsia="ja-JP"/>
+        </w:rPr>
+        <w:t>5432;Database</w:t>
+      </w:r>
+      <w:proofErr w:type="gramEnd"/>
+      <w:r>
+        <w:rPr>
+          <w:lang w:eastAsia="ja-JP"/>
+        </w:rPr>
+        <w:t>=a2c_</w:t>
+      </w:r>
+      <w:proofErr w:type="gramStart"/>
+      <w:r>
+        <w:rPr>
+          <w:lang w:eastAsia="ja-JP"/>
+        </w:rPr>
+        <w:t>crm;Username</w:t>
+      </w:r>
+      <w:proofErr w:type="gramEnd"/>
+      <w:r>
+        <w:rPr>
+          <w:lang w:eastAsia="ja-JP"/>
+        </w:rPr>
+        <w:t>=</w:t>
+      </w:r>
+      <w:proofErr w:type="gramStart"/>
+      <w:r>
+        <w:rPr>
+          <w:lang w:eastAsia="ja-JP"/>
+        </w:rPr>
+        <w:t>postgres;Password</w:t>
+      </w:r>
+      <w:proofErr w:type="gramEnd"/>
+      <w:r>
+        <w:rPr>
+          <w:lang w:eastAsia="ja-JP"/>
+        </w:rPr>
+        <w:t>=postgres</w:t>
       </w:r>
     </w:p>
     <w:p>
@@ -7034,7 +7758,21 @@
         <w:rPr>
           <w:lang w:eastAsia="ja-JP"/>
         </w:rPr>
-        <w:t xml:space="preserve">  db:</w:t>
+        <w:t xml:space="preserve">  </w:t>
+      </w:r>
+      <w:proofErr w:type="spellStart"/>
+      <w:r>
+        <w:rPr>
+          <w:lang w:eastAsia="ja-JP"/>
+        </w:rPr>
+        <w:t>db</w:t>
+      </w:r>
+      <w:proofErr w:type="spellEnd"/>
+      <w:r>
+        <w:rPr>
+          <w:lang w:eastAsia="ja-JP"/>
+        </w:rPr>
+        <w:t>:</w:t>
       </w:r>
     </w:p>
     <w:p>
@@ -7104,8 +7842,16 @@
         <w:rPr>
           <w:lang w:eastAsia="ja-JP"/>
         </w:rPr>
-        <w:t xml:space="preserve">      POSTGRES_USER: postgres</w:t>
+        <w:t xml:space="preserve">      POSTGRES_USER: </w:t>
       </w:r>
+      <w:proofErr w:type="spellStart"/>
+      <w:r>
+        <w:rPr>
+          <w:lang w:eastAsia="ja-JP"/>
+        </w:rPr>
+        <w:t>postgres</w:t>
+      </w:r>
+      <w:proofErr w:type="spellEnd"/>
     </w:p>
     <w:p>
       <w:pPr>
@@ -7118,8 +7864,16 @@
         <w:rPr>
           <w:lang w:eastAsia="ja-JP"/>
         </w:rPr>
-        <w:t xml:space="preserve">      POSTGRES_PASSWORD: postgres</w:t>
+        <w:t xml:space="preserve">      POSTGRES_PASSWORD: </w:t>
       </w:r>
+      <w:proofErr w:type="spellStart"/>
+      <w:r>
+        <w:rPr>
+          <w:lang w:eastAsia="ja-JP"/>
+        </w:rPr>
+        <w:t>postgres</w:t>
+      </w:r>
+      <w:proofErr w:type="spellEnd"/>
     </w:p>
     <w:p>
       <w:pPr>
@@ -7174,7 +7928,35 @@
         <w:rPr>
           <w:lang w:eastAsia="ja-JP"/>
         </w:rPr>
-        <w:t xml:space="preserve">      - pgdata:/var/lib/postgresql/data</w:t>
+        <w:t xml:space="preserve">      - </w:t>
+      </w:r>
+      <w:proofErr w:type="spellStart"/>
+      <w:r>
+        <w:rPr>
+          <w:lang w:eastAsia="ja-JP"/>
+        </w:rPr>
+        <w:t>pgdata</w:t>
+      </w:r>
+      <w:proofErr w:type="spellEnd"/>
+      <w:r>
+        <w:rPr>
+          <w:lang w:eastAsia="ja-JP"/>
+        </w:rPr>
+        <w:t>:/var/lib/</w:t>
+      </w:r>
+      <w:proofErr w:type="spellStart"/>
+      <w:r>
+        <w:rPr>
+          <w:lang w:eastAsia="ja-JP"/>
+        </w:rPr>
+        <w:t>postgresql</w:t>
+      </w:r>
+      <w:proofErr w:type="spellEnd"/>
+      <w:r>
+        <w:rPr>
+          <w:lang w:eastAsia="ja-JP"/>
+        </w:rPr>
+        <w:t>/data</w:t>
       </w:r>
     </w:p>
     <w:p>
@@ -7202,7 +7984,21 @@
         <w:rPr>
           <w:lang w:eastAsia="ja-JP"/>
         </w:rPr>
-        <w:t xml:space="preserve">  pgdata:</w:t>
+        <w:t xml:space="preserve">  </w:t>
+      </w:r>
+      <w:proofErr w:type="spellStart"/>
+      <w:r>
+        <w:rPr>
+          <w:lang w:eastAsia="ja-JP"/>
+        </w:rPr>
+        <w:t>pgdata</w:t>
+      </w:r>
+      <w:proofErr w:type="spellEnd"/>
+      <w:r>
+        <w:rPr>
+          <w:lang w:eastAsia="ja-JP"/>
+        </w:rPr>
+        <w:t>:</w:t>
       </w:r>
     </w:p>
     <w:p>
@@ -7230,7 +8026,21 @@
         <w:rPr>
           <w:lang w:eastAsia="ja-JP"/>
         </w:rPr>
-        <w:t xml:space="preserve">  api:</w:t>
+        <w:t xml:space="preserve">  </w:t>
+      </w:r>
+      <w:proofErr w:type="spellStart"/>
+      <w:r>
+        <w:rPr>
+          <w:lang w:eastAsia="ja-JP"/>
+        </w:rPr>
+        <w:t>api</w:t>
+      </w:r>
+      <w:proofErr w:type="spellEnd"/>
+      <w:r>
+        <w:rPr>
+          <w:lang w:eastAsia="ja-JP"/>
+        </w:rPr>
+        <w:t>:</w:t>
       </w:r>
     </w:p>
     <w:p>
@@ -7272,8 +8082,30 @@
         <w:rPr>
           <w:lang w:eastAsia="ja-JP"/>
         </w:rPr>
-        <w:t xml:space="preserve">      dockerfile: Dockerfile</w:t>
+        <w:t xml:space="preserve">      </w:t>
       </w:r>
+      <w:proofErr w:type="spellStart"/>
+      <w:r>
+        <w:rPr>
+          <w:lang w:eastAsia="ja-JP"/>
+        </w:rPr>
+        <w:t>dockerfile</w:t>
+      </w:r>
+      <w:proofErr w:type="spellEnd"/>
+      <w:r>
+        <w:rPr>
+          <w:lang w:eastAsia="ja-JP"/>
+        </w:rPr>
+        <w:t xml:space="preserve">: </w:t>
+      </w:r>
+      <w:proofErr w:type="spellStart"/>
+      <w:r>
+        <w:rPr>
+          <w:lang w:eastAsia="ja-JP"/>
+        </w:rPr>
+        <w:t>Dockerfile</w:t>
+      </w:r>
+      <w:proofErr w:type="spellEnd"/>
     </w:p>
     <w:p>
       <w:pPr>
@@ -7314,7 +8146,21 @@
         <w:rPr>
           <w:lang w:eastAsia="ja-JP"/>
         </w:rPr>
-        <w:t xml:space="preserve">    depends_on:</w:t>
+        <w:t xml:space="preserve">    </w:t>
+      </w:r>
+      <w:proofErr w:type="spellStart"/>
+      <w:r>
+        <w:rPr>
+          <w:lang w:eastAsia="ja-JP"/>
+        </w:rPr>
+        <w:t>depends_on</w:t>
+      </w:r>
+      <w:proofErr w:type="spellEnd"/>
+      <w:r>
+        <w:rPr>
+          <w:lang w:eastAsia="ja-JP"/>
+        </w:rPr>
+        <w:t>:</w:t>
       </w:r>
     </w:p>
     <w:p>
@@ -7328,8 +8174,16 @@
         <w:rPr>
           <w:lang w:eastAsia="ja-JP"/>
         </w:rPr>
-        <w:t xml:space="preserve">      - db</w:t>
+        <w:t xml:space="preserve">      - </w:t>
       </w:r>
+      <w:proofErr w:type="spellStart"/>
+      <w:r>
+        <w:rPr>
+          <w:lang w:eastAsia="ja-JP"/>
+        </w:rPr>
+        <w:t>db</w:t>
+      </w:r>
+      <w:proofErr w:type="spellEnd"/>
     </w:p>
     <w:p>
       <w:pPr>
@@ -7356,7 +8210,63 @@
         <w:rPr>
           <w:lang w:eastAsia="ja-JP"/>
         </w:rPr>
-        <w:t xml:space="preserve">      - ConnectionStrings__DefaultConnection=Host=db;Port=5432;Database=a2c_crm;Username=postgres;Password=postgres</w:t>
+        <w:t xml:space="preserve">      - ConnectionStrings__DefaultConnection=Host=</w:t>
+      </w:r>
+      <w:proofErr w:type="gramStart"/>
+      <w:r>
+        <w:rPr>
+          <w:lang w:eastAsia="ja-JP"/>
+        </w:rPr>
+        <w:t>db;Port</w:t>
+      </w:r>
+      <w:proofErr w:type="gramEnd"/>
+      <w:r>
+        <w:rPr>
+          <w:lang w:eastAsia="ja-JP"/>
+        </w:rPr>
+        <w:t>=</w:t>
+      </w:r>
+      <w:proofErr w:type="gramStart"/>
+      <w:r>
+        <w:rPr>
+          <w:lang w:eastAsia="ja-JP"/>
+        </w:rPr>
+        <w:t>5432;Database</w:t>
+      </w:r>
+      <w:proofErr w:type="gramEnd"/>
+      <w:r>
+        <w:rPr>
+          <w:lang w:eastAsia="ja-JP"/>
+        </w:rPr>
+        <w:t>=a2c_</w:t>
+      </w:r>
+      <w:proofErr w:type="gramStart"/>
+      <w:r>
+        <w:rPr>
+          <w:lang w:eastAsia="ja-JP"/>
+        </w:rPr>
+        <w:t>crm;Username</w:t>
+      </w:r>
+      <w:proofErr w:type="gramEnd"/>
+      <w:r>
+        <w:rPr>
+          <w:lang w:eastAsia="ja-JP"/>
+        </w:rPr>
+        <w:t>=</w:t>
+      </w:r>
+      <w:proofErr w:type="gramStart"/>
+      <w:r>
+        <w:rPr>
+          <w:lang w:eastAsia="ja-JP"/>
+        </w:rPr>
+        <w:t>postgres;Password</w:t>
+      </w:r>
+      <w:proofErr w:type="gramEnd"/>
+      <w:r>
+        <w:rPr>
+          <w:lang w:eastAsia="ja-JP"/>
+        </w:rPr>
+        <w:t>=postgres</w:t>
       </w:r>
     </w:p>
     <w:p>
@@ -7378,7 +8288,21 @@
         <w:rPr>
           <w:lang w:eastAsia="ja-JP"/>
         </w:rPr>
-        <w:t xml:space="preserve">  db:</w:t>
+        <w:t xml:space="preserve">  </w:t>
+      </w:r>
+      <w:proofErr w:type="spellStart"/>
+      <w:r>
+        <w:rPr>
+          <w:lang w:eastAsia="ja-JP"/>
+        </w:rPr>
+        <w:t>db</w:t>
+      </w:r>
+      <w:proofErr w:type="spellEnd"/>
+      <w:r>
+        <w:rPr>
+          <w:lang w:eastAsia="ja-JP"/>
+        </w:rPr>
+        <w:t>:</w:t>
       </w:r>
     </w:p>
     <w:p>
@@ -7448,8 +8372,16 @@
         <w:rPr>
           <w:lang w:eastAsia="ja-JP"/>
         </w:rPr>
-        <w:t xml:space="preserve">      POSTGRES_USER: postgres</w:t>
+        <w:t xml:space="preserve">      POSTGRES_USER: </w:t>
       </w:r>
+      <w:proofErr w:type="spellStart"/>
+      <w:r>
+        <w:rPr>
+          <w:lang w:eastAsia="ja-JP"/>
+        </w:rPr>
+        <w:t>postgres</w:t>
+      </w:r>
+      <w:proofErr w:type="spellEnd"/>
     </w:p>
     <w:p>
       <w:pPr>
@@ -7462,8 +8394,16 @@
         <w:rPr>
           <w:lang w:eastAsia="ja-JP"/>
         </w:rPr>
-        <w:t xml:space="preserve">      POSTGRES_PASSWORD: postgres</w:t>
+        <w:t xml:space="preserve">      POSTGRES_PASSWORD: </w:t>
       </w:r>
+      <w:proofErr w:type="spellStart"/>
+      <w:r>
+        <w:rPr>
+          <w:lang w:eastAsia="ja-JP"/>
+        </w:rPr>
+        <w:t>postgres</w:t>
+      </w:r>
+      <w:proofErr w:type="spellEnd"/>
     </w:p>
     <w:p>
       <w:pPr>
@@ -7518,7 +8458,35 @@
         <w:rPr>
           <w:lang w:eastAsia="ja-JP"/>
         </w:rPr>
-        <w:t xml:space="preserve">      - pgdata:/var/lib/postgresql/data</w:t>
+        <w:t xml:space="preserve">      - </w:t>
+      </w:r>
+      <w:proofErr w:type="spellStart"/>
+      <w:r>
+        <w:rPr>
+          <w:lang w:eastAsia="ja-JP"/>
+        </w:rPr>
+        <w:t>pgdata</w:t>
+      </w:r>
+      <w:proofErr w:type="spellEnd"/>
+      <w:r>
+        <w:rPr>
+          <w:lang w:eastAsia="ja-JP"/>
+        </w:rPr>
+        <w:t>:/var/lib/</w:t>
+      </w:r>
+      <w:proofErr w:type="spellStart"/>
+      <w:r>
+        <w:rPr>
+          <w:lang w:eastAsia="ja-JP"/>
+        </w:rPr>
+        <w:t>postgresql</w:t>
+      </w:r>
+      <w:proofErr w:type="spellEnd"/>
+      <w:r>
+        <w:rPr>
+          <w:lang w:eastAsia="ja-JP"/>
+        </w:rPr>
+        <w:t>/data</w:t>
       </w:r>
     </w:p>
     <w:p>
@@ -7546,7 +8514,21 @@
         <w:rPr>
           <w:lang w:eastAsia="ja-JP"/>
         </w:rPr>
-        <w:t xml:space="preserve">  pgdata:</w:t>
+        <w:t xml:space="preserve">  </w:t>
+      </w:r>
+      <w:proofErr w:type="spellStart"/>
+      <w:r>
+        <w:rPr>
+          <w:lang w:eastAsia="ja-JP"/>
+        </w:rPr>
+        <w:t>pgdata</w:t>
+      </w:r>
+      <w:proofErr w:type="spellEnd"/>
+      <w:r>
+        <w:rPr>
+          <w:lang w:eastAsia="ja-JP"/>
+        </w:rPr>
+        <w:t>:</w:t>
       </w:r>
     </w:p>
     <w:sectPr>
@@ -7831,7 +8813,7 @@
         <w:ind w:left="360" w:hanging="360"/>
       </w:pPr>
     </w:lvl>
-    <w:lvl w:ilvl="1" w:tplc="20000019" w:tentative="1">
+    <w:lvl w:ilvl="1" w:tplc="20000019">
       <w:start w:val="1"/>
       <w:numFmt w:val="lowerLetter"/>
       <w:lvlText w:val="%2."/>
@@ -7840,7 +8822,7 @@
         <w:ind w:left="1080" w:hanging="360"/>
       </w:pPr>
     </w:lvl>
-    <w:lvl w:ilvl="2" w:tplc="2000001B" w:tentative="1">
+    <w:lvl w:ilvl="2" w:tplc="2000001B">
       <w:start w:val="1"/>
       <w:numFmt w:val="lowerRoman"/>
       <w:lvlText w:val="%3."/>
@@ -7849,7 +8831,7 @@
         <w:ind w:left="1800" w:hanging="180"/>
       </w:pPr>
     </w:lvl>
-    <w:lvl w:ilvl="3" w:tplc="2000000F" w:tentative="1">
+    <w:lvl w:ilvl="3" w:tplc="2000000F">
       <w:start w:val="1"/>
       <w:numFmt w:val="decimal"/>
       <w:lvlText w:val="%4."/>
@@ -7905,6 +8887,119 @@
     </w:lvl>
   </w:abstractNum>
   <w:abstractNum w:abstractNumId="11" w15:restartNumberingAfterBreak="0">
+    <w:nsid w:val="13F840EE"/>
+    <w:multiLevelType w:val="multilevel"/>
+    <w:tmpl w:val="496AC672"/>
+    <w:lvl w:ilvl="0">
+      <w:start w:val="1"/>
+      <w:numFmt w:val="decimal"/>
+      <w:lvlText w:val="%1."/>
+      <w:lvlJc w:val="left"/>
+      <w:pPr>
+        <w:ind w:left="360" w:hanging="360"/>
+      </w:pPr>
+      <w:rPr>
+        <w:rFonts w:hint="default"/>
+      </w:rPr>
+    </w:lvl>
+    <w:lvl w:ilvl="1">
+      <w:start w:val="4"/>
+      <w:numFmt w:val="decimal"/>
+      <w:lvlText w:val="%1.%2."/>
+      <w:lvlJc w:val="left"/>
+      <w:pPr>
+        <w:ind w:left="792" w:hanging="432"/>
+      </w:pPr>
+      <w:rPr>
+        <w:rFonts w:hint="default"/>
+      </w:rPr>
+    </w:lvl>
+    <w:lvl w:ilvl="2">
+      <w:start w:val="1"/>
+      <w:numFmt w:val="decimal"/>
+      <w:lvlText w:val="%1.%2.%3."/>
+      <w:lvlJc w:val="left"/>
+      <w:pPr>
+        <w:ind w:left="1224" w:hanging="504"/>
+      </w:pPr>
+      <w:rPr>
+        <w:rFonts w:hint="default"/>
+      </w:rPr>
+    </w:lvl>
+    <w:lvl w:ilvl="3">
+      <w:start w:val="1"/>
+      <w:numFmt w:val="decimal"/>
+      <w:lvlText w:val="%1.%2.%3.%4."/>
+      <w:lvlJc w:val="left"/>
+      <w:pPr>
+        <w:ind w:left="1728" w:hanging="648"/>
+      </w:pPr>
+      <w:rPr>
+        <w:rFonts w:hint="default"/>
+      </w:rPr>
+    </w:lvl>
+    <w:lvl w:ilvl="4">
+      <w:start w:val="1"/>
+      <w:numFmt w:val="decimal"/>
+      <w:lvlText w:val="%1.%2.%3.%4.%5."/>
+      <w:lvlJc w:val="left"/>
+      <w:pPr>
+        <w:ind w:left="2232" w:hanging="792"/>
+      </w:pPr>
+      <w:rPr>
+        <w:rFonts w:hint="default"/>
+      </w:rPr>
+    </w:lvl>
+    <w:lvl w:ilvl="5">
+      <w:start w:val="1"/>
+      <w:numFmt w:val="decimal"/>
+      <w:lvlText w:val="%1.%2.%3.%4.%5.%6."/>
+      <w:lvlJc w:val="left"/>
+      <w:pPr>
+        <w:ind w:left="2736" w:hanging="936"/>
+      </w:pPr>
+      <w:rPr>
+        <w:rFonts w:hint="default"/>
+      </w:rPr>
+    </w:lvl>
+    <w:lvl w:ilvl="6">
+      <w:start w:val="1"/>
+      <w:numFmt w:val="decimal"/>
+      <w:lvlText w:val="%1.%2.%3.%4.%5.%6.%7."/>
+      <w:lvlJc w:val="left"/>
+      <w:pPr>
+        <w:ind w:left="3240" w:hanging="1080"/>
+      </w:pPr>
+      <w:rPr>
+        <w:rFonts w:hint="default"/>
+      </w:rPr>
+    </w:lvl>
+    <w:lvl w:ilvl="7">
+      <w:start w:val="1"/>
+      <w:numFmt w:val="decimal"/>
+      <w:lvlText w:val="%1.%2.%3.%4.%5.%6.%7.%8."/>
+      <w:lvlJc w:val="left"/>
+      <w:pPr>
+        <w:ind w:left="3744" w:hanging="1224"/>
+      </w:pPr>
+      <w:rPr>
+        <w:rFonts w:hint="default"/>
+      </w:rPr>
+    </w:lvl>
+    <w:lvl w:ilvl="8">
+      <w:start w:val="1"/>
+      <w:numFmt w:val="decimal"/>
+      <w:lvlText w:val="%1.%2.%3.%4.%5.%6.%7.%8.%9."/>
+      <w:lvlJc w:val="left"/>
+      <w:pPr>
+        <w:ind w:left="4320" w:hanging="1440"/>
+      </w:pPr>
+      <w:rPr>
+        <w:rFonts w:hint="default"/>
+      </w:rPr>
+    </w:lvl>
+  </w:abstractNum>
+  <w:abstractNum w:abstractNumId="12" w15:restartNumberingAfterBreak="0">
     <w:nsid w:val="2BA50148"/>
     <w:multiLevelType w:val="multilevel"/>
     <w:tmpl w:val="C1ECFEEE"/>
@@ -8053,7 +9148,93 @@
       </w:rPr>
     </w:lvl>
   </w:abstractNum>
-  <w:abstractNum w:abstractNumId="12" w15:restartNumberingAfterBreak="0">
+  <w:abstractNum w:abstractNumId="13" w15:restartNumberingAfterBreak="0">
+    <w:nsid w:val="3F6E257F"/>
+    <w:multiLevelType w:val="multilevel"/>
+    <w:tmpl w:val="2000001F"/>
+    <w:lvl w:ilvl="0">
+      <w:start w:val="1"/>
+      <w:numFmt w:val="decimal"/>
+      <w:lvlText w:val="%1."/>
+      <w:lvlJc w:val="left"/>
+      <w:pPr>
+        <w:ind w:left="360" w:hanging="360"/>
+      </w:pPr>
+    </w:lvl>
+    <w:lvl w:ilvl="1">
+      <w:start w:val="1"/>
+      <w:numFmt w:val="decimal"/>
+      <w:lvlText w:val="%1.%2."/>
+      <w:lvlJc w:val="left"/>
+      <w:pPr>
+        <w:ind w:left="792" w:hanging="432"/>
+      </w:pPr>
+    </w:lvl>
+    <w:lvl w:ilvl="2">
+      <w:start w:val="1"/>
+      <w:numFmt w:val="decimal"/>
+      <w:lvlText w:val="%1.%2.%3."/>
+      <w:lvlJc w:val="left"/>
+      <w:pPr>
+        <w:ind w:left="1224" w:hanging="504"/>
+      </w:pPr>
+    </w:lvl>
+    <w:lvl w:ilvl="3">
+      <w:start w:val="1"/>
+      <w:numFmt w:val="decimal"/>
+      <w:lvlText w:val="%1.%2.%3.%4."/>
+      <w:lvlJc w:val="left"/>
+      <w:pPr>
+        <w:ind w:left="1728" w:hanging="648"/>
+      </w:pPr>
+    </w:lvl>
+    <w:lvl w:ilvl="4">
+      <w:start w:val="1"/>
+      <w:numFmt w:val="decimal"/>
+      <w:lvlText w:val="%1.%2.%3.%4.%5."/>
+      <w:lvlJc w:val="left"/>
+      <w:pPr>
+        <w:ind w:left="2232" w:hanging="792"/>
+      </w:pPr>
+    </w:lvl>
+    <w:lvl w:ilvl="5">
+      <w:start w:val="1"/>
+      <w:numFmt w:val="decimal"/>
+      <w:lvlText w:val="%1.%2.%3.%4.%5.%6."/>
+      <w:lvlJc w:val="left"/>
+      <w:pPr>
+        <w:ind w:left="2736" w:hanging="936"/>
+      </w:pPr>
+    </w:lvl>
+    <w:lvl w:ilvl="6">
+      <w:start w:val="1"/>
+      <w:numFmt w:val="decimal"/>
+      <w:lvlText w:val="%1.%2.%3.%4.%5.%6.%7."/>
+      <w:lvlJc w:val="left"/>
+      <w:pPr>
+        <w:ind w:left="3240" w:hanging="1080"/>
+      </w:pPr>
+    </w:lvl>
+    <w:lvl w:ilvl="7">
+      <w:start w:val="1"/>
+      <w:numFmt w:val="decimal"/>
+      <w:lvlText w:val="%1.%2.%3.%4.%5.%6.%7.%8."/>
+      <w:lvlJc w:val="left"/>
+      <w:pPr>
+        <w:ind w:left="3744" w:hanging="1224"/>
+      </w:pPr>
+    </w:lvl>
+    <w:lvl w:ilvl="8">
+      <w:start w:val="1"/>
+      <w:numFmt w:val="decimal"/>
+      <w:lvlText w:val="%1.%2.%3.%4.%5.%6.%7.%8.%9."/>
+      <w:lvlJc w:val="left"/>
+      <w:pPr>
+        <w:ind w:left="4320" w:hanging="1440"/>
+      </w:pPr>
+    </w:lvl>
+  </w:abstractNum>
+  <w:abstractNum w:abstractNumId="14" w15:restartNumberingAfterBreak="0">
     <w:nsid w:val="576512A2"/>
     <w:multiLevelType w:val="hybridMultilevel"/>
     <w:tmpl w:val="F698C838"/>
@@ -8139,7 +9320,102 @@
       </w:pPr>
     </w:lvl>
   </w:abstractNum>
-  <w:abstractNum w:abstractNumId="13" w15:restartNumberingAfterBreak="0">
+  <w:abstractNum w:abstractNumId="15" w15:restartNumberingAfterBreak="0">
+    <w:nsid w:val="5F760D8B"/>
+    <w:multiLevelType w:val="multilevel"/>
+    <w:tmpl w:val="20000025"/>
+    <w:lvl w:ilvl="0">
+      <w:start w:val="1"/>
+      <w:numFmt w:val="decimal"/>
+      <w:pStyle w:val="Heading1"/>
+      <w:lvlText w:val="%1"/>
+      <w:lvlJc w:val="left"/>
+      <w:pPr>
+        <w:ind w:left="432" w:hanging="432"/>
+      </w:pPr>
+    </w:lvl>
+    <w:lvl w:ilvl="1">
+      <w:start w:val="1"/>
+      <w:numFmt w:val="decimal"/>
+      <w:pStyle w:val="Heading2"/>
+      <w:lvlText w:val="%1.%2"/>
+      <w:lvlJc w:val="left"/>
+      <w:pPr>
+        <w:ind w:left="576" w:hanging="576"/>
+      </w:pPr>
+    </w:lvl>
+    <w:lvl w:ilvl="2">
+      <w:start w:val="1"/>
+      <w:numFmt w:val="decimal"/>
+      <w:pStyle w:val="Heading3"/>
+      <w:lvlText w:val="%1.%2.%3"/>
+      <w:lvlJc w:val="left"/>
+      <w:pPr>
+        <w:ind w:left="720" w:hanging="720"/>
+      </w:pPr>
+    </w:lvl>
+    <w:lvl w:ilvl="3">
+      <w:start w:val="1"/>
+      <w:numFmt w:val="decimal"/>
+      <w:pStyle w:val="Heading4"/>
+      <w:lvlText w:val="%1.%2.%3.%4"/>
+      <w:lvlJc w:val="left"/>
+      <w:pPr>
+        <w:ind w:left="864" w:hanging="864"/>
+      </w:pPr>
+    </w:lvl>
+    <w:lvl w:ilvl="4">
+      <w:start w:val="1"/>
+      <w:numFmt w:val="decimal"/>
+      <w:pStyle w:val="Heading5"/>
+      <w:lvlText w:val="%1.%2.%3.%4.%5"/>
+      <w:lvlJc w:val="left"/>
+      <w:pPr>
+        <w:ind w:left="1008" w:hanging="1008"/>
+      </w:pPr>
+    </w:lvl>
+    <w:lvl w:ilvl="5">
+      <w:start w:val="1"/>
+      <w:numFmt w:val="decimal"/>
+      <w:pStyle w:val="Heading6"/>
+      <w:lvlText w:val="%1.%2.%3.%4.%5.%6"/>
+      <w:lvlJc w:val="left"/>
+      <w:pPr>
+        <w:ind w:left="1152" w:hanging="1152"/>
+      </w:pPr>
+    </w:lvl>
+    <w:lvl w:ilvl="6">
+      <w:start w:val="1"/>
+      <w:numFmt w:val="decimal"/>
+      <w:pStyle w:val="Heading7"/>
+      <w:lvlText w:val="%1.%2.%3.%4.%5.%6.%7"/>
+      <w:lvlJc w:val="left"/>
+      <w:pPr>
+        <w:ind w:left="1296" w:hanging="1296"/>
+      </w:pPr>
+    </w:lvl>
+    <w:lvl w:ilvl="7">
+      <w:start w:val="1"/>
+      <w:numFmt w:val="decimal"/>
+      <w:pStyle w:val="Heading8"/>
+      <w:lvlText w:val="%1.%2.%3.%4.%5.%6.%7.%8"/>
+      <w:lvlJc w:val="left"/>
+      <w:pPr>
+        <w:ind w:left="1440" w:hanging="1440"/>
+      </w:pPr>
+    </w:lvl>
+    <w:lvl w:ilvl="8">
+      <w:start w:val="1"/>
+      <w:numFmt w:val="decimal"/>
+      <w:pStyle w:val="Heading9"/>
+      <w:lvlText w:val="%1.%2.%3.%4.%5.%6.%7.%8.%9"/>
+      <w:lvlJc w:val="left"/>
+      <w:pPr>
+        <w:ind w:left="1584" w:hanging="1584"/>
+      </w:pPr>
+    </w:lvl>
+  </w:abstractNum>
+  <w:abstractNum w:abstractNumId="16" w15:restartNumberingAfterBreak="0">
     <w:nsid w:val="629F34BC"/>
     <w:multiLevelType w:val="hybridMultilevel"/>
     <w:tmpl w:val="7EFE595E"/>
@@ -8228,7 +9504,7 @@
       </w:pPr>
     </w:lvl>
   </w:abstractNum>
-  <w:abstractNum w:abstractNumId="14" w15:restartNumberingAfterBreak="0">
+  <w:abstractNum w:abstractNumId="17" w15:restartNumberingAfterBreak="0">
     <w:nsid w:val="69257353"/>
     <w:multiLevelType w:val="hybridMultilevel"/>
     <w:tmpl w:val="C81C7102"/>
@@ -8315,6 +9591,119 @@
       <w:pPr>
         <w:ind w:left="6120" w:hanging="180"/>
       </w:pPr>
+    </w:lvl>
+  </w:abstractNum>
+  <w:abstractNum w:abstractNumId="18" w15:restartNumberingAfterBreak="0">
+    <w:nsid w:val="7DE47603"/>
+    <w:multiLevelType w:val="multilevel"/>
+    <w:tmpl w:val="ACB883CC"/>
+    <w:lvl w:ilvl="0">
+      <w:start w:val="1"/>
+      <w:numFmt w:val="decimal"/>
+      <w:lvlText w:val="%1."/>
+      <w:lvlJc w:val="left"/>
+      <w:pPr>
+        <w:ind w:left="360" w:hanging="360"/>
+      </w:pPr>
+      <w:rPr>
+        <w:rFonts w:hint="default"/>
+      </w:rPr>
+    </w:lvl>
+    <w:lvl w:ilvl="1">
+      <w:start w:val="4"/>
+      <w:numFmt w:val="none"/>
+      <w:lvlText w:val="4.2."/>
+      <w:lvlJc w:val="left"/>
+      <w:pPr>
+        <w:ind w:left="792" w:hanging="432"/>
+      </w:pPr>
+      <w:rPr>
+        <w:rFonts w:hint="default"/>
+      </w:rPr>
+    </w:lvl>
+    <w:lvl w:ilvl="2">
+      <w:start w:val="1"/>
+      <w:numFmt w:val="decimal"/>
+      <w:lvlText w:val="%1.%2.%3."/>
+      <w:lvlJc w:val="left"/>
+      <w:pPr>
+        <w:ind w:left="1224" w:hanging="504"/>
+      </w:pPr>
+      <w:rPr>
+        <w:rFonts w:hint="default"/>
+      </w:rPr>
+    </w:lvl>
+    <w:lvl w:ilvl="3">
+      <w:start w:val="1"/>
+      <w:numFmt w:val="decimal"/>
+      <w:lvlText w:val="%1.%2.%3.%4."/>
+      <w:lvlJc w:val="left"/>
+      <w:pPr>
+        <w:ind w:left="1728" w:hanging="648"/>
+      </w:pPr>
+      <w:rPr>
+        <w:rFonts w:hint="default"/>
+      </w:rPr>
+    </w:lvl>
+    <w:lvl w:ilvl="4">
+      <w:start w:val="1"/>
+      <w:numFmt w:val="decimal"/>
+      <w:lvlText w:val="%1.%2.%3.%4.%5."/>
+      <w:lvlJc w:val="left"/>
+      <w:pPr>
+        <w:ind w:left="2232" w:hanging="792"/>
+      </w:pPr>
+      <w:rPr>
+        <w:rFonts w:hint="default"/>
+      </w:rPr>
+    </w:lvl>
+    <w:lvl w:ilvl="5">
+      <w:start w:val="1"/>
+      <w:numFmt w:val="decimal"/>
+      <w:lvlText w:val="%1.%2.%3.%4.%5.%6."/>
+      <w:lvlJc w:val="left"/>
+      <w:pPr>
+        <w:ind w:left="2736" w:hanging="936"/>
+      </w:pPr>
+      <w:rPr>
+        <w:rFonts w:hint="default"/>
+      </w:rPr>
+    </w:lvl>
+    <w:lvl w:ilvl="6">
+      <w:start w:val="1"/>
+      <w:numFmt w:val="decimal"/>
+      <w:lvlText w:val="%1.%2.%3.%4.%5.%6.%7."/>
+      <w:lvlJc w:val="left"/>
+      <w:pPr>
+        <w:ind w:left="3240" w:hanging="1080"/>
+      </w:pPr>
+      <w:rPr>
+        <w:rFonts w:hint="default"/>
+      </w:rPr>
+    </w:lvl>
+    <w:lvl w:ilvl="7">
+      <w:start w:val="1"/>
+      <w:numFmt w:val="decimal"/>
+      <w:lvlText w:val="%1.%2.%3.%4.%5.%6.%7.%8."/>
+      <w:lvlJc w:val="left"/>
+      <w:pPr>
+        <w:ind w:left="3744" w:hanging="1224"/>
+      </w:pPr>
+      <w:rPr>
+        <w:rFonts w:hint="default"/>
+      </w:rPr>
+    </w:lvl>
+    <w:lvl w:ilvl="8">
+      <w:start w:val="1"/>
+      <w:numFmt w:val="decimal"/>
+      <w:lvlText w:val="%1.%2.%3.%4.%5.%6.%7.%8.%9."/>
+      <w:lvlJc w:val="left"/>
+      <w:pPr>
+        <w:ind w:left="4320" w:hanging="1440"/>
+      </w:pPr>
+      <w:rPr>
+        <w:rFonts w:hint="default"/>
+      </w:rPr>
     </w:lvl>
   </w:abstractNum>
   <w:num w:numId="1" w16cid:durableId="1787844412">
@@ -8345,21 +9734,36 @@
     <w:abstractNumId w:val="0"/>
   </w:num>
   <w:num w:numId="10" w16cid:durableId="1510750229">
-    <w:abstractNumId w:val="11"/>
+    <w:abstractNumId w:val="12"/>
   </w:num>
   <w:num w:numId="11" w16cid:durableId="999118899">
-    <w:abstractNumId w:val="12"/>
+    <w:abstractNumId w:val="14"/>
   </w:num>
   <w:num w:numId="12" w16cid:durableId="1703822166">
     <w:abstractNumId w:val="9"/>
   </w:num>
   <w:num w:numId="13" w16cid:durableId="637761526">
-    <w:abstractNumId w:val="14"/>
+    <w:abstractNumId w:val="17"/>
   </w:num>
   <w:num w:numId="14" w16cid:durableId="2082825372">
     <w:abstractNumId w:val="10"/>
   </w:num>
   <w:num w:numId="15" w16cid:durableId="577520999">
+    <w:abstractNumId w:val="16"/>
+  </w:num>
+  <w:num w:numId="16" w16cid:durableId="411006653">
+    <w:abstractNumId w:val="11"/>
+  </w:num>
+  <w:num w:numId="17" w16cid:durableId="841747572">
+    <w:abstractNumId w:val="18"/>
+  </w:num>
+  <w:num w:numId="18" w16cid:durableId="1480076456">
+    <w:abstractNumId w:val="15"/>
+  </w:num>
+  <w:num w:numId="19" w16cid:durableId="172847051">
+    <w:abstractNumId w:val="15"/>
+  </w:num>
+  <w:num w:numId="20" w16cid:durableId="1874416676">
     <w:abstractNumId w:val="13"/>
   </w:num>
 </w:numbering>
@@ -8767,6 +10171,9 @@
     <w:pPr>
       <w:keepNext/>
       <w:keepLines/>
+      <w:numPr>
+        <w:numId w:val="18"/>
+      </w:numPr>
       <w:spacing w:before="480" w:after="0"/>
       <w:outlineLvl w:val="0"/>
     </w:pPr>
@@ -8791,6 +10198,10 @@
     <w:pPr>
       <w:keepNext/>
       <w:keepLines/>
+      <w:numPr>
+        <w:ilvl w:val="1"/>
+        <w:numId w:val="18"/>
+      </w:numPr>
       <w:spacing w:before="200" w:after="0"/>
       <w:outlineLvl w:val="1"/>
     </w:pPr>
@@ -8815,6 +10226,10 @@
     <w:pPr>
       <w:keepNext/>
       <w:keepLines/>
+      <w:numPr>
+        <w:ilvl w:val="2"/>
+        <w:numId w:val="18"/>
+      </w:numPr>
       <w:spacing w:before="200" w:after="0"/>
       <w:outlineLvl w:val="2"/>
     </w:pPr>
@@ -8838,6 +10253,10 @@
     <w:pPr>
       <w:keepNext/>
       <w:keepLines/>
+      <w:numPr>
+        <w:ilvl w:val="3"/>
+        <w:numId w:val="18"/>
+      </w:numPr>
       <w:spacing w:before="200" w:after="0"/>
       <w:outlineLvl w:val="3"/>
     </w:pPr>
@@ -8863,6 +10282,10 @@
     <w:pPr>
       <w:keepNext/>
       <w:keepLines/>
+      <w:numPr>
+        <w:ilvl w:val="4"/>
+        <w:numId w:val="18"/>
+      </w:numPr>
       <w:spacing w:before="200" w:after="0"/>
       <w:outlineLvl w:val="4"/>
     </w:pPr>
@@ -8884,6 +10307,10 @@
     <w:pPr>
       <w:keepNext/>
       <w:keepLines/>
+      <w:numPr>
+        <w:ilvl w:val="5"/>
+        <w:numId w:val="18"/>
+      </w:numPr>
       <w:spacing w:before="200" w:after="0"/>
       <w:outlineLvl w:val="5"/>
     </w:pPr>
@@ -8907,6 +10334,10 @@
     <w:pPr>
       <w:keepNext/>
       <w:keepLines/>
+      <w:numPr>
+        <w:ilvl w:val="6"/>
+        <w:numId w:val="18"/>
+      </w:numPr>
       <w:spacing w:before="200" w:after="0"/>
       <w:outlineLvl w:val="6"/>
     </w:pPr>
@@ -8930,6 +10361,10 @@
     <w:pPr>
       <w:keepNext/>
       <w:keepLines/>
+      <w:numPr>
+        <w:ilvl w:val="7"/>
+        <w:numId w:val="18"/>
+      </w:numPr>
       <w:spacing w:before="200" w:after="0"/>
       <w:outlineLvl w:val="7"/>
     </w:pPr>
@@ -8953,6 +10388,10 @@
     <w:pPr>
       <w:keepNext/>
       <w:keepLines/>
+      <w:numPr>
+        <w:ilvl w:val="8"/>
+        <w:numId w:val="18"/>
+      </w:numPr>
       <w:spacing w:before="200" w:after="0"/>
       <w:outlineLvl w:val="8"/>
     </w:pPr>
@@ -8968,6 +10407,7 @@
   <w:style w:type="character" w:default="1" w:styleId="DefaultParagraphFont">
     <w:name w:val="Default Paragraph Font"/>
     <w:uiPriority w:val="1"/>
+    <w:semiHidden/>
     <w:unhideWhenUsed/>
   </w:style>
   <w:style w:type="table" w:default="1" w:styleId="TableNormal">

</xml_diff>

<commit_message>
commiting documents from GILE-N1
</commit_message>
<xml_diff>
--- a/Documentations/A2C_SDD.docx
+++ b/Documentations/A2C_SDD.docx
@@ -6488,10 +6488,19 @@
     </w:p>
     <w:p>
       <w:pPr>
-        <w:autoSpaceDE w:val="0"/>
-        <w:autoSpaceDN w:val="0"/>
-        <w:adjustRightInd w:val="0"/>
-        <w:spacing w:after="0" w:line="240" w:lineRule="auto"/>
+        <w:rPr>
+          <w:lang w:eastAsia="ja-JP"/>
+        </w:rPr>
+      </w:pPr>
+      <w:r>
+        <w:rPr>
+          <w:lang w:eastAsia="ja-JP"/>
+        </w:rPr>
+        <w:t>M</w:t>
+      </w:r>
+    </w:p>
+    <w:p>
+      <w:pPr>
         <w:rPr>
           <w:rFonts w:ascii="Cascadia Mono" w:hAnsi="Cascadia Mono" w:cs="Cascadia Mono"/>
           <w:color w:val="008000"/>
@@ -6539,10 +6548,6 @@
     </w:p>
     <w:p>
       <w:pPr>
-        <w:autoSpaceDE w:val="0"/>
-        <w:autoSpaceDN w:val="0"/>
-        <w:adjustRightInd w:val="0"/>
-        <w:spacing w:after="0" w:line="240" w:lineRule="auto"/>
         <w:rPr>
           <w:rFonts w:ascii="Cascadia Mono" w:hAnsi="Cascadia Mono" w:cs="Cascadia Mono"/>
           <w:color w:val="008000"/>
@@ -6555,10 +6560,6 @@
     </w:p>
     <w:p>
       <w:pPr>
-        <w:autoSpaceDE w:val="0"/>
-        <w:autoSpaceDN w:val="0"/>
-        <w:adjustRightInd w:val="0"/>
-        <w:spacing w:after="0" w:line="240" w:lineRule="auto"/>
         <w:rPr>
           <w:rFonts w:ascii="Cascadia Mono" w:hAnsi="Cascadia Mono" w:cs="Cascadia Mono"/>
           <w:color w:val="008000"/>
@@ -6582,10 +6583,6 @@
     </w:p>
     <w:p>
       <w:pPr>
-        <w:autoSpaceDE w:val="0"/>
-        <w:autoSpaceDN w:val="0"/>
-        <w:adjustRightInd w:val="0"/>
-        <w:spacing w:after="0" w:line="240" w:lineRule="auto"/>
         <w:rPr>
           <w:rFonts w:ascii="Cascadia Mono" w:hAnsi="Cascadia Mono" w:cs="Cascadia Mono"/>
           <w:color w:val="008000"/>
@@ -6609,10 +6606,6 @@
     </w:p>
     <w:p>
       <w:pPr>
-        <w:autoSpaceDE w:val="0"/>
-        <w:autoSpaceDN w:val="0"/>
-        <w:adjustRightInd w:val="0"/>
-        <w:spacing w:after="0" w:line="240" w:lineRule="auto"/>
         <w:rPr>
           <w:rFonts w:ascii="Cascadia Mono" w:hAnsi="Cascadia Mono" w:cs="Cascadia Mono"/>
           <w:color w:val="008000"/>
@@ -6631,15 +6624,11 @@
           <w:highlight w:val="white"/>
           <w:lang w:val="en-IL" w:bidi="he-IL"/>
         </w:rPr>
-        <w:t>USER root</w:t>
+        <w:t># USER $APP_UID</w:t>
       </w:r>
     </w:p>
     <w:p>
       <w:pPr>
-        <w:autoSpaceDE w:val="0"/>
-        <w:autoSpaceDN w:val="0"/>
-        <w:adjustRightInd w:val="0"/>
-        <w:spacing w:after="0" w:line="240" w:lineRule="auto"/>
         <w:rPr>
           <w:rFonts w:ascii="Cascadia Mono" w:hAnsi="Cascadia Mono" w:cs="Cascadia Mono"/>
           <w:color w:val="008000"/>
@@ -6658,15 +6647,11 @@
           <w:highlight w:val="white"/>
           <w:lang w:val="en-IL" w:bidi="he-IL"/>
         </w:rPr>
-        <w:t>WORKDIR /app</w:t>
+        <w:t>USER root</w:t>
       </w:r>
     </w:p>
     <w:p>
       <w:pPr>
-        <w:autoSpaceDE w:val="0"/>
-        <w:autoSpaceDN w:val="0"/>
-        <w:adjustRightInd w:val="0"/>
-        <w:spacing w:after="0" w:line="240" w:lineRule="auto"/>
         <w:rPr>
           <w:rFonts w:ascii="Cascadia Mono" w:hAnsi="Cascadia Mono" w:cs="Cascadia Mono"/>
           <w:color w:val="008000"/>
@@ -6685,15 +6670,11 @@
           <w:highlight w:val="white"/>
           <w:lang w:val="en-IL" w:bidi="he-IL"/>
         </w:rPr>
-        <w:t>EXPOSE 8080</w:t>
+        <w:t>WORKDIR /app</w:t>
       </w:r>
     </w:p>
     <w:p>
       <w:pPr>
-        <w:autoSpaceDE w:val="0"/>
-        <w:autoSpaceDN w:val="0"/>
-        <w:adjustRightInd w:val="0"/>
-        <w:spacing w:after="0" w:line="240" w:lineRule="auto"/>
         <w:rPr>
           <w:rFonts w:ascii="Cascadia Mono" w:hAnsi="Cascadia Mono" w:cs="Cascadia Mono"/>
           <w:color w:val="008000"/>
@@ -6712,15 +6693,11 @@
           <w:highlight w:val="white"/>
           <w:lang w:val="en-IL" w:bidi="he-IL"/>
         </w:rPr>
-        <w:t>EXPOSE 8081</w:t>
+        <w:t>EXPOSE 8080</w:t>
       </w:r>
     </w:p>
     <w:p>
       <w:pPr>
-        <w:autoSpaceDE w:val="0"/>
-        <w:autoSpaceDN w:val="0"/>
-        <w:adjustRightInd w:val="0"/>
-        <w:spacing w:after="0" w:line="240" w:lineRule="auto"/>
         <w:rPr>
           <w:rFonts w:ascii="Cascadia Mono" w:hAnsi="Cascadia Mono" w:cs="Cascadia Mono"/>
           <w:color w:val="008000"/>
@@ -6730,13 +6707,7 @@
           <w:lang w:val="en-IL" w:bidi="he-IL"/>
         </w:rPr>
       </w:pPr>
-    </w:p>
-    <w:p>
-      <w:pPr>
-        <w:autoSpaceDE w:val="0"/>
-        <w:autoSpaceDN w:val="0"/>
-        <w:adjustRightInd w:val="0"/>
-        <w:spacing w:after="0" w:line="240" w:lineRule="auto"/>
+      <w:r>
         <w:rPr>
           <w:rFonts w:ascii="Cascadia Mono" w:hAnsi="Cascadia Mono" w:cs="Cascadia Mono"/>
           <w:color w:val="008000"/>
@@ -6745,14 +6716,11 @@
           <w:highlight w:val="white"/>
           <w:lang w:val="en-IL" w:bidi="he-IL"/>
         </w:rPr>
-      </w:pPr>
+        <w:t>EXPOSE 8081</w:t>
+      </w:r>
     </w:p>
     <w:p>
       <w:pPr>
-        <w:autoSpaceDE w:val="0"/>
-        <w:autoSpaceDN w:val="0"/>
-        <w:adjustRightInd w:val="0"/>
-        <w:spacing w:after="0" w:line="240" w:lineRule="auto"/>
         <w:rPr>
           <w:rFonts w:ascii="Cascadia Mono" w:hAnsi="Cascadia Mono" w:cs="Cascadia Mono"/>
           <w:color w:val="008000"/>
@@ -6762,7 +6730,9 @@
           <w:lang w:val="en-IL" w:bidi="he-IL"/>
         </w:rPr>
       </w:pPr>
-      <w:r>
+    </w:p>
+    <w:p>
+      <w:pPr>
         <w:rPr>
           <w:rFonts w:ascii="Cascadia Mono" w:hAnsi="Cascadia Mono" w:cs="Cascadia Mono"/>
           <w:color w:val="008000"/>
@@ -6771,15 +6741,8 @@
           <w:highlight w:val="white"/>
           <w:lang w:val="en-IL" w:bidi="he-IL"/>
         </w:rPr>
-        <w:t># This stage is used to build the service project</w:t>
-      </w:r>
-    </w:p>
-    <w:p>
-      <w:pPr>
-        <w:autoSpaceDE w:val="0"/>
-        <w:autoSpaceDN w:val="0"/>
-        <w:adjustRightInd w:val="0"/>
-        <w:spacing w:after="0" w:line="240" w:lineRule="auto"/>
+      </w:pPr>
+      <w:r>
         <w:rPr>
           <w:rFonts w:ascii="Cascadia Mono" w:hAnsi="Cascadia Mono" w:cs="Cascadia Mono"/>
           <w:color w:val="008000"/>
@@ -6788,8 +6751,11 @@
           <w:highlight w:val="white"/>
           <w:lang w:val="en-IL" w:bidi="he-IL"/>
         </w:rPr>
-      </w:pPr>
-      <w:r>
+        <w:t># This stage is used to build the service project</w:t>
+      </w:r>
+    </w:p>
+    <w:p>
+      <w:pPr>
         <w:rPr>
           <w:rFonts w:ascii="Cascadia Mono" w:hAnsi="Cascadia Mono" w:cs="Cascadia Mono"/>
           <w:color w:val="008000"/>
@@ -6798,15 +6764,8 @@
           <w:highlight w:val="white"/>
           <w:lang w:val="en-IL" w:bidi="he-IL"/>
         </w:rPr>
-        <w:t>FROM mcr.microsoft.com/dotnet/sdk:8.0 AS build</w:t>
-      </w:r>
-    </w:p>
-    <w:p>
-      <w:pPr>
-        <w:autoSpaceDE w:val="0"/>
-        <w:autoSpaceDN w:val="0"/>
-        <w:adjustRightInd w:val="0"/>
-        <w:spacing w:after="0" w:line="240" w:lineRule="auto"/>
+      </w:pPr>
+      <w:r>
         <w:rPr>
           <w:rFonts w:ascii="Cascadia Mono" w:hAnsi="Cascadia Mono" w:cs="Cascadia Mono"/>
           <w:color w:val="008000"/>
@@ -6815,8 +6774,11 @@
           <w:highlight w:val="white"/>
           <w:lang w:val="en-IL" w:bidi="he-IL"/>
         </w:rPr>
-      </w:pPr>
-      <w:r>
+        <w:t>FROM mcr.microsoft.com/dotnet/sdk:8.0 AS build</w:t>
+      </w:r>
+    </w:p>
+    <w:p>
+      <w:pPr>
         <w:rPr>
           <w:rFonts w:ascii="Cascadia Mono" w:hAnsi="Cascadia Mono" w:cs="Cascadia Mono"/>
           <w:color w:val="008000"/>
@@ -6825,15 +6787,8 @@
           <w:highlight w:val="white"/>
           <w:lang w:val="en-IL" w:bidi="he-IL"/>
         </w:rPr>
-        <w:t>ARG BUILD_CONFIGURATION=Release</w:t>
-      </w:r>
-    </w:p>
-    <w:p>
-      <w:pPr>
-        <w:autoSpaceDE w:val="0"/>
-        <w:autoSpaceDN w:val="0"/>
-        <w:adjustRightInd w:val="0"/>
-        <w:spacing w:after="0" w:line="240" w:lineRule="auto"/>
+      </w:pPr>
+      <w:r>
         <w:rPr>
           <w:rFonts w:ascii="Cascadia Mono" w:hAnsi="Cascadia Mono" w:cs="Cascadia Mono"/>
           <w:color w:val="008000"/>
@@ -6842,8 +6797,11 @@
           <w:highlight w:val="white"/>
           <w:lang w:val="en-IL" w:bidi="he-IL"/>
         </w:rPr>
-      </w:pPr>
-      <w:r>
+        <w:t>ARG BUILD_CONFIGURATION=Release</w:t>
+      </w:r>
+    </w:p>
+    <w:p>
+      <w:pPr>
         <w:rPr>
           <w:rFonts w:ascii="Cascadia Mono" w:hAnsi="Cascadia Mono" w:cs="Cascadia Mono"/>
           <w:color w:val="008000"/>
@@ -6852,9 +6810,7 @@
           <w:highlight w:val="white"/>
           <w:lang w:val="en-IL" w:bidi="he-IL"/>
         </w:rPr>
-        <w:t>WORKDIR /</w:t>
-      </w:r>
-      <w:proofErr w:type="spellStart"/>
+      </w:pPr>
       <w:r>
         <w:rPr>
           <w:rFonts w:ascii="Cascadia Mono" w:hAnsi="Cascadia Mono" w:cs="Cascadia Mono"/>
@@ -6864,16 +6820,10 @@
           <w:highlight w:val="white"/>
           <w:lang w:val="en-IL" w:bidi="he-IL"/>
         </w:rPr>
-        <w:t>src</w:t>
+        <w:t>WORKDIR /</w:t>
       </w:r>
-      <w:proofErr w:type="spellEnd"/>
-    </w:p>
-    <w:p>
-      <w:pPr>
-        <w:autoSpaceDE w:val="0"/>
-        <w:autoSpaceDN w:val="0"/>
-        <w:adjustRightInd w:val="0"/>
-        <w:spacing w:after="0" w:line="240" w:lineRule="auto"/>
+      <w:proofErr w:type="spellStart"/>
+      <w:r>
         <w:rPr>
           <w:rFonts w:ascii="Cascadia Mono" w:hAnsi="Cascadia Mono" w:cs="Cascadia Mono"/>
           <w:color w:val="008000"/>
@@ -6882,8 +6832,12 @@
           <w:highlight w:val="white"/>
           <w:lang w:val="en-IL" w:bidi="he-IL"/>
         </w:rPr>
-      </w:pPr>
-      <w:r>
+        <w:t>src</w:t>
+      </w:r>
+      <w:proofErr w:type="spellEnd"/>
+    </w:p>
+    <w:p>
+      <w:pPr>
         <w:rPr>
           <w:rFonts w:ascii="Cascadia Mono" w:hAnsi="Cascadia Mono" w:cs="Cascadia Mono"/>
           <w:color w:val="008000"/>
@@ -6892,15 +6846,10 @@
           <w:highlight w:val="white"/>
           <w:lang w:val="en-IL" w:bidi="he-IL"/>
         </w:rPr>
-        <w:t># Copy the service project file and restore dependencies</w:t>
-      </w:r>
+      </w:pPr>
     </w:p>
     <w:p>
       <w:pPr>
-        <w:autoSpaceDE w:val="0"/>
-        <w:autoSpaceDN w:val="0"/>
-        <w:adjustRightInd w:val="0"/>
-        <w:spacing w:after="0" w:line="240" w:lineRule="auto"/>
         <w:rPr>
           <w:rFonts w:ascii="Cascadia Mono" w:hAnsi="Cascadia Mono" w:cs="Cascadia Mono"/>
           <w:color w:val="008000"/>
@@ -6919,15 +6868,10 @@
           <w:highlight w:val="white"/>
           <w:lang w:val="en-IL" w:bidi="he-IL"/>
         </w:rPr>
-        <w:t># COPY ["A2C.CRM.Api/A2C.CRM.Api.csproj", "A2C.CRM.Api/"]</w:t>
+        <w:t># Install dotnet-</w:t>
       </w:r>
-    </w:p>
-    <w:p>
-      <w:pPr>
-        <w:autoSpaceDE w:val="0"/>
-        <w:autoSpaceDN w:val="0"/>
-        <w:adjustRightInd w:val="0"/>
-        <w:spacing w:after="0" w:line="240" w:lineRule="auto"/>
+      <w:proofErr w:type="spellStart"/>
+      <w:r>
         <w:rPr>
           <w:rFonts w:ascii="Cascadia Mono" w:hAnsi="Cascadia Mono" w:cs="Cascadia Mono"/>
           <w:color w:val="008000"/>
@@ -6936,8 +6880,12 @@
           <w:highlight w:val="white"/>
           <w:lang w:val="en-IL" w:bidi="he-IL"/>
         </w:rPr>
-      </w:pPr>
-      <w:r>
+        <w:t>ef</w:t>
+      </w:r>
+      <w:proofErr w:type="spellEnd"/>
+    </w:p>
+    <w:p>
+      <w:pPr>
         <w:rPr>
           <w:rFonts w:ascii="Cascadia Mono" w:hAnsi="Cascadia Mono" w:cs="Cascadia Mono"/>
           <w:color w:val="008000"/>
@@ -6946,15 +6894,8 @@
           <w:highlight w:val="white"/>
           <w:lang w:val="en-IL" w:bidi="he-IL"/>
         </w:rPr>
-        <w:t>COPY ["A2C.CRM.Api.csproj", "."]</w:t>
-      </w:r>
-    </w:p>
-    <w:p>
-      <w:pPr>
-        <w:autoSpaceDE w:val="0"/>
-        <w:autoSpaceDN w:val="0"/>
-        <w:adjustRightInd w:val="0"/>
-        <w:spacing w:after="0" w:line="240" w:lineRule="auto"/>
+      </w:pPr>
+      <w:r>
         <w:rPr>
           <w:rFonts w:ascii="Cascadia Mono" w:hAnsi="Cascadia Mono" w:cs="Cascadia Mono"/>
           <w:color w:val="008000"/>
@@ -6963,7 +6904,10 @@
           <w:highlight w:val="white"/>
           <w:lang w:val="en-IL" w:bidi="he-IL"/>
         </w:rPr>
-      </w:pPr>
+        <w:lastRenderedPageBreak/>
+        <w:t>RUN dotnet tool install --global dotnet-</w:t>
+      </w:r>
+      <w:proofErr w:type="spellStart"/>
       <w:r>
         <w:rPr>
           <w:rFonts w:ascii="Cascadia Mono" w:hAnsi="Cascadia Mono" w:cs="Cascadia Mono"/>
@@ -6973,15 +6917,12 @@
           <w:highlight w:val="white"/>
           <w:lang w:val="en-IL" w:bidi="he-IL"/>
         </w:rPr>
-        <w:t># Restore the dependencies</w:t>
+        <w:t>ef</w:t>
       </w:r>
+      <w:proofErr w:type="spellEnd"/>
     </w:p>
     <w:p>
       <w:pPr>
-        <w:autoSpaceDE w:val="0"/>
-        <w:autoSpaceDN w:val="0"/>
-        <w:adjustRightInd w:val="0"/>
-        <w:spacing w:after="0" w:line="240" w:lineRule="auto"/>
         <w:rPr>
           <w:rFonts w:ascii="Cascadia Mono" w:hAnsi="Cascadia Mono" w:cs="Cascadia Mono"/>
           <w:color w:val="008000"/>
@@ -7000,15 +6941,11 @@
           <w:highlight w:val="white"/>
           <w:lang w:val="en-IL" w:bidi="he-IL"/>
         </w:rPr>
-        <w:t>RUN dotnet restore "./A2C.CRM.Api.csproj"</w:t>
+        <w:t>ENV PATH="$PATH:/root/.dotnet/tools"</w:t>
       </w:r>
     </w:p>
     <w:p>
       <w:pPr>
-        <w:autoSpaceDE w:val="0"/>
-        <w:autoSpaceDN w:val="0"/>
-        <w:adjustRightInd w:val="0"/>
-        <w:spacing w:after="0" w:line="240" w:lineRule="auto"/>
         <w:rPr>
           <w:rFonts w:ascii="Cascadia Mono" w:hAnsi="Cascadia Mono" w:cs="Cascadia Mono"/>
           <w:color w:val="008000"/>
@@ -7018,7 +6955,9 @@
           <w:lang w:val="en-IL" w:bidi="he-IL"/>
         </w:rPr>
       </w:pPr>
-      <w:r>
+    </w:p>
+    <w:p>
+      <w:pPr>
         <w:rPr>
           <w:rFonts w:ascii="Cascadia Mono" w:hAnsi="Cascadia Mono" w:cs="Cascadia Mono"/>
           <w:color w:val="008000"/>
@@ -7027,15 +6966,8 @@
           <w:highlight w:val="white"/>
           <w:lang w:val="en-IL" w:bidi="he-IL"/>
         </w:rPr>
-        <w:t># RUN dotnet restore "./A2C.CRM.Api/A2C.CRM.Api.csproj"</w:t>
-      </w:r>
-    </w:p>
-    <w:p>
-      <w:pPr>
-        <w:autoSpaceDE w:val="0"/>
-        <w:autoSpaceDN w:val="0"/>
-        <w:adjustRightInd w:val="0"/>
-        <w:spacing w:after="0" w:line="240" w:lineRule="auto"/>
+      </w:pPr>
+      <w:r>
         <w:rPr>
           <w:rFonts w:ascii="Cascadia Mono" w:hAnsi="Cascadia Mono" w:cs="Cascadia Mono"/>
           <w:color w:val="008000"/>
@@ -7044,9 +6976,11 @@
           <w:highlight w:val="white"/>
           <w:lang w:val="en-IL" w:bidi="he-IL"/>
         </w:rPr>
-      </w:pPr>
-      <w:proofErr w:type="gramStart"/>
-      <w:r>
+        <w:t># Copy the service project file and restore dependencies</w:t>
+      </w:r>
+    </w:p>
+    <w:p>
+      <w:pPr>
         <w:rPr>
           <w:rFonts w:ascii="Cascadia Mono" w:hAnsi="Cascadia Mono" w:cs="Cascadia Mono"/>
           <w:color w:val="008000"/>
@@ -7055,9 +6989,7 @@
           <w:highlight w:val="white"/>
           <w:lang w:val="en-IL" w:bidi="he-IL"/>
         </w:rPr>
-        <w:t>COPY .</w:t>
-      </w:r>
-      <w:proofErr w:type="gramEnd"/>
+      </w:pPr>
       <w:r>
         <w:rPr>
           <w:rFonts w:ascii="Cascadia Mono" w:hAnsi="Cascadia Mono" w:cs="Cascadia Mono"/>
@@ -7067,15 +6999,11 @@
           <w:highlight w:val="white"/>
           <w:lang w:val="en-IL" w:bidi="he-IL"/>
         </w:rPr>
-        <w:t xml:space="preserve"> .</w:t>
+        <w:t># COPY ["A2C.CRM.Api/A2C.CRM.Api.csproj", "A2C.CRM.Api/"]</w:t>
       </w:r>
     </w:p>
     <w:p>
       <w:pPr>
-        <w:autoSpaceDE w:val="0"/>
-        <w:autoSpaceDN w:val="0"/>
-        <w:adjustRightInd w:val="0"/>
-        <w:spacing w:after="0" w:line="240" w:lineRule="auto"/>
         <w:rPr>
           <w:rFonts w:ascii="Cascadia Mono" w:hAnsi="Cascadia Mono" w:cs="Cascadia Mono"/>
           <w:color w:val="008000"/>
@@ -7094,10 +7022,11 @@
           <w:highlight w:val="white"/>
           <w:lang w:val="en-IL" w:bidi="he-IL"/>
         </w:rPr>
-        <w:t># WORKDIR "/</w:t>
+        <w:t>COPY ["A2C.CRM.Api.csproj", "."]</w:t>
       </w:r>
-      <w:proofErr w:type="spellStart"/>
-      <w:r>
+    </w:p>
+    <w:p>
+      <w:pPr>
         <w:rPr>
           <w:rFonts w:ascii="Cascadia Mono" w:hAnsi="Cascadia Mono" w:cs="Cascadia Mono"/>
           <w:color w:val="008000"/>
@@ -7106,9 +7035,7 @@
           <w:highlight w:val="white"/>
           <w:lang w:val="en-IL" w:bidi="he-IL"/>
         </w:rPr>
-        <w:t>src</w:t>
-      </w:r>
-      <w:proofErr w:type="spellEnd"/>
+      </w:pPr>
       <w:r>
         <w:rPr>
           <w:rFonts w:ascii="Cascadia Mono" w:hAnsi="Cascadia Mono" w:cs="Cascadia Mono"/>
@@ -7118,15 +7045,11 @@
           <w:highlight w:val="white"/>
           <w:lang w:val="en-IL" w:bidi="he-IL"/>
         </w:rPr>
-        <w:t>/A2C.CRM.Api"</w:t>
+        <w:t># Restore the dependencies</w:t>
       </w:r>
     </w:p>
     <w:p>
       <w:pPr>
-        <w:autoSpaceDE w:val="0"/>
-        <w:autoSpaceDN w:val="0"/>
-        <w:adjustRightInd w:val="0"/>
-        <w:spacing w:after="0" w:line="240" w:lineRule="auto"/>
         <w:rPr>
           <w:rFonts w:ascii="Cascadia Mono" w:hAnsi="Cascadia Mono" w:cs="Cascadia Mono"/>
           <w:color w:val="008000"/>
@@ -7145,15 +7068,11 @@
           <w:highlight w:val="white"/>
           <w:lang w:val="en-IL" w:bidi="he-IL"/>
         </w:rPr>
-        <w:t>RUN dotnet build "./A2C.CRM.Api.csproj" -c $BUILD_CONFIGURATION -o /app/build</w:t>
+        <w:t>RUN dotnet restore "./A2C.CRM.Api.csproj"</w:t>
       </w:r>
     </w:p>
     <w:p>
       <w:pPr>
-        <w:autoSpaceDE w:val="0"/>
-        <w:autoSpaceDN w:val="0"/>
-        <w:adjustRightInd w:val="0"/>
-        <w:spacing w:after="0" w:line="240" w:lineRule="auto"/>
         <w:rPr>
           <w:rFonts w:ascii="Cascadia Mono" w:hAnsi="Cascadia Mono" w:cs="Cascadia Mono"/>
           <w:color w:val="008000"/>
@@ -7163,13 +7082,7 @@
           <w:lang w:val="en-IL" w:bidi="he-IL"/>
         </w:rPr>
       </w:pPr>
-    </w:p>
-    <w:p>
-      <w:pPr>
-        <w:autoSpaceDE w:val="0"/>
-        <w:autoSpaceDN w:val="0"/>
-        <w:adjustRightInd w:val="0"/>
-        <w:spacing w:after="0" w:line="240" w:lineRule="auto"/>
+      <w:r>
         <w:rPr>
           <w:rFonts w:ascii="Cascadia Mono" w:hAnsi="Cascadia Mono" w:cs="Cascadia Mono"/>
           <w:color w:val="008000"/>
@@ -7178,8 +7091,11 @@
           <w:highlight w:val="white"/>
           <w:lang w:val="en-IL" w:bidi="he-IL"/>
         </w:rPr>
-      </w:pPr>
-      <w:r>
+        <w:t># RUN dotnet restore "./A2C.CRM.Api/A2C.CRM.Api.csproj"</w:t>
+      </w:r>
+    </w:p>
+    <w:p>
+      <w:pPr>
         <w:rPr>
           <w:rFonts w:ascii="Cascadia Mono" w:hAnsi="Cascadia Mono" w:cs="Cascadia Mono"/>
           <w:color w:val="008000"/>
@@ -7188,15 +7104,9 @@
           <w:highlight w:val="white"/>
           <w:lang w:val="en-IL" w:bidi="he-IL"/>
         </w:rPr>
-        <w:t># This stage is used to publish the service project to be copied to the final stage</w:t>
-      </w:r>
-    </w:p>
-    <w:p>
-      <w:pPr>
-        <w:autoSpaceDE w:val="0"/>
-        <w:autoSpaceDN w:val="0"/>
-        <w:adjustRightInd w:val="0"/>
-        <w:spacing w:after="0" w:line="240" w:lineRule="auto"/>
+      </w:pPr>
+      <w:proofErr w:type="gramStart"/>
+      <w:r>
         <w:rPr>
           <w:rFonts w:ascii="Cascadia Mono" w:hAnsi="Cascadia Mono" w:cs="Cascadia Mono"/>
           <w:color w:val="008000"/>
@@ -7205,7 +7115,9 @@
           <w:highlight w:val="white"/>
           <w:lang w:val="en-IL" w:bidi="he-IL"/>
         </w:rPr>
-      </w:pPr>
+        <w:t>COPY .</w:t>
+      </w:r>
+      <w:proofErr w:type="gramEnd"/>
       <w:r>
         <w:rPr>
           <w:rFonts w:ascii="Cascadia Mono" w:hAnsi="Cascadia Mono" w:cs="Cascadia Mono"/>
@@ -7215,15 +7127,11 @@
           <w:highlight w:val="white"/>
           <w:lang w:val="en-IL" w:bidi="he-IL"/>
         </w:rPr>
-        <w:t>FROM build AS publish</w:t>
+        <w:t xml:space="preserve"> .</w:t>
       </w:r>
     </w:p>
     <w:p>
       <w:pPr>
-        <w:autoSpaceDE w:val="0"/>
-        <w:autoSpaceDN w:val="0"/>
-        <w:adjustRightInd w:val="0"/>
-        <w:spacing w:after="0" w:line="240" w:lineRule="auto"/>
         <w:rPr>
           <w:rFonts w:ascii="Cascadia Mono" w:hAnsi="Cascadia Mono" w:cs="Cascadia Mono"/>
           <w:color w:val="008000"/>
@@ -7242,15 +7150,10 @@
           <w:highlight w:val="white"/>
           <w:lang w:val="en-IL" w:bidi="he-IL"/>
         </w:rPr>
-        <w:t>ARG BUILD_CONFIGURATION=Release</w:t>
+        <w:t># WORKDIR "/</w:t>
       </w:r>
-    </w:p>
-    <w:p>
-      <w:pPr>
-        <w:autoSpaceDE w:val="0"/>
-        <w:autoSpaceDN w:val="0"/>
-        <w:adjustRightInd w:val="0"/>
-        <w:spacing w:after="0" w:line="240" w:lineRule="auto"/>
+      <w:proofErr w:type="spellStart"/>
+      <w:r>
         <w:rPr>
           <w:rFonts w:ascii="Cascadia Mono" w:hAnsi="Cascadia Mono" w:cs="Cascadia Mono"/>
           <w:color w:val="008000"/>
@@ -7259,7 +7162,9 @@
           <w:highlight w:val="white"/>
           <w:lang w:val="en-IL" w:bidi="he-IL"/>
         </w:rPr>
-      </w:pPr>
+        <w:t>src</w:t>
+      </w:r>
+      <w:proofErr w:type="spellEnd"/>
       <w:r>
         <w:rPr>
           <w:rFonts w:ascii="Cascadia Mono" w:hAnsi="Cascadia Mono" w:cs="Cascadia Mono"/>
@@ -7269,11 +7174,11 @@
           <w:highlight w:val="white"/>
           <w:lang w:val="en-IL" w:bidi="he-IL"/>
         </w:rPr>
-        <w:t>RUN dotnet publish "./A2C.CRM.Api.csproj" -c $BUILD_CONFIGURATION -o /app/publish /</w:t>
+        <w:t>/A2C.CRM.Api"</w:t>
       </w:r>
-      <w:proofErr w:type="spellStart"/>
-      <w:proofErr w:type="gramStart"/>
-      <w:r>
+    </w:p>
+    <w:p>
+      <w:pPr>
         <w:rPr>
           <w:rFonts w:ascii="Cascadia Mono" w:hAnsi="Cascadia Mono" w:cs="Cascadia Mono"/>
           <w:color w:val="008000"/>
@@ -7282,10 +7187,7 @@
           <w:highlight w:val="white"/>
           <w:lang w:val="en-IL" w:bidi="he-IL"/>
         </w:rPr>
-        <w:t>p:UseAppHost</w:t>
-      </w:r>
-      <w:proofErr w:type="spellEnd"/>
-      <w:proofErr w:type="gramEnd"/>
+      </w:pPr>
       <w:r>
         <w:rPr>
           <w:rFonts w:ascii="Cascadia Mono" w:hAnsi="Cascadia Mono" w:cs="Cascadia Mono"/>
@@ -7295,15 +7197,11 @@
           <w:highlight w:val="white"/>
           <w:lang w:val="en-IL" w:bidi="he-IL"/>
         </w:rPr>
-        <w:t>=false</w:t>
+        <w:t>RUN dotnet build "./A2C.CRM.Api.csproj" -c $BUILD_CONFIGURATION -o /app/build</w:t>
       </w:r>
     </w:p>
     <w:p>
       <w:pPr>
-        <w:autoSpaceDE w:val="0"/>
-        <w:autoSpaceDN w:val="0"/>
-        <w:adjustRightInd w:val="0"/>
-        <w:spacing w:after="0" w:line="240" w:lineRule="auto"/>
         <w:rPr>
           <w:rFonts w:ascii="Cascadia Mono" w:hAnsi="Cascadia Mono" w:cs="Cascadia Mono"/>
           <w:color w:val="008000"/>
@@ -7313,13 +7211,7 @@
           <w:lang w:val="en-IL" w:bidi="he-IL"/>
         </w:rPr>
       </w:pPr>
-    </w:p>
-    <w:p>
-      <w:pPr>
-        <w:autoSpaceDE w:val="0"/>
-        <w:autoSpaceDN w:val="0"/>
-        <w:adjustRightInd w:val="0"/>
-        <w:spacing w:after="0" w:line="240" w:lineRule="auto"/>
+      <w:r>
         <w:rPr>
           <w:rFonts w:ascii="Cascadia Mono" w:hAnsi="Cascadia Mono" w:cs="Cascadia Mono"/>
           <w:color w:val="008000"/>
@@ -7328,8 +7220,11 @@
           <w:highlight w:val="white"/>
           <w:lang w:val="en-IL" w:bidi="he-IL"/>
         </w:rPr>
-      </w:pPr>
-      <w:r>
+        <w:t># This stage is used to publish the service project to be copied to the final stage</w:t>
+      </w:r>
+    </w:p>
+    <w:p>
+      <w:pPr>
         <w:rPr>
           <w:rFonts w:ascii="Cascadia Mono" w:hAnsi="Cascadia Mono" w:cs="Cascadia Mono"/>
           <w:color w:val="008000"/>
@@ -7338,15 +7233,8 @@
           <w:highlight w:val="white"/>
           <w:lang w:val="en-IL" w:bidi="he-IL"/>
         </w:rPr>
-        <w:t># This stage is used in production or when running from VS in regular mode (Default when not using the Debug configuration)</w:t>
-      </w:r>
-    </w:p>
-    <w:p>
-      <w:pPr>
-        <w:autoSpaceDE w:val="0"/>
-        <w:autoSpaceDN w:val="0"/>
-        <w:adjustRightInd w:val="0"/>
-        <w:spacing w:after="0" w:line="240" w:lineRule="auto"/>
+      </w:pPr>
+      <w:r>
         <w:rPr>
           <w:rFonts w:ascii="Cascadia Mono" w:hAnsi="Cascadia Mono" w:cs="Cascadia Mono"/>
           <w:color w:val="008000"/>
@@ -7355,8 +7243,11 @@
           <w:highlight w:val="white"/>
           <w:lang w:val="en-IL" w:bidi="he-IL"/>
         </w:rPr>
-      </w:pPr>
-      <w:r>
+        <w:t>FROM build AS publish</w:t>
+      </w:r>
+    </w:p>
+    <w:p>
+      <w:pPr>
         <w:rPr>
           <w:rFonts w:ascii="Cascadia Mono" w:hAnsi="Cascadia Mono" w:cs="Cascadia Mono"/>
           <w:color w:val="008000"/>
@@ -7365,15 +7256,8 @@
           <w:highlight w:val="white"/>
           <w:lang w:val="en-IL" w:bidi="he-IL"/>
         </w:rPr>
-        <w:t>FROM base AS final</w:t>
-      </w:r>
-    </w:p>
-    <w:p>
-      <w:pPr>
-        <w:autoSpaceDE w:val="0"/>
-        <w:autoSpaceDN w:val="0"/>
-        <w:adjustRightInd w:val="0"/>
-        <w:spacing w:after="0" w:line="240" w:lineRule="auto"/>
+      </w:pPr>
+      <w:r>
         <w:rPr>
           <w:rFonts w:ascii="Cascadia Mono" w:hAnsi="Cascadia Mono" w:cs="Cascadia Mono"/>
           <w:color w:val="008000"/>
@@ -7382,8 +7266,11 @@
           <w:highlight w:val="white"/>
           <w:lang w:val="en-IL" w:bidi="he-IL"/>
         </w:rPr>
-      </w:pPr>
-      <w:r>
+        <w:t>ARG BUILD_CONFIGURATION=Release</w:t>
+      </w:r>
+    </w:p>
+    <w:p>
+      <w:pPr>
         <w:rPr>
           <w:rFonts w:ascii="Cascadia Mono" w:hAnsi="Cascadia Mono" w:cs="Cascadia Mono"/>
           <w:color w:val="008000"/>
@@ -7392,15 +7279,8 @@
           <w:highlight w:val="white"/>
           <w:lang w:val="en-IL" w:bidi="he-IL"/>
         </w:rPr>
-        <w:t>WORKDIR /app</w:t>
-      </w:r>
-    </w:p>
-    <w:p>
-      <w:pPr>
-        <w:autoSpaceDE w:val="0"/>
-        <w:autoSpaceDN w:val="0"/>
-        <w:adjustRightInd w:val="0"/>
-        <w:spacing w:after="0" w:line="240" w:lineRule="auto"/>
+      </w:pPr>
+      <w:r>
         <w:rPr>
           <w:rFonts w:ascii="Cascadia Mono" w:hAnsi="Cascadia Mono" w:cs="Cascadia Mono"/>
           <w:color w:val="008000"/>
@@ -7409,7 +7289,10 @@
           <w:highlight w:val="white"/>
           <w:lang w:val="en-IL" w:bidi="he-IL"/>
         </w:rPr>
-      </w:pPr>
+        <w:t>RUN dotnet publish "./A2C.CRM.Api.csproj" -c $BUILD_CONFIGURATION -o /app/publish /</w:t>
+      </w:r>
+      <w:proofErr w:type="spellStart"/>
+      <w:proofErr w:type="gramStart"/>
       <w:r>
         <w:rPr>
           <w:rFonts w:ascii="Cascadia Mono" w:hAnsi="Cascadia Mono" w:cs="Cascadia Mono"/>
@@ -7419,7 +7302,111 @@
           <w:highlight w:val="white"/>
           <w:lang w:val="en-IL" w:bidi="he-IL"/>
         </w:rPr>
-        <w:lastRenderedPageBreak/>
+        <w:t>p:UseAppHost</w:t>
+      </w:r>
+      <w:proofErr w:type="spellEnd"/>
+      <w:proofErr w:type="gramEnd"/>
+      <w:r>
+        <w:rPr>
+          <w:rFonts w:ascii="Cascadia Mono" w:hAnsi="Cascadia Mono" w:cs="Cascadia Mono"/>
+          <w:color w:val="008000"/>
+          <w:sz w:val="19"/>
+          <w:szCs w:val="19"/>
+          <w:highlight w:val="white"/>
+          <w:lang w:val="en-IL" w:bidi="he-IL"/>
+        </w:rPr>
+        <w:t>=false</w:t>
+      </w:r>
+    </w:p>
+    <w:p>
+      <w:pPr>
+        <w:rPr>
+          <w:rFonts w:ascii="Cascadia Mono" w:hAnsi="Cascadia Mono" w:cs="Cascadia Mono"/>
+          <w:color w:val="008000"/>
+          <w:sz w:val="19"/>
+          <w:szCs w:val="19"/>
+          <w:highlight w:val="white"/>
+          <w:lang w:val="en-IL" w:bidi="he-IL"/>
+        </w:rPr>
+      </w:pPr>
+      <w:r>
+        <w:rPr>
+          <w:rFonts w:ascii="Cascadia Mono" w:hAnsi="Cascadia Mono" w:cs="Cascadia Mono"/>
+          <w:color w:val="008000"/>
+          <w:sz w:val="19"/>
+          <w:szCs w:val="19"/>
+          <w:highlight w:val="white"/>
+          <w:lang w:val="en-IL" w:bidi="he-IL"/>
+        </w:rPr>
+        <w:t># This stage is used in production or when running from VS in regular mode (Default when not using the Debug configuration)</w:t>
+      </w:r>
+    </w:p>
+    <w:p>
+      <w:pPr>
+        <w:rPr>
+          <w:rFonts w:ascii="Cascadia Mono" w:hAnsi="Cascadia Mono" w:cs="Cascadia Mono"/>
+          <w:color w:val="008000"/>
+          <w:sz w:val="19"/>
+          <w:szCs w:val="19"/>
+          <w:highlight w:val="white"/>
+          <w:lang w:val="en-IL" w:bidi="he-IL"/>
+        </w:rPr>
+      </w:pPr>
+      <w:r>
+        <w:rPr>
+          <w:rFonts w:ascii="Cascadia Mono" w:hAnsi="Cascadia Mono" w:cs="Cascadia Mono"/>
+          <w:color w:val="008000"/>
+          <w:sz w:val="19"/>
+          <w:szCs w:val="19"/>
+          <w:highlight w:val="white"/>
+          <w:lang w:val="en-IL" w:bidi="he-IL"/>
+        </w:rPr>
+        <w:t>FROM base AS final</w:t>
+      </w:r>
+    </w:p>
+    <w:p>
+      <w:pPr>
+        <w:rPr>
+          <w:rFonts w:ascii="Cascadia Mono" w:hAnsi="Cascadia Mono" w:cs="Cascadia Mono"/>
+          <w:color w:val="008000"/>
+          <w:sz w:val="19"/>
+          <w:szCs w:val="19"/>
+          <w:highlight w:val="white"/>
+          <w:lang w:val="en-IL" w:bidi="he-IL"/>
+        </w:rPr>
+      </w:pPr>
+      <w:r>
+        <w:rPr>
+          <w:rFonts w:ascii="Cascadia Mono" w:hAnsi="Cascadia Mono" w:cs="Cascadia Mono"/>
+          <w:color w:val="008000"/>
+          <w:sz w:val="19"/>
+          <w:szCs w:val="19"/>
+          <w:highlight w:val="white"/>
+          <w:lang w:val="en-IL" w:bidi="he-IL"/>
+        </w:rPr>
+        <w:t>WORKDIR /app</w:t>
+      </w:r>
+    </w:p>
+    <w:p>
+      <w:pPr>
+        <w:rPr>
+          <w:rFonts w:ascii="Cascadia Mono" w:hAnsi="Cascadia Mono" w:cs="Cascadia Mono"/>
+          <w:color w:val="008000"/>
+          <w:sz w:val="19"/>
+          <w:szCs w:val="19"/>
+          <w:highlight w:val="white"/>
+          <w:lang w:val="en-IL" w:bidi="he-IL"/>
+        </w:rPr>
+      </w:pPr>
+      <w:r>
+        <w:rPr>
+          <w:rFonts w:ascii="Cascadia Mono" w:hAnsi="Cascadia Mono" w:cs="Cascadia Mono"/>
+          <w:color w:val="008000"/>
+          <w:sz w:val="19"/>
+          <w:szCs w:val="19"/>
+          <w:highlight w:val="white"/>
+          <w:lang w:val="en-IL" w:bidi="he-IL"/>
+        </w:rPr>
         <w:t>COPY --from=publish /app/</w:t>
       </w:r>
       <w:proofErr w:type="gramStart"/>
@@ -7610,6 +7597,7 @@
         <w:rPr>
           <w:lang w:eastAsia="ja-JP"/>
         </w:rPr>
+        <w:lastRenderedPageBreak/>
         <w:t xml:space="preserve">      - "8080:80"</w:t>
       </w:r>
     </w:p>
@@ -8444,6 +8432,7 @@
         <w:rPr>
           <w:lang w:eastAsia="ja-JP"/>
         </w:rPr>
+        <w:lastRenderedPageBreak/>
         <w:t xml:space="preserve">    volumes:</w:t>
       </w:r>
     </w:p>
@@ -10407,7 +10396,6 @@
   <w:style w:type="character" w:default="1" w:styleId="DefaultParagraphFont">
     <w:name w:val="Default Paragraph Font"/>
     <w:uiPriority w:val="1"/>
-    <w:semiHidden/>
     <w:unhideWhenUsed/>
   </w:style>
   <w:style w:type="table" w:default="1" w:styleId="TableNormal">

</xml_diff>

<commit_message>
Initial commit - microservices structure
</commit_message>
<xml_diff>
--- a/Documentations/A2C_SDD.docx
+++ b/Documentations/A2C_SDD.docx
@@ -7,7 +7,7 @@
         <w:pStyle w:val="Title"/>
         <w:jc w:val="center"/>
         <w:rPr>
-          <w:rFonts w:cstheme="majorHAnsi" w:hint="cs"/>
+          <w:rFonts w:cstheme="majorHAnsi"/>
           <w:rtl/>
           <w:lang w:eastAsia="ja-JP" w:bidi="he-IL"/>
         </w:rPr>
@@ -3257,6 +3257,9 @@
     </w:p>
     <w:p>
       <w:r>
+        <w:rPr>
+          <w:noProof/>
+        </w:rPr>
         <w:drawing>
           <wp:inline distT="0" distB="0" distL="0" distR="0" wp14:anchorId="043DF364" wp14:editId="21183557">
             <wp:extent cx="5486400" cy="3028315"/>
@@ -3301,6 +3304,9 @@
     </w:p>
     <w:p>
       <w:r>
+        <w:rPr>
+          <w:noProof/>
+        </w:rPr>
         <w:drawing>
           <wp:inline distT="0" distB="0" distL="0" distR="0" wp14:anchorId="6847575F" wp14:editId="5A766845">
             <wp:extent cx="5486400" cy="2211070"/>
@@ -9868,6 +9874,7 @@
       </w:pPr>
       <w:r>
         <w:rPr>
+          <w:noProof/>
           <w:lang w:eastAsia="ja-JP" w:bidi="he-IL"/>
         </w:rPr>
         <w:drawing>
@@ -9947,7 +9954,6 @@
     <w:p>
       <w:pPr>
         <w:rPr>
-          <w:rFonts w:hint="cs"/>
           <w:lang w:eastAsia="ja-JP" w:bidi="he-IL"/>
         </w:rPr>
       </w:pPr>
@@ -11996,29 +12002,20 @@
       <w:pPr>
         <w:spacing w:after="0"/>
         <w:ind w:firstLine="90"/>
+        <w:jc w:val="center"/>
         <w:rPr>
           <w:lang w:eastAsia="ja-JP"/>
         </w:rPr>
       </w:pPr>
-    </w:p>
-    <w:p>
-      <w:pPr>
-        <w:spacing w:after="0"/>
-        <w:ind w:firstLine="90"/>
-        <w:jc w:val="center"/>
+      <w:r>
         <w:rPr>
           <w:lang w:eastAsia="ja-JP"/>
         </w:rPr>
-      </w:pPr>
-      <w:r>
-        <w:rPr>
-          <w:lang w:eastAsia="ja-JP"/>
-        </w:rPr>
         <w:drawing>
-          <wp:inline distT="0" distB="0" distL="0" distR="0" wp14:anchorId="277BB7FA" wp14:editId="2FA646FF">
-            <wp:extent cx="4415062" cy="4640414"/>
-            <wp:effectExtent l="19050" t="19050" r="24130" b="27305"/>
-            <wp:docPr id="81675923" name="Picture 1"/>
+          <wp:inline distT="0" distB="0" distL="0" distR="0" wp14:anchorId="009ACD4B" wp14:editId="4F2FF57C">
+            <wp:extent cx="3768918" cy="5111872"/>
+            <wp:effectExtent l="0" t="0" r="3175" b="0"/>
+            <wp:docPr id="1026175668" name="Picture 1" descr="A screenshot of a computer&#10;&#10;AI-generated content may be incorrect."/>
             <wp:cNvGraphicFramePr>
               <a:graphicFrameLocks xmlns:a="http://schemas.openxmlformats.org/drawingml/2006/main" noChangeAspect="1"/>
             </wp:cNvGraphicFramePr>
@@ -12026,7 +12023,7 @@
               <a:graphicData uri="http://schemas.openxmlformats.org/drawingml/2006/picture">
                 <pic:pic xmlns:pic="http://schemas.openxmlformats.org/drawingml/2006/picture">
                   <pic:nvPicPr>
-                    <pic:cNvPr id="81675923" name=""/>
+                    <pic:cNvPr id="1026175668" name="Picture 1" descr="A screenshot of a computer&#10;&#10;AI-generated content may be incorrect."/>
                     <pic:cNvPicPr/>
                   </pic:nvPicPr>
                   <pic:blipFill>
@@ -12038,16 +12035,11 @@
                   <pic:spPr>
                     <a:xfrm>
                       <a:off x="0" y="0"/>
-                      <a:ext cx="4437144" cy="4663623"/>
+                      <a:ext cx="3770529" cy="5114057"/>
                     </a:xfrm>
                     <a:prstGeom prst="rect">
                       <a:avLst/>
                     </a:prstGeom>
-                    <a:ln>
-                      <a:solidFill>
-                        <a:schemeClr val="accent1"/>
-                      </a:solidFill>
-                    </a:ln>
                   </pic:spPr>
                 </pic:pic>
               </a:graphicData>
@@ -12055,6 +12047,15 @@
           </wp:inline>
         </w:drawing>
       </w:r>
+    </w:p>
+    <w:p>
+      <w:pPr>
+        <w:spacing w:after="0"/>
+        <w:ind w:firstLine="90"/>
+        <w:rPr>
+          <w:lang w:eastAsia="ja-JP"/>
+        </w:rPr>
+      </w:pPr>
     </w:p>
     <w:sectPr>
       <w:pgSz w:w="12240" w:h="15840"/>

</xml_diff>

<commit_message>
move forms to pages folder in client
</commit_message>
<xml_diff>
--- a/Documentations/A2C_SDD.docx
+++ b/Documentations/A2C_SDD.docx
@@ -13878,7 +13878,17 @@
       </w:r>
       <w:proofErr w:type="spellStart"/>
       <w:r>
-        <w:t>Login.tsx</w:t>
+        <w:t>Login</w:t>
+      </w:r>
+      <w:r>
+        <w:rPr>
+          <w:rFonts w:hint="eastAsia"/>
+          <w:lang w:eastAsia="ja-JP"/>
+        </w:rPr>
+        <w:t>Page</w:t>
+      </w:r>
+      <w:r>
+        <w:t>.tsx</w:t>
       </w:r>
       <w:proofErr w:type="spellEnd"/>
       <w:r>
@@ -13896,6 +13906,7 @@
       </w:pPr>
       <w:r>
         <w:rPr>
+          <w:noProof/>
           <w:lang w:eastAsia="ja-JP" w:bidi="he-IL"/>
         </w:rPr>
         <w:drawing>
@@ -14005,10 +14016,16 @@
           <w:lang w:eastAsia="ja-JP" w:bidi="he-IL"/>
         </w:rPr>
         <w:drawing>
-          <wp:inline distT="0" distB="0" distL="0" distR="0" wp14:anchorId="70442668" wp14:editId="0CAC999C">
-            <wp:extent cx="5486400" cy="3095625"/>
-            <wp:effectExtent l="19050" t="19050" r="19050" b="28575"/>
-            <wp:docPr id="1408947240" name="Picture 1" descr="A screenshot of a computer&#10;&#10;AI-generated content may be incorrect."/>
+          <wp:inline distT="0" distB="0" distL="0" distR="0" wp14:anchorId="06BC2524" wp14:editId="4CDC26C2">
+            <wp:extent cx="5486400" cy="3297555"/>
+            <wp:effectExtent l="19050" t="19050" r="19050" b="17145"/>
+            <wp:docPr id="3" name="Picture 2">
+              <a:extLst xmlns:a="http://schemas.openxmlformats.org/drawingml/2006/main">
+                <a:ext uri="{FF2B5EF4-FFF2-40B4-BE49-F238E27FC236}">
+                  <a16:creationId xmlns:a16="http://schemas.microsoft.com/office/drawing/2014/main" id="{F89B5F49-256A-91EB-7D48-6A8A5D0F64CC}"/>
+                </a:ext>
+              </a:extLst>
+            </wp:docPr>
             <wp:cNvGraphicFramePr>
               <a:graphicFrameLocks xmlns:a="http://schemas.openxmlformats.org/drawingml/2006/main" noChangeAspect="1"/>
             </wp:cNvGraphicFramePr>
@@ -14016,8 +14033,16 @@
               <a:graphicData uri="http://schemas.openxmlformats.org/drawingml/2006/picture">
                 <pic:pic xmlns:pic="http://schemas.openxmlformats.org/drawingml/2006/picture">
                   <pic:nvPicPr>
-                    <pic:cNvPr id="1408947240" name="Picture 1" descr="A screenshot of a computer&#10;&#10;AI-generated content may be incorrect."/>
-                    <pic:cNvPicPr/>
+                    <pic:cNvPr id="3" name="Picture 2">
+                      <a:extLst>
+                        <a:ext uri="{FF2B5EF4-FFF2-40B4-BE49-F238E27FC236}">
+                          <a16:creationId xmlns:a16="http://schemas.microsoft.com/office/drawing/2014/main" id="{F89B5F49-256A-91EB-7D48-6A8A5D0F64CC}"/>
+                        </a:ext>
+                      </a:extLst>
+                    </pic:cNvPr>
+                    <pic:cNvPicPr>
+                      <a:picLocks noChangeAspect="1"/>
+                    </pic:cNvPicPr>
                   </pic:nvPicPr>
                   <pic:blipFill>
                     <a:blip r:embed="rId13"/>
@@ -14028,7 +14053,131 @@
                   <pic:spPr>
                     <a:xfrm>
                       <a:off x="0" y="0"/>
-                      <a:ext cx="5486400" cy="3095625"/>
+                      <a:ext cx="5486400" cy="3297555"/>
+                    </a:xfrm>
+                    <a:prstGeom prst="rect">
+                      <a:avLst/>
+                    </a:prstGeom>
+                    <a:noFill/>
+                    <a:ln>
+                      <a:solidFill>
+                        <a:schemeClr val="accent1"/>
+                      </a:solidFill>
+                    </a:ln>
+                  </pic:spPr>
+                </pic:pic>
+              </a:graphicData>
+            </a:graphic>
+          </wp:inline>
+        </w:drawing>
+      </w:r>
+    </w:p>
+    <w:p>
+      <w:pPr>
+        <w:rPr>
+          <w:rtl/>
+          <w:lang w:eastAsia="ja-JP" w:bidi="he-IL"/>
+        </w:rPr>
+      </w:pPr>
+    </w:p>
+    <w:p>
+      <w:pPr>
+        <w:rPr>
+          <w:rtl/>
+          <w:lang w:eastAsia="ja-JP" w:bidi="he-IL"/>
+        </w:rPr>
+      </w:pPr>
+    </w:p>
+    <w:p>
+      <w:pPr>
+        <w:pStyle w:val="Heading2"/>
+      </w:pPr>
+      <w:r>
+        <w:rPr>
+          <w:rFonts w:hint="eastAsia"/>
+          <w:lang w:eastAsia="ja-JP" w:bidi="he-IL"/>
+        </w:rPr>
+        <w:lastRenderedPageBreak/>
+        <w:t>Users</w:t>
+      </w:r>
+      <w:r>
+        <w:rPr>
+          <w:lang w:eastAsia="ja-JP" w:bidi="he-IL"/>
+        </w:rPr>
+        <w:t xml:space="preserve"> Page (</w:t>
+      </w:r>
+      <w:proofErr w:type="spellStart"/>
+      <w:r>
+        <w:rPr>
+          <w:rFonts w:hint="eastAsia"/>
+          <w:lang w:eastAsia="ja-JP" w:bidi="he-IL"/>
+        </w:rPr>
+        <w:t>Users</w:t>
+      </w:r>
+      <w:r>
+        <w:rPr>
+          <w:lang w:eastAsia="ja-JP" w:bidi="he-IL"/>
+        </w:rPr>
+        <w:t>Page.tsx</w:t>
+      </w:r>
+      <w:proofErr w:type="spellEnd"/>
+      <w:r>
+        <w:rPr>
+          <w:lang w:eastAsia="ja-JP" w:bidi="he-IL"/>
+        </w:rPr>
+        <w:t>)</w:t>
+      </w:r>
+    </w:p>
+    <w:p>
+      <w:pPr>
+        <w:rPr>
+          <w:rtl/>
+          <w:lang w:eastAsia="ja-JP" w:bidi="he-IL"/>
+        </w:rPr>
+      </w:pPr>
+      <w:r>
+        <w:rPr>
+          <w:lang w:eastAsia="ja-JP" w:bidi="he-IL"/>
+        </w:rPr>
+        <w:drawing>
+          <wp:inline distT="0" distB="0" distL="0" distR="0" wp14:anchorId="109AD682" wp14:editId="101C2FBB">
+            <wp:extent cx="5486400" cy="1217930"/>
+            <wp:effectExtent l="19050" t="19050" r="19050" b="20320"/>
+            <wp:docPr id="1250452960" name="Picture 2">
+              <a:extLst xmlns:a="http://schemas.openxmlformats.org/drawingml/2006/main">
+                <a:ext uri="{FF2B5EF4-FFF2-40B4-BE49-F238E27FC236}">
+                  <a16:creationId xmlns:a16="http://schemas.microsoft.com/office/drawing/2014/main" id="{62EF3622-3E09-1582-E7C7-C93D2F126BBE}"/>
+                </a:ext>
+              </a:extLst>
+            </wp:docPr>
+            <wp:cNvGraphicFramePr>
+              <a:graphicFrameLocks xmlns:a="http://schemas.openxmlformats.org/drawingml/2006/main" noChangeAspect="1"/>
+            </wp:cNvGraphicFramePr>
+            <a:graphic xmlns:a="http://schemas.openxmlformats.org/drawingml/2006/main">
+              <a:graphicData uri="http://schemas.openxmlformats.org/drawingml/2006/picture">
+                <pic:pic xmlns:pic="http://schemas.openxmlformats.org/drawingml/2006/picture">
+                  <pic:nvPicPr>
+                    <pic:cNvPr id="3" name="Picture 2">
+                      <a:extLst>
+                        <a:ext uri="{FF2B5EF4-FFF2-40B4-BE49-F238E27FC236}">
+                          <a16:creationId xmlns:a16="http://schemas.microsoft.com/office/drawing/2014/main" id="{62EF3622-3E09-1582-E7C7-C93D2F126BBE}"/>
+                        </a:ext>
+                      </a:extLst>
+                    </pic:cNvPr>
+                    <pic:cNvPicPr>
+                      <a:picLocks noChangeAspect="1"/>
+                    </pic:cNvPicPr>
+                  </pic:nvPicPr>
+                  <pic:blipFill>
+                    <a:blip r:embed="rId14"/>
+                    <a:stretch>
+                      <a:fillRect/>
+                    </a:stretch>
+                  </pic:blipFill>
+                  <pic:spPr>
+                    <a:xfrm>
+                      <a:off x="0" y="0"/>
+                      <a:ext cx="5486400" cy="1217930"/>
                     </a:xfrm>
                     <a:prstGeom prst="rect">
                       <a:avLst/>
@@ -14056,30 +14205,6 @@
     </w:p>
     <w:p>
       <w:pPr>
-        <w:rPr>
-          <w:rtl/>
-          <w:lang w:eastAsia="ja-JP" w:bidi="he-IL"/>
-        </w:rPr>
-      </w:pPr>
-    </w:p>
-    <w:p>
-      <w:pPr>
-        <w:rPr>
-          <w:rtl/>
-          <w:lang w:eastAsia="ja-JP" w:bidi="he-IL"/>
-        </w:rPr>
-      </w:pPr>
-    </w:p>
-    <w:p>
-      <w:pPr>
-        <w:rPr>
-          <w:rtl/>
-          <w:lang w:eastAsia="ja-JP" w:bidi="he-IL"/>
-        </w:rPr>
-      </w:pPr>
-    </w:p>
-    <w:p>
-      <w:pPr>
         <w:pStyle w:val="Heading2"/>
       </w:pPr>
       <w:bookmarkStart w:id="86" w:name="_Toc206421130"/>
@@ -14127,7 +14252,20 @@
         <w:rPr>
           <w:lang w:val="en-IL" w:eastAsia="ja-JP"/>
         </w:rPr>
-        <w:t>├── public/                  # Static files (index.html, favicon, etc.)</w:t>
+        <w:t xml:space="preserve">├── public/                  </w:t>
+      </w:r>
+      <w:r>
+        <w:rPr>
+          <w:rFonts w:hint="eastAsia"/>
+          <w:lang w:val="en-IL" w:eastAsia="ja-JP"/>
+        </w:rPr>
+        <w:t>&lt;-</w:t>
+      </w:r>
+      <w:r>
+        <w:rPr>
+          <w:lang w:val="en-IL" w:eastAsia="ja-JP"/>
+        </w:rPr>
+        <w:t xml:space="preserve"> Static files (index.html, favicon, etc.)</w:t>
       </w:r>
     </w:p>
     <w:p>
@@ -14171,7 +14309,20 @@
         <w:rPr>
           <w:lang w:val="en-IL" w:eastAsia="ja-JP"/>
         </w:rPr>
-        <w:t>│   ├── assets/              # Images, icons, global styles (CSS/SCSS)</w:t>
+        <w:t xml:space="preserve">│   ├── </w:t>
+      </w:r>
+      <w:r>
+        <w:rPr>
+          <w:rFonts w:hint="eastAsia"/>
+          <w:lang w:val="en-IL" w:eastAsia="ja-JP"/>
+        </w:rPr>
+        <w:t>pages</w:t>
+      </w:r>
+      <w:r>
+        <w:rPr>
+          <w:lang w:val="en-IL" w:eastAsia="ja-JP"/>
+        </w:rPr>
+        <w:t xml:space="preserve">/              </w:t>
       </w:r>
     </w:p>
     <w:p>
@@ -14186,8 +14337,17 @@
         <w:rPr>
           <w:lang w:val="en-IL" w:eastAsia="ja-JP"/>
         </w:rPr>
-        <w:t>│   ├── components/          # Reusable UI components (Button, Modal, Table)</w:t>
-      </w:r>
+        <w:t xml:space="preserve">│   │   ├── </w:t>
+      </w:r>
+      <w:proofErr w:type="spellStart"/>
+      <w:r>
+        <w:rPr>
+          <w:rFonts w:hint="eastAsia"/>
+          <w:lang w:val="en-IL" w:eastAsia="ja-JP"/>
+        </w:rPr>
+        <w:t>LoginPage.tsx</w:t>
+      </w:r>
+      <w:proofErr w:type="spellEnd"/>
     </w:p>
     <w:p>
       <w:pPr>
@@ -14201,8 +14361,24 @@
         <w:rPr>
           <w:lang w:val="en-IL" w:eastAsia="ja-JP"/>
         </w:rPr>
-        <w:t>│   ├── features/            # Domain-specific modules (Auth, Customers, Orders)</w:t>
-      </w:r>
+        <w:t xml:space="preserve">│   │   ├── </w:t>
+      </w:r>
+      <w:proofErr w:type="spellStart"/>
+      <w:r>
+        <w:rPr>
+          <w:rFonts w:hint="eastAsia"/>
+          <w:lang w:val="en-IL" w:eastAsia="ja-JP"/>
+        </w:rPr>
+        <w:t>Welcome</w:t>
+      </w:r>
+      <w:r>
+        <w:rPr>
+          <w:rFonts w:hint="eastAsia"/>
+          <w:lang w:val="en-IL" w:eastAsia="ja-JP"/>
+        </w:rPr>
+        <w:t>Page.tsx</w:t>
+      </w:r>
+      <w:proofErr w:type="spellEnd"/>
     </w:p>
     <w:p>
       <w:pPr>
@@ -14216,32 +14392,22 @@
         <w:rPr>
           <w:lang w:val="en-IL" w:eastAsia="ja-JP"/>
         </w:rPr>
-        <w:t xml:space="preserve">│   │   ├── auth/            </w:t>
-      </w:r>
-      <w:r>
-        <w:rPr>
+        <w:t xml:space="preserve">│   │   ├── </w:t>
+      </w:r>
+      <w:proofErr w:type="spellStart"/>
+      <w:r>
+        <w:rPr>
+          <w:rFonts w:hint="eastAsia"/>
           <w:lang w:val="en-IL" w:eastAsia="ja-JP"/>
         </w:rPr>
-        <w:tab/>
-      </w:r>
-      <w:r>
-        <w:rPr>
+        <w:t>Users</w:t>
+      </w:r>
+      <w:r>
+        <w:rPr>
+          <w:rFonts w:hint="eastAsia"/>
           <w:lang w:val="en-IL" w:eastAsia="ja-JP"/>
         </w:rPr>
-        <w:sym w:font="Wingdings" w:char="F0DF"/>
-      </w:r>
-      <w:proofErr w:type="spellStart"/>
-      <w:r>
-        <w:rPr>
-          <w:lang w:val="en-IL" w:eastAsia="ja-JP"/>
-        </w:rPr>
-        <w:t>Login</w:t>
-      </w:r>
-      <w:r>
-        <w:rPr>
-          <w:lang w:val="en-IL" w:eastAsia="ja-JP"/>
-        </w:rPr>
-        <w:t>.tsx</w:t>
+        <w:t>Page.tsx</w:t>
       </w:r>
       <w:proofErr w:type="spellEnd"/>
     </w:p>
@@ -14257,46 +14423,21 @@
         <w:rPr>
           <w:lang w:val="en-IL" w:eastAsia="ja-JP"/>
         </w:rPr>
-        <w:t xml:space="preserve">│   │   ├── </w:t>
-      </w:r>
-      <w:r>
-        <w:rPr>
+        <w:t xml:space="preserve">│   ├── </w:t>
+      </w:r>
+      <w:r>
+        <w:rPr>
+          <w:rFonts w:hint="eastAsia"/>
           <w:lang w:val="en-IL" w:eastAsia="ja-JP"/>
         </w:rPr>
-        <w:t>Welcome</w:t>
+        <w:t>store</w:t>
       </w:r>
       <w:r>
         <w:rPr>
           <w:lang w:val="en-IL" w:eastAsia="ja-JP"/>
         </w:rPr>
-        <w:t xml:space="preserve">/       </w:t>
-      </w:r>
-      <w:r>
-        <w:rPr>
-          <w:lang w:val="en-IL" w:eastAsia="ja-JP"/>
-        </w:rPr>
-        <w:tab/>
-      </w:r>
-      <w:r>
-        <w:rPr>
-          <w:lang w:val="en-IL" w:eastAsia="ja-JP"/>
-        </w:rPr>
-        <w:sym w:font="Wingdings" w:char="F0DF"/>
-      </w:r>
-      <w:r>
-        <w:rPr>
-          <w:lang w:val="en-IL" w:eastAsia="ja-JP"/>
-        </w:rPr>
-        <w:t xml:space="preserve"> </w:t>
-      </w:r>
-      <w:proofErr w:type="spellStart"/>
-      <w:r>
-        <w:rPr>
-          <w:lang w:val="en-IL" w:eastAsia="ja-JP"/>
-        </w:rPr>
-        <w:t>WelcomePage.tsx</w:t>
-      </w:r>
-      <w:proofErr w:type="spellEnd"/>
+        <w:t>/          # Reusable UI components (Button, Modal, Table)</w:t>
+      </w:r>
     </w:p>
     <w:p>
       <w:pPr>
@@ -14384,35 +14525,7 @@
         <w:rPr>
           <w:lang w:val="en-IL" w:eastAsia="ja-JP"/>
         </w:rPr>
-        <w:t>│   ├── hooks/               # Custom React hooks (</w:t>
-      </w:r>
-      <w:proofErr w:type="spellStart"/>
-      <w:r>
-        <w:rPr>
-          <w:lang w:val="en-IL" w:eastAsia="ja-JP"/>
-        </w:rPr>
-        <w:t>useAuth</w:t>
-      </w:r>
-      <w:proofErr w:type="spellEnd"/>
-      <w:r>
-        <w:rPr>
-          <w:lang w:val="en-IL" w:eastAsia="ja-JP"/>
-        </w:rPr>
-        <w:t xml:space="preserve">, </w:t>
-      </w:r>
-      <w:proofErr w:type="spellStart"/>
-      <w:r>
-        <w:rPr>
-          <w:lang w:val="en-IL" w:eastAsia="ja-JP"/>
-        </w:rPr>
-        <w:t>useFetch</w:t>
-      </w:r>
-      <w:proofErr w:type="spellEnd"/>
-      <w:r>
-        <w:rPr>
-          <w:lang w:val="en-IL" w:eastAsia="ja-JP"/>
-        </w:rPr>
-        <w:t>, etc.)</w:t>
+        <w:t>│   ├── routes/              # Route definitions using React Router</w:t>
       </w:r>
     </w:p>
     <w:p>
@@ -14427,7 +14540,21 @@
         <w:rPr>
           <w:lang w:val="en-IL" w:eastAsia="ja-JP"/>
         </w:rPr>
-        <w:t>│   ├── layouts/             # Application layouts (Sidebar, Header, Footer)</w:t>
+        <w:t>│   ├── services/            # API calls and service logic (</w:t>
+      </w:r>
+      <w:proofErr w:type="spellStart"/>
+      <w:r>
+        <w:rPr>
+          <w:lang w:val="en-IL" w:eastAsia="ja-JP"/>
+        </w:rPr>
+        <w:t>axios</w:t>
+      </w:r>
+      <w:proofErr w:type="spellEnd"/>
+      <w:r>
+        <w:rPr>
+          <w:lang w:val="en-IL" w:eastAsia="ja-JP"/>
+        </w:rPr>
+        <w:t xml:space="preserve"> instances)</w:t>
       </w:r>
     </w:p>
     <w:p>
@@ -14442,21 +14569,21 @@
         <w:rPr>
           <w:lang w:val="en-IL" w:eastAsia="ja-JP"/>
         </w:rPr>
-        <w:t xml:space="preserve">│   ├── pages/               # Top-level pages (Dashboard, </w:t>
+        <w:t>│   ├── utils/               # Utility functions (</w:t>
       </w:r>
       <w:proofErr w:type="spellStart"/>
       <w:r>
         <w:rPr>
           <w:lang w:val="en-IL" w:eastAsia="ja-JP"/>
         </w:rPr>
-        <w:t>NotFound</w:t>
+        <w:t>formatDate</w:t>
       </w:r>
       <w:proofErr w:type="spellEnd"/>
       <w:r>
         <w:rPr>
           <w:lang w:val="en-IL" w:eastAsia="ja-JP"/>
         </w:rPr>
-        <w:t>, etc.)</w:t>
+        <w:t>, validators, etc.)</w:t>
       </w:r>
     </w:p>
     <w:p>
@@ -14471,7 +14598,7 @@
         <w:rPr>
           <w:lang w:val="en-IL" w:eastAsia="ja-JP"/>
         </w:rPr>
-        <w:t>│   ├── routes/              # Route definitions using React Router</w:t>
+        <w:t>│   ├── i18n/                # Internationalization (translations)</w:t>
       </w:r>
     </w:p>
     <w:p>
@@ -14486,21 +14613,20 @@
         <w:rPr>
           <w:lang w:val="en-IL" w:eastAsia="ja-JP"/>
         </w:rPr>
-        <w:t>│   ├── services/            # API calls and service logic (</w:t>
-      </w:r>
-      <w:proofErr w:type="spellStart"/>
-      <w:r>
-        <w:rPr>
+        <w:t>│   ├── App.</w:t>
+      </w:r>
+      <w:r>
+        <w:rPr>
+          <w:rFonts w:hint="eastAsia"/>
           <w:lang w:val="en-IL" w:eastAsia="ja-JP"/>
         </w:rPr>
-        <w:t>axios</w:t>
-      </w:r>
-      <w:proofErr w:type="spellEnd"/>
+        <w:t>css</w:t>
+      </w:r>
       <w:r>
         <w:rPr>
           <w:lang w:val="en-IL" w:eastAsia="ja-JP"/>
         </w:rPr>
-        <w:t xml:space="preserve"> instances)</w:t>
+        <w:t xml:space="preserve">              </w:t>
       </w:r>
     </w:p>
     <w:p>
@@ -14515,65 +14641,34 @@
         <w:rPr>
           <w:lang w:val="en-IL" w:eastAsia="ja-JP"/>
         </w:rPr>
-        <w:t>│   ├── store/               # Global state management (</w:t>
+        <w:t xml:space="preserve">│   ├── </w:t>
       </w:r>
       <w:proofErr w:type="spellStart"/>
       <w:r>
         <w:rPr>
           <w:lang w:val="en-IL" w:eastAsia="ja-JP"/>
         </w:rPr>
-        <w:t>Zustand</w:t>
+        <w:t>App.</w:t>
+      </w:r>
+      <w:r>
+        <w:rPr>
+          <w:rFonts w:hint="eastAsia"/>
+          <w:lang w:val="en-IL" w:eastAsia="ja-JP"/>
+        </w:rPr>
+        <w:t>test.</w:t>
+      </w:r>
+      <w:r>
+        <w:rPr>
+          <w:lang w:val="en-IL" w:eastAsia="ja-JP"/>
+        </w:rPr>
+        <w:t>tsx</w:t>
       </w:r>
       <w:proofErr w:type="spellEnd"/>
       <w:r>
         <w:rPr>
           <w:lang w:val="en-IL" w:eastAsia="ja-JP"/>
         </w:rPr>
-        <w:t xml:space="preserve"> or Redux slices)</w:t>
-      </w:r>
-    </w:p>
-    <w:p>
-      <w:pPr>
-        <w:spacing w:after="0"/>
-        <w:ind w:firstLine="90"/>
-        <w:rPr>
-          <w:lang w:val="en-IL" w:eastAsia="ja-JP"/>
-        </w:rPr>
-      </w:pPr>
-      <w:r>
-        <w:rPr>
-          <w:lang w:val="en-IL" w:eastAsia="ja-JP"/>
-        </w:rPr>
-        <w:t>│   ├── utils/               # Utility functions (</w:t>
-      </w:r>
-      <w:proofErr w:type="spellStart"/>
-      <w:r>
-        <w:rPr>
-          <w:lang w:val="en-IL" w:eastAsia="ja-JP"/>
-        </w:rPr>
-        <w:t>formatDate</w:t>
-      </w:r>
-      <w:proofErr w:type="spellEnd"/>
-      <w:r>
-        <w:rPr>
-          <w:lang w:val="en-IL" w:eastAsia="ja-JP"/>
-        </w:rPr>
-        <w:t>, validators, etc.)</w:t>
-      </w:r>
-    </w:p>
-    <w:p>
-      <w:pPr>
-        <w:spacing w:after="0"/>
-        <w:ind w:firstLine="90"/>
-        <w:rPr>
-          <w:lang w:val="en-IL" w:eastAsia="ja-JP"/>
-        </w:rPr>
-      </w:pPr>
-      <w:r>
-        <w:rPr>
-          <w:lang w:val="en-IL" w:eastAsia="ja-JP"/>
-        </w:rPr>
-        <w:t>│   ├── i18n/                # Internationalization (translations)</w:t>
+        <w:t xml:space="preserve">              </w:t>
       </w:r>
     </w:p>
     <w:p>
@@ -16393,7 +16488,7 @@
   <w:style w:type="paragraph" w:default="1" w:styleId="Normal">
     <w:name w:val="Normal"/>
     <w:qFormat/>
-    <w:rsid w:val="00FC693F"/>
+    <w:rsid w:val="00F9594E"/>
   </w:style>
   <w:style w:type="paragraph" w:styleId="Heading1">
     <w:name w:val="heading 1"/>

</xml_diff>